<commit_message>
Auto commit: 2026-06-21 17:17:01
</commit_message>
<xml_diff>
--- a/OraBooks Lean MVP/docs/rbac work report(morshed).docx
+++ b/OraBooks Lean MVP/docs/rbac work report(morshed).docx
@@ -1199,36 +1199,8 @@
           <w:rFonts w:cs="Calibri"/>
           <w:color w:val="1F2937"/>
         </w:rPr>
-        <w:t>includes/class-</w:t>
-      </w:r>
-      <w:proofErr w:type="spellStart"/>
-      <w:r>
-        <w:rPr>
-          <w:rStyle w:val="code1"/>
-          <w:rFonts w:cs="Calibri"/>
-          <w:color w:val="1F2937"/>
-        </w:rPr>
-        <w:t>obn</w:t>
-      </w:r>
-      <w:proofErr w:type="spellEnd"/>
-      <w:r>
-        <w:rPr>
-          <w:rStyle w:val="code1"/>
-          <w:rFonts w:cs="Calibri"/>
-          <w:color w:val="1F2937"/>
-        </w:rPr>
-        <w:t>-access-</w:t>
-      </w:r>
-      <w:proofErr w:type="spellStart"/>
-      <w:r>
-        <w:rPr>
-          <w:rStyle w:val="code1"/>
-          <w:rFonts w:cs="Calibri"/>
-          <w:color w:val="1F2937"/>
-        </w:rPr>
-        <w:t>control.php</w:t>
-      </w:r>
-      <w:proofErr w:type="spellEnd"/>
+        <w:t>includes/class-obn-access-control.php</w:t>
+      </w:r>
     </w:p>
     <w:p>
       <w:pPr>
@@ -1805,7 +1777,6 @@
         </w:rPr>
         <w:t xml:space="preserve">Key permissions: </w:t>
       </w:r>
-      <w:proofErr w:type="spellStart"/>
       <w:r>
         <w:rPr>
           <w:rStyle w:val="code1"/>
@@ -1814,7 +1785,6 @@
         </w:rPr>
         <w:t>view_reports</w:t>
       </w:r>
-      <w:proofErr w:type="spellEnd"/>
       <w:r>
         <w:rPr>
           <w:rFonts w:ascii="Calibri" w:hAnsi="Calibri" w:cs="Calibri"/>
@@ -1824,7 +1794,6 @@
         </w:rPr>
         <w:t xml:space="preserve">, </w:t>
       </w:r>
-      <w:proofErr w:type="spellStart"/>
       <w:r>
         <w:rPr>
           <w:rStyle w:val="code1"/>
@@ -1833,7 +1802,6 @@
         </w:rPr>
         <w:t>submit_transaction</w:t>
       </w:r>
-      <w:proofErr w:type="spellEnd"/>
       <w:r>
         <w:rPr>
           <w:rFonts w:ascii="Calibri" w:hAnsi="Calibri" w:cs="Calibri"/>
@@ -1843,7 +1811,6 @@
         </w:rPr>
         <w:t xml:space="preserve">, </w:t>
       </w:r>
-      <w:proofErr w:type="spellStart"/>
       <w:r>
         <w:rPr>
           <w:rStyle w:val="code1"/>
@@ -1852,7 +1819,6 @@
         </w:rPr>
         <w:t>approve_journal</w:t>
       </w:r>
-      <w:proofErr w:type="spellEnd"/>
       <w:r>
         <w:rPr>
           <w:rFonts w:ascii="Calibri" w:hAnsi="Calibri" w:cs="Calibri"/>
@@ -1862,7 +1828,6 @@
         </w:rPr>
         <w:t xml:space="preserve">, </w:t>
       </w:r>
-      <w:proofErr w:type="spellStart"/>
       <w:r>
         <w:rPr>
           <w:rStyle w:val="code1"/>
@@ -1871,7 +1836,6 @@
         </w:rPr>
         <w:t>manage_employees</w:t>
       </w:r>
-      <w:proofErr w:type="spellEnd"/>
       <w:r>
         <w:rPr>
           <w:rFonts w:ascii="Calibri" w:hAnsi="Calibri" w:cs="Calibri"/>
@@ -1881,7 +1845,6 @@
         </w:rPr>
         <w:t xml:space="preserve">, </w:t>
       </w:r>
-      <w:proofErr w:type="spellStart"/>
       <w:r>
         <w:rPr>
           <w:rStyle w:val="code1"/>
@@ -1890,7 +1853,6 @@
         </w:rPr>
         <w:t>manage_settings</w:t>
       </w:r>
-      <w:proofErr w:type="spellEnd"/>
       <w:r>
         <w:rPr>
           <w:rFonts w:ascii="Calibri" w:hAnsi="Calibri" w:cs="Calibri"/>
@@ -1900,7 +1862,6 @@
         </w:rPr>
         <w:t xml:space="preserve">, </w:t>
       </w:r>
-      <w:proofErr w:type="spellStart"/>
       <w:r>
         <w:rPr>
           <w:rStyle w:val="code1"/>
@@ -1909,7 +1870,6 @@
         </w:rPr>
         <w:t>export_reports</w:t>
       </w:r>
-      <w:proofErr w:type="spellEnd"/>
       <w:r>
         <w:rPr>
           <w:rFonts w:ascii="Calibri" w:hAnsi="Calibri" w:cs="Calibri"/>
@@ -1919,7 +1879,6 @@
         </w:rPr>
         <w:t xml:space="preserve">, </w:t>
       </w:r>
-      <w:proofErr w:type="spellStart"/>
       <w:r>
         <w:rPr>
           <w:rStyle w:val="code1"/>
@@ -1928,7 +1887,6 @@
         </w:rPr>
         <w:t>manage_roles</w:t>
       </w:r>
-      <w:proofErr w:type="spellEnd"/>
       <w:r>
         <w:rPr>
           <w:rFonts w:ascii="Calibri" w:hAnsi="Calibri" w:cs="Calibri"/>
@@ -1938,7 +1896,6 @@
         </w:rPr>
         <w:t xml:space="preserve">, </w:t>
       </w:r>
-      <w:proofErr w:type="spellStart"/>
       <w:r>
         <w:rPr>
           <w:rStyle w:val="code1"/>
@@ -1947,7 +1904,6 @@
         </w:rPr>
         <w:t>view_audit_logs</w:t>
       </w:r>
-      <w:proofErr w:type="spellEnd"/>
       <w:r>
         <w:rPr>
           <w:rFonts w:ascii="Calibri" w:hAnsi="Calibri" w:cs="Calibri"/>
@@ -2123,7 +2079,6 @@
         </w:rPr>
         <w:t xml:space="preserve">Table: </w:t>
       </w:r>
-      <w:proofErr w:type="spellStart"/>
       <w:r>
         <w:rPr>
           <w:rStyle w:val="code1"/>
@@ -2132,7 +2087,6 @@
         </w:rPr>
         <w:t>wp_orabooks_permission_audit_log</w:t>
       </w:r>
-      <w:proofErr w:type="spellEnd"/>
       <w:r>
         <w:rPr>
           <w:rFonts w:ascii="Calibri" w:hAnsi="Calibri" w:cs="Calibri"/>
@@ -2177,27 +2131,7 @@
           <w:sz w:val="22"/>
           <w:szCs w:val="22"/>
         </w:rPr>
-        <w:t xml:space="preserve">Current blog/site ID = organization. </w:t>
-      </w:r>
-      <w:proofErr w:type="spellStart"/>
-      <w:r>
-        <w:rPr>
-          <w:rFonts w:ascii="Calibri" w:hAnsi="Calibri" w:cs="Calibri"/>
-          <w:color w:val="1F2937"/>
-          <w:sz w:val="22"/>
-          <w:szCs w:val="22"/>
-        </w:rPr>
-        <w:t>Superadmin</w:t>
-      </w:r>
-      <w:proofErr w:type="spellEnd"/>
-      <w:r>
-        <w:rPr>
-          <w:rFonts w:ascii="Calibri" w:hAnsi="Calibri" w:cs="Calibri"/>
-          <w:color w:val="1F2937"/>
-          <w:sz w:val="22"/>
-          <w:szCs w:val="22"/>
-        </w:rPr>
-        <w:t xml:space="preserve"> does not auto-bypass accounting permissions — must be explicitly assigned as Owner.</w:t>
+        <w:t>Current blog/site ID = organization. Superadmin does not auto-bypass accounting permissions — must be explicitly assigned as Owner.</w:t>
       </w:r>
     </w:p>
     <w:p>
@@ -2276,40 +2210,29 @@
         <w:spacing w:before="100" w:beforeAutospacing="1" w:after="60"/>
         <w:ind w:left="1020"/>
         <w:rPr>
+          <w:rStyle w:val="status-complete1"/>
+          <w:rFonts w:ascii="Calibri" w:hAnsi="Calibri" w:cs="Calibri"/>
+          <w:sz w:val="22"/>
+          <w:szCs w:val="22"/>
+        </w:rPr>
+      </w:pPr>
+      <w:r>
+        <w:rPr>
           <w:rFonts w:ascii="Calibri" w:eastAsia="Times New Roman" w:hAnsi="Calibri" w:cs="Calibri"/>
           <w:color w:val="1F2937"/>
           <w:sz w:val="22"/>
           <w:szCs w:val="22"/>
         </w:rPr>
-      </w:pPr>
-      <w:r>
-        <w:rPr>
-          <w:rFonts w:ascii="Calibri" w:eastAsia="Times New Roman" w:hAnsi="Calibri" w:cs="Calibri"/>
-          <w:color w:val="1F2937"/>
-          <w:sz w:val="22"/>
-          <w:szCs w:val="22"/>
-        </w:rPr>
         <w:t>Role management (</w:t>
       </w:r>
-      <w:proofErr w:type="spellStart"/>
       <w:r>
         <w:rPr>
           <w:rStyle w:val="code1"/>
           <w:rFonts w:eastAsia="Times New Roman" w:cs="Calibri"/>
           <w:color w:val="1F2937"/>
         </w:rPr>
-        <w:t>manage_</w:t>
-      </w:r>
-      <w:proofErr w:type="gramStart"/>
-      <w:r>
-        <w:rPr>
-          <w:rStyle w:val="code1"/>
-          <w:rFonts w:eastAsia="Times New Roman" w:cs="Calibri"/>
-          <w:color w:val="1F2937"/>
-        </w:rPr>
-        <w:t>roles</w:t>
-      </w:r>
-      <w:proofErr w:type="spellEnd"/>
+        <w:t>manage_roles</w:t>
+      </w:r>
       <w:r>
         <w:rPr>
           <w:rFonts w:ascii="Calibri" w:eastAsia="Times New Roman" w:hAnsi="Calibri" w:cs="Calibri"/>
@@ -2326,17 +2249,7 @@
           <w:sz w:val="22"/>
           <w:szCs w:val="22"/>
         </w:rPr>
-        <w:t xml:space="preserve">   </w:t>
-      </w:r>
-      <w:proofErr w:type="gramEnd"/>
-      <w:r>
-        <w:rPr>
-          <w:rFonts w:ascii="Calibri" w:eastAsia="Times New Roman" w:hAnsi="Calibri" w:cs="Calibri"/>
-          <w:color w:val="1F2937"/>
-          <w:sz w:val="22"/>
-          <w:szCs w:val="22"/>
-        </w:rPr>
-        <w:t xml:space="preserve">                                     </w:t>
+        <w:t xml:space="preserve">                                        </w:t>
       </w:r>
       <w:r>
         <w:rPr>
@@ -2366,6 +2279,480 @@
         </w:rPr>
         <w:t>Complete (MVP)</w:t>
       </w:r>
+    </w:p>
+    <w:p>
+      <w:pPr>
+        <w:spacing w:after="160" w:line="278" w:lineRule="auto"/>
+        <w:rPr>
+          <w:rStyle w:val="status-complete1"/>
+          <w:rFonts w:ascii="Calibri" w:hAnsi="Calibri" w:cs="Calibri"/>
+          <w:sz w:val="22"/>
+          <w:szCs w:val="22"/>
+        </w:rPr>
+      </w:pPr>
+      <w:r>
+        <w:rPr>
+          <w:rStyle w:val="status-complete1"/>
+          <w:rFonts w:ascii="Calibri" w:hAnsi="Calibri" w:cs="Calibri"/>
+          <w:sz w:val="22"/>
+          <w:szCs w:val="22"/>
+        </w:rPr>
+        <w:br w:type="page"/>
+      </w:r>
+    </w:p>
+    <w:p>
+      <w:pPr>
+        <w:pStyle w:val="Heading1"/>
+        <w:rPr>
+          <w:rFonts w:eastAsia="Times New Roman"/>
+        </w:rPr>
+      </w:pPr>
+      <w:r>
+        <w:rPr>
+          <w:rFonts w:eastAsia="Times New Roman"/>
+        </w:rPr>
+        <w:t>SL-003 RBAC - Invite-First Onboarding (Option A)</w:t>
+      </w:r>
+    </w:p>
+    <w:p>
+      <w:pPr>
+        <w:rPr>
+          <w:rFonts w:eastAsia="Times New Roman"/>
+        </w:rPr>
+      </w:pPr>
+      <w:r>
+        <w:rPr>
+          <w:rFonts w:eastAsia="Times New Roman"/>
+        </w:rPr>
+        <w:t>Date: 2026-06-21 | Spec: SL-003 RBAC/ABAC + SL-014 Team Invites | Approach: Option A (Invite-first, no personal org for invited staff)</w:t>
+      </w:r>
+    </w:p>
+    <w:p>
+      <w:pPr>
+        <w:pStyle w:val="Heading2"/>
+        <w:rPr>
+          <w:rFonts w:eastAsia="Times New Roman"/>
+        </w:rPr>
+      </w:pPr>
+      <w:r>
+        <w:rPr>
+          <w:rFonts w:eastAsia="Times New Roman"/>
+        </w:rPr>
+        <w:t>1. Problem Statement</w:t>
+      </w:r>
+    </w:p>
+    <w:p>
+      <w:pPr>
+        <w:rPr>
+          <w:rFonts w:eastAsia="Times New Roman"/>
+        </w:rPr>
+      </w:pPr>
+      <w:r>
+        <w:rPr>
+          <w:rFonts w:eastAsia="Times New Roman"/>
+        </w:rPr>
+        <w:t>When an owner invited a user as staff, the invited person registered as a customer and was sent through tier selection. That created a new customer organization and assigned owner role in their personal org. After accepting the invite, the sidebar badge and JWT context could show Owner instead of Staff.</w:t>
+      </w:r>
+    </w:p>
+    <w:p>
+      <w:pPr>
+        <w:rPr>
+          <w:rFonts w:eastAsia="Times New Roman"/>
+        </w:rPr>
+      </w:pPr>
+      <w:r>
+        <w:rPr>
+          <w:rFonts w:eastAsia="Times New Roman"/>
+        </w:rPr>
+        <w:t>This violated the SL-003 user journey: User invited with role X, Accept invite, Active with role X.</w:t>
+      </w:r>
+    </w:p>
+    <w:p>
+      <w:pPr>
+        <w:rPr>
+          <w:rFonts w:eastAsia="Times New Roman"/>
+        </w:rPr>
+      </w:pPr>
+      <w:r>
+        <w:rPr>
+          <w:rFonts w:eastAsia="Times New Roman"/>
+        </w:rPr>
+        <w:t>Important: Customer (org type) is NOT the same as Viewer (RBAC role).</w:t>
+      </w:r>
+    </w:p>
+    <w:p>
+      <w:pPr>
+        <w:pStyle w:val="Heading2"/>
+        <w:rPr>
+          <w:rFonts w:eastAsia="Times New Roman"/>
+        </w:rPr>
+      </w:pPr>
+      <w:r>
+        <w:rPr>
+          <w:rFonts w:eastAsia="Times New Roman"/>
+        </w:rPr>
+        <w:t>2. Solution - Option A (Invite-First)</w:t>
+      </w:r>
+    </w:p>
+    <w:p>
+      <w:pPr>
+        <w:rPr>
+          <w:rFonts w:eastAsia="Times New Roman"/>
+        </w:rPr>
+      </w:pPr>
+      <w:r>
+        <w:rPr>
+          <w:rFonts w:eastAsia="Times New Roman"/>
+        </w:rPr>
+        <w:t>Rules implemented:</w:t>
+      </w:r>
+    </w:p>
+    <w:p>
+      <w:pPr>
+        <w:rPr>
+          <w:rFonts w:eastAsia="Times New Roman"/>
+        </w:rPr>
+      </w:pPr>
+      <w:r>
+        <w:rPr>
+          <w:rFonts w:eastAsia="Times New Roman"/>
+        </w:rPr>
+        <w:t>1. Pending team invite: tier selection skipped.</w:t>
+      </w:r>
+    </w:p>
+    <w:p>
+      <w:pPr>
+        <w:rPr>
+          <w:rFonts w:eastAsia="Times New Roman"/>
+        </w:rPr>
+      </w:pPr>
+      <w:r>
+        <w:rPr>
+          <w:rFonts w:eastAsia="Times New Roman"/>
+        </w:rPr>
+        <w:t>2. Login / 2FA / OIDC auto-accepts pending invite.</w:t>
+      </w:r>
+    </w:p>
+    <w:p>
+      <w:pPr>
+        <w:rPr>
+          <w:rFonts w:eastAsia="Times New Roman"/>
+        </w:rPr>
+      </w:pPr>
+      <w:r>
+        <w:rPr>
+          <w:rFonts w:eastAsia="Times New Roman"/>
+        </w:rPr>
+        <w:t>3. user_org row created with invited role (e.g. staff).</w:t>
+      </w:r>
+    </w:p>
+    <w:p>
+      <w:pPr>
+        <w:rPr>
+          <w:rFonts w:eastAsia="Times New Roman"/>
+        </w:rPr>
+      </w:pPr>
+      <w:r>
+        <w:rPr>
+          <w:rFonts w:eastAsia="Times New Roman"/>
+        </w:rPr>
+        <w:t>4. users.org_id set to employer org.</w:t>
+      </w:r>
+    </w:p>
+    <w:p>
+      <w:pPr>
+        <w:rPr>
+          <w:rFonts w:eastAsia="Times New Roman"/>
+        </w:rPr>
+      </w:pPr>
+      <w:r>
+        <w:rPr>
+          <w:rFonts w:eastAsia="Times New Roman"/>
+        </w:rPr>
+        <w:t>5. JWT issued with employer org_id + role.</w:t>
+      </w:r>
+    </w:p>
+    <w:p>
+      <w:pPr>
+        <w:rPr>
+          <w:rFonts w:eastAsia="Times New Roman"/>
+        </w:rPr>
+      </w:pPr>
+      <w:r>
+        <w:rPr>
+          <w:rFonts w:eastAsia="Times New Roman"/>
+        </w:rPr>
+        <w:t>6. Redirect to employer subdomain /team/.</w:t>
+      </w:r>
+    </w:p>
+    <w:p>
+      <w:pPr>
+        <w:rPr>
+          <w:rFonts w:eastAsia="Times New Roman"/>
+        </w:rPr>
+      </w:pPr>
+      <w:r>
+        <w:rPr>
+          <w:rFonts w:eastAsia="Times New Roman"/>
+        </w:rPr>
+        <w:t>7. Tier selection API blocked (403) while invite pending.</w:t>
+      </w:r>
+    </w:p>
+    <w:p>
+      <w:pPr>
+        <w:rPr>
+          <w:rFonts w:eastAsia="Times New Roman"/>
+        </w:rPr>
+      </w:pPr>
+      <w:r>
+        <w:rPr>
+          <w:rFonts w:eastAsia="Times New Roman"/>
+        </w:rPr>
+        <w:t>SL-003 alignment: Role from user_org in JWT (Done); deny-by-default matrix (Unchanged); role badge sync (Fixed); refresh token revoke on role change (Unchanged); partner accounting block SL-013 (Unchanged); invite journey role X to accept to role X (Done).</w:t>
+      </w:r>
+    </w:p>
+    <w:p>
+      <w:pPr>
+        <w:pStyle w:val="Heading2"/>
+        <w:rPr>
+          <w:rFonts w:eastAsia="Times New Roman"/>
+        </w:rPr>
+      </w:pPr>
+      <w:r>
+        <w:rPr>
+          <w:rFonts w:eastAsia="Times New Roman"/>
+        </w:rPr>
+        <w:t>3. Files Changed</w:t>
+      </w:r>
+    </w:p>
+    <w:p>
+      <w:pPr>
+        <w:rPr>
+          <w:rFonts w:eastAsia="Times New Roman"/>
+        </w:rPr>
+      </w:pPr>
+      <w:r>
+        <w:rPr>
+          <w:rFonts w:eastAsia="Times New Roman"/>
+        </w:rPr>
+        <w:t>Backend: helpers.php, class-orabooks-team.php, class-orabooks-auth.php, class-orabooks-two-factor.php</w:t>
+      </w:r>
+    </w:p>
+    <w:p>
+      <w:pPr>
+        <w:rPr>
+          <w:rFonts w:eastAsia="Times New Roman"/>
+        </w:rPr>
+      </w:pPr>
+      <w:r>
+        <w:rPr>
+          <w:rFonts w:eastAsia="Times New Roman"/>
+        </w:rPr>
+        <w:t>Frontend: auth-routing.ts, RegisterPage.tsx, TierSelectionPage.tsx, ClientShell.tsx</w:t>
+      </w:r>
+    </w:p>
+    <w:p>
+      <w:pPr>
+        <w:rPr>
+          <w:rFonts w:eastAsia="Times New Roman"/>
+        </w:rPr>
+      </w:pPr>
+      <w:r>
+        <w:rPr>
+          <w:rFonts w:eastAsia="Times New Roman"/>
+        </w:rPr>
+        <w:t>Tests: OraBooks_RBAC_Test.php - 9/9 pass</w:t>
+      </w:r>
+    </w:p>
+    <w:p>
+      <w:pPr>
+        <w:pStyle w:val="Heading2"/>
+        <w:rPr>
+          <w:rFonts w:eastAsia="Times New Roman"/>
+        </w:rPr>
+      </w:pPr>
+      <w:r>
+        <w:rPr>
+          <w:rFonts w:eastAsia="Times New Roman"/>
+        </w:rPr>
+        <w:t>4. User Journey (After Fix)</w:t>
+      </w:r>
+    </w:p>
+    <w:p>
+      <w:pPr>
+        <w:rPr>
+          <w:rFonts w:eastAsia="Times New Roman"/>
+        </w:rPr>
+      </w:pPr>
+      <w:r>
+        <w:rPr>
+          <w:rFonts w:eastAsia="Times New Roman"/>
+        </w:rPr>
+        <w:t>Owner invites staff, invite link, register with invited email, verify, login, auto-accept without tier selection, JWT org_id=owner org and role=staff, redirect owner-subdomain/team/, badge Role: Staff, staff permissions.</w:t>
+      </w:r>
+    </w:p>
+    <w:p>
+      <w:pPr>
+        <w:pStyle w:val="Heading2"/>
+        <w:rPr>
+          <w:rFonts w:eastAsia="Times New Roman"/>
+        </w:rPr>
+      </w:pPr>
+      <w:r>
+        <w:rPr>
+          <w:rFonts w:eastAsia="Times New Roman"/>
+        </w:rPr>
+        <w:t>5. Manual Test Plan (Live)</w:t>
+      </w:r>
+    </w:p>
+    <w:p>
+      <w:pPr>
+        <w:rPr>
+          <w:rFonts w:eastAsia="Times New Roman"/>
+        </w:rPr>
+      </w:pPr>
+      <w:r>
+        <w:rPr>
+          <w:rFonts w:eastAsia="Times New Roman"/>
+        </w:rPr>
+        <w:t>Test A - Invited staff: Owner invites staff, incognito invite link, create account, verify, login; expect no tier selection, redirect /team/, badge Role: Staff.</w:t>
+      </w:r>
+    </w:p>
+    <w:p>
+      <w:pPr>
+        <w:rPr>
+          <w:rFonts w:eastAsia="Times New Roman"/>
+        </w:rPr>
+      </w:pPr>
+      <w:r>
+        <w:rPr>
+          <w:rFonts w:eastAsia="Times New Roman"/>
+        </w:rPr>
+        <w:t>Test B - Tier blocked: pending invite plus tier-selection attempt; expect redirect or 403.</w:t>
+      </w:r>
+    </w:p>
+    <w:p>
+      <w:pPr>
+        <w:rPr>
+          <w:rFonts w:eastAsia="Times New Roman"/>
+        </w:rPr>
+      </w:pPr>
+      <w:r>
+        <w:rPr>
+          <w:rFonts w:eastAsia="Times New Roman"/>
+        </w:rPr>
+        <w:t>Test C - Owner unchanged: owner badge Role: Owner; team list correct.</w:t>
+      </w:r>
+    </w:p>
+    <w:p>
+      <w:pPr>
+        <w:rPr>
+          <w:rFonts w:eastAsia="Times New Roman"/>
+        </w:rPr>
+      </w:pPr>
+      <w:r>
+        <w:rPr>
+          <w:rFonts w:eastAsia="Times New Roman"/>
+        </w:rPr>
+        <w:t>Test D - Control signup: no invite, tier selection, own org, Role: Owner.</w:t>
+      </w:r>
+    </w:p>
+    <w:p>
+      <w:pPr>
+        <w:pStyle w:val="Heading2"/>
+        <w:rPr>
+          <w:rFonts w:eastAsia="Times New Roman"/>
+        </w:rPr>
+      </w:pPr>
+      <w:r>
+        <w:rPr>
+          <w:rFonts w:eastAsia="Times New Roman"/>
+        </w:rPr>
+        <w:t>6. PHPUnit</w:t>
+      </w:r>
+    </w:p>
+    <w:p>
+      <w:pPr>
+        <w:rPr>
+          <w:rFonts w:eastAsia="Times New Roman"/>
+        </w:rPr>
+      </w:pPr>
+      <w:r>
+        <w:rPr>
+          <w:rFonts w:eastAsia="Times New Roman"/>
+        </w:rPr>
+        <w:t>cd OraBooks Lean MVP/tests &amp;&amp; vendor/bin/phpunit --configuration phpunit.xml OraBooks_RBAC_Test.php (Expected: 9 tests pass)</w:t>
+      </w:r>
+    </w:p>
+    <w:p>
+      <w:pPr>
+        <w:pStyle w:val="Heading2"/>
+        <w:rPr>
+          <w:rFonts w:eastAsia="Times New Roman"/>
+        </w:rPr>
+      </w:pPr>
+      <w:r>
+        <w:rPr>
+          <w:rFonts w:eastAsia="Times New Roman"/>
+        </w:rPr>
+        <w:t>7. Deploy Notes</w:t>
+      </w:r>
+    </w:p>
+    <w:p>
+      <w:pPr>
+        <w:rPr>
+          <w:rFonts w:eastAsia="Times New Roman"/>
+        </w:rPr>
+      </w:pPr>
+      <w:r>
+        <w:rPr>
+          <w:rFonts w:eastAsia="Times New Roman"/>
+        </w:rPr>
+        <w:t>Sync shared folder to live; hard refresh Ctrl+Shift+R; existing wrong-org users log out and log in again on invited email.</w:t>
+      </w:r>
+    </w:p>
+    <w:p>
+      <w:pPr>
+        <w:pStyle w:val="Heading2"/>
+        <w:rPr>
+          <w:rFonts w:eastAsia="Times New Roman"/>
+        </w:rPr>
+      </w:pPr>
+      <w:r>
+        <w:rPr>
+          <w:rFonts w:eastAsia="Times New Roman"/>
+        </w:rPr>
+        <w:t>8. Future</w:t>
+      </w:r>
+    </w:p>
+    <w:p>
+      <w:pPr>
+        <w:rPr>
+          <w:rFonts w:eastAsia="Times New Roman"/>
+        </w:rPr>
+      </w:pPr>
+      <w:r>
+        <w:rPr>
+          <w:rFonts w:eastAsia="Times New Roman"/>
+        </w:rPr>
+        <w:t>Multi-org (Option B) deferred to enterprise phase per SL-003 section 10.</w:t>
+      </w:r>
+    </w:p>
+    <w:p>
+      <w:pPr>
+        <w:numPr>
+          <w:ilvl w:val="0"/>
+          <w:numId w:val="2"/>
+        </w:numPr>
+        <w:spacing w:before="100" w:beforeAutospacing="1" w:after="60"/>
+        <w:ind w:left="1020"/>
+        <w:rPr>
+          <w:rFonts w:ascii="Calibri" w:eastAsia="Times New Roman" w:hAnsi="Calibri" w:cs="Calibri"/>
+          <w:color w:val="1F2937"/>
+          <w:sz w:val="22"/>
+          <w:szCs w:val="22"/>
+        </w:rPr>
+      </w:pPr>
     </w:p>
     <w:sectPr>
       <w:pgSz w:w="12240" w:h="15840"/>

</xml_diff>

<commit_message>
Auto commit: 2026-06-21 17:19:22
</commit_message>
<xml_diff>
--- a/OraBooks Lean MVP/docs/rbac work report(morshed).docx
+++ b/OraBooks Lean MVP/docs/rbac work report(morshed).docx
@@ -1199,8 +1199,36 @@
           <w:rFonts w:cs="Calibri"/>
           <w:color w:val="1F2937"/>
         </w:rPr>
-        <w:t>includes/class-obn-access-control.php</w:t>
-      </w:r>
+        <w:t>includes/class-</w:t>
+      </w:r>
+      <w:proofErr w:type="spellStart"/>
+      <w:r>
+        <w:rPr>
+          <w:rStyle w:val="code1"/>
+          <w:rFonts w:cs="Calibri"/>
+          <w:color w:val="1F2937"/>
+        </w:rPr>
+        <w:t>obn</w:t>
+      </w:r>
+      <w:proofErr w:type="spellEnd"/>
+      <w:r>
+        <w:rPr>
+          <w:rStyle w:val="code1"/>
+          <w:rFonts w:cs="Calibri"/>
+          <w:color w:val="1F2937"/>
+        </w:rPr>
+        <w:t>-access-</w:t>
+      </w:r>
+      <w:proofErr w:type="spellStart"/>
+      <w:r>
+        <w:rPr>
+          <w:rStyle w:val="code1"/>
+          <w:rFonts w:cs="Calibri"/>
+          <w:color w:val="1F2937"/>
+        </w:rPr>
+        <w:t>control.php</w:t>
+      </w:r>
+      <w:proofErr w:type="spellEnd"/>
     </w:p>
     <w:p>
       <w:pPr>
@@ -1777,6 +1805,7 @@
         </w:rPr>
         <w:t xml:space="preserve">Key permissions: </w:t>
       </w:r>
+      <w:proofErr w:type="spellStart"/>
       <w:r>
         <w:rPr>
           <w:rStyle w:val="code1"/>
@@ -1785,6 +1814,7 @@
         </w:rPr>
         <w:t>view_reports</w:t>
       </w:r>
+      <w:proofErr w:type="spellEnd"/>
       <w:r>
         <w:rPr>
           <w:rFonts w:ascii="Calibri" w:hAnsi="Calibri" w:cs="Calibri"/>
@@ -1794,6 +1824,7 @@
         </w:rPr>
         <w:t xml:space="preserve">, </w:t>
       </w:r>
+      <w:proofErr w:type="spellStart"/>
       <w:r>
         <w:rPr>
           <w:rStyle w:val="code1"/>
@@ -1802,6 +1833,7 @@
         </w:rPr>
         <w:t>submit_transaction</w:t>
       </w:r>
+      <w:proofErr w:type="spellEnd"/>
       <w:r>
         <w:rPr>
           <w:rFonts w:ascii="Calibri" w:hAnsi="Calibri" w:cs="Calibri"/>
@@ -1811,6 +1843,7 @@
         </w:rPr>
         <w:t xml:space="preserve">, </w:t>
       </w:r>
+      <w:proofErr w:type="spellStart"/>
       <w:r>
         <w:rPr>
           <w:rStyle w:val="code1"/>
@@ -1819,6 +1852,7 @@
         </w:rPr>
         <w:t>approve_journal</w:t>
       </w:r>
+      <w:proofErr w:type="spellEnd"/>
       <w:r>
         <w:rPr>
           <w:rFonts w:ascii="Calibri" w:hAnsi="Calibri" w:cs="Calibri"/>
@@ -1828,6 +1862,7 @@
         </w:rPr>
         <w:t xml:space="preserve">, </w:t>
       </w:r>
+      <w:proofErr w:type="spellStart"/>
       <w:r>
         <w:rPr>
           <w:rStyle w:val="code1"/>
@@ -1836,6 +1871,7 @@
         </w:rPr>
         <w:t>manage_employees</w:t>
       </w:r>
+      <w:proofErr w:type="spellEnd"/>
       <w:r>
         <w:rPr>
           <w:rFonts w:ascii="Calibri" w:hAnsi="Calibri" w:cs="Calibri"/>
@@ -1845,6 +1881,7 @@
         </w:rPr>
         <w:t xml:space="preserve">, </w:t>
       </w:r>
+      <w:proofErr w:type="spellStart"/>
       <w:r>
         <w:rPr>
           <w:rStyle w:val="code1"/>
@@ -1853,6 +1890,7 @@
         </w:rPr>
         <w:t>manage_settings</w:t>
       </w:r>
+      <w:proofErr w:type="spellEnd"/>
       <w:r>
         <w:rPr>
           <w:rFonts w:ascii="Calibri" w:hAnsi="Calibri" w:cs="Calibri"/>
@@ -1862,6 +1900,7 @@
         </w:rPr>
         <w:t xml:space="preserve">, </w:t>
       </w:r>
+      <w:proofErr w:type="spellStart"/>
       <w:r>
         <w:rPr>
           <w:rStyle w:val="code1"/>
@@ -1870,6 +1909,7 @@
         </w:rPr>
         <w:t>export_reports</w:t>
       </w:r>
+      <w:proofErr w:type="spellEnd"/>
       <w:r>
         <w:rPr>
           <w:rFonts w:ascii="Calibri" w:hAnsi="Calibri" w:cs="Calibri"/>
@@ -1879,6 +1919,7 @@
         </w:rPr>
         <w:t xml:space="preserve">, </w:t>
       </w:r>
+      <w:proofErr w:type="spellStart"/>
       <w:r>
         <w:rPr>
           <w:rStyle w:val="code1"/>
@@ -1887,6 +1928,7 @@
         </w:rPr>
         <w:t>manage_roles</w:t>
       </w:r>
+      <w:proofErr w:type="spellEnd"/>
       <w:r>
         <w:rPr>
           <w:rFonts w:ascii="Calibri" w:hAnsi="Calibri" w:cs="Calibri"/>
@@ -1896,6 +1938,7 @@
         </w:rPr>
         <w:t xml:space="preserve">, </w:t>
       </w:r>
+      <w:proofErr w:type="spellStart"/>
       <w:r>
         <w:rPr>
           <w:rStyle w:val="code1"/>
@@ -1904,6 +1947,7 @@
         </w:rPr>
         <w:t>view_audit_logs</w:t>
       </w:r>
+      <w:proofErr w:type="spellEnd"/>
       <w:r>
         <w:rPr>
           <w:rFonts w:ascii="Calibri" w:hAnsi="Calibri" w:cs="Calibri"/>
@@ -2079,6 +2123,7 @@
         </w:rPr>
         <w:t xml:space="preserve">Table: </w:t>
       </w:r>
+      <w:proofErr w:type="spellStart"/>
       <w:r>
         <w:rPr>
           <w:rStyle w:val="code1"/>
@@ -2087,6 +2132,7 @@
         </w:rPr>
         <w:t>wp_orabooks_permission_audit_log</w:t>
       </w:r>
+      <w:proofErr w:type="spellEnd"/>
       <w:r>
         <w:rPr>
           <w:rFonts w:ascii="Calibri" w:hAnsi="Calibri" w:cs="Calibri"/>
@@ -2131,7 +2177,27 @@
           <w:sz w:val="22"/>
           <w:szCs w:val="22"/>
         </w:rPr>
-        <w:t>Current blog/site ID = organization. Superadmin does not auto-bypass accounting permissions — must be explicitly assigned as Owner.</w:t>
+        <w:t xml:space="preserve">Current blog/site ID = organization. </w:t>
+      </w:r>
+      <w:proofErr w:type="spellStart"/>
+      <w:r>
+        <w:rPr>
+          <w:rFonts w:ascii="Calibri" w:hAnsi="Calibri" w:cs="Calibri"/>
+          <w:color w:val="1F2937"/>
+          <w:sz w:val="22"/>
+          <w:szCs w:val="22"/>
+        </w:rPr>
+        <w:t>Superadmin</w:t>
+      </w:r>
+      <w:proofErr w:type="spellEnd"/>
+      <w:r>
+        <w:rPr>
+          <w:rFonts w:ascii="Calibri" w:hAnsi="Calibri" w:cs="Calibri"/>
+          <w:color w:val="1F2937"/>
+          <w:sz w:val="22"/>
+          <w:szCs w:val="22"/>
+        </w:rPr>
+        <w:t xml:space="preserve"> does not auto-bypass accounting permissions — must be explicitly assigned as Owner.</w:t>
       </w:r>
     </w:p>
     <w:p>
@@ -2225,6 +2291,7 @@
         </w:rPr>
         <w:t>Role management (</w:t>
       </w:r>
+      <w:proofErr w:type="spellStart"/>
       <w:r>
         <w:rPr>
           <w:rStyle w:val="code1"/>
@@ -2233,6 +2300,7 @@
         </w:rPr>
         <w:t>manage_roles</w:t>
       </w:r>
+      <w:proofErr w:type="spellEnd"/>
       <w:r>
         <w:rPr>
           <w:rFonts w:ascii="Calibri" w:eastAsia="Times New Roman" w:hAnsi="Calibri" w:cs="Calibri"/>
@@ -2282,26 +2350,6 @@
     </w:p>
     <w:p>
       <w:pPr>
-        <w:spacing w:after="160" w:line="278" w:lineRule="auto"/>
-        <w:rPr>
-          <w:rStyle w:val="status-complete1"/>
-          <w:rFonts w:ascii="Calibri" w:hAnsi="Calibri" w:cs="Calibri"/>
-          <w:sz w:val="22"/>
-          <w:szCs w:val="22"/>
-        </w:rPr>
-      </w:pPr>
-      <w:r>
-        <w:rPr>
-          <w:rStyle w:val="status-complete1"/>
-          <w:rFonts w:ascii="Calibri" w:hAnsi="Calibri" w:cs="Calibri"/>
-          <w:sz w:val="22"/>
-          <w:szCs w:val="22"/>
-        </w:rPr>
-        <w:br w:type="page"/>
-      </w:r>
-    </w:p>
-    <w:p>
-      <w:pPr>
         <w:pStyle w:val="Heading1"/>
         <w:rPr>
           <w:rFonts w:eastAsia="Times New Roman"/>
@@ -2311,6 +2359,7 @@
         <w:rPr>
           <w:rFonts w:eastAsia="Times New Roman"/>
         </w:rPr>
+        <w:lastRenderedPageBreak/>
         <w:t>SL-003 RBAC - Invite-First Onboarding (Option A)</w:t>
       </w:r>
     </w:p>
@@ -2443,33 +2492,75 @@
         <w:rPr>
           <w:rFonts w:eastAsia="Times New Roman"/>
         </w:rPr>
-        <w:t>3. user_org row created with invited role (e.g. staff).</w:t>
-      </w:r>
-    </w:p>
-    <w:p>
-      <w:pPr>
-        <w:rPr>
-          <w:rFonts w:eastAsia="Times New Roman"/>
-        </w:rPr>
-      </w:pPr>
-      <w:r>
-        <w:rPr>
-          <w:rFonts w:eastAsia="Times New Roman"/>
-        </w:rPr>
-        <w:t>4. users.org_id set to employer org.</w:t>
-      </w:r>
-    </w:p>
-    <w:p>
-      <w:pPr>
-        <w:rPr>
-          <w:rFonts w:eastAsia="Times New Roman"/>
-        </w:rPr>
-      </w:pPr>
-      <w:r>
-        <w:rPr>
-          <w:rFonts w:eastAsia="Times New Roman"/>
-        </w:rPr>
-        <w:t>5. JWT issued with employer org_id + role.</w:t>
+        <w:t xml:space="preserve">3. </w:t>
+      </w:r>
+      <w:proofErr w:type="spellStart"/>
+      <w:r>
+        <w:rPr>
+          <w:rFonts w:eastAsia="Times New Roman"/>
+        </w:rPr>
+        <w:t>user_org</w:t>
+      </w:r>
+      <w:proofErr w:type="spellEnd"/>
+      <w:r>
+        <w:rPr>
+          <w:rFonts w:eastAsia="Times New Roman"/>
+        </w:rPr>
+        <w:t xml:space="preserve"> row created with invited role (e.g. staff).</w:t>
+      </w:r>
+    </w:p>
+    <w:p>
+      <w:pPr>
+        <w:rPr>
+          <w:rFonts w:eastAsia="Times New Roman"/>
+        </w:rPr>
+      </w:pPr>
+      <w:r>
+        <w:rPr>
+          <w:rFonts w:eastAsia="Times New Roman"/>
+        </w:rPr>
+        <w:t xml:space="preserve">4. </w:t>
+      </w:r>
+      <w:proofErr w:type="spellStart"/>
+      <w:r>
+        <w:rPr>
+          <w:rFonts w:eastAsia="Times New Roman"/>
+        </w:rPr>
+        <w:t>users.org_id</w:t>
+      </w:r>
+      <w:proofErr w:type="spellEnd"/>
+      <w:r>
+        <w:rPr>
+          <w:rFonts w:eastAsia="Times New Roman"/>
+        </w:rPr>
+        <w:t xml:space="preserve"> set to employer org.</w:t>
+      </w:r>
+    </w:p>
+    <w:p>
+      <w:pPr>
+        <w:rPr>
+          <w:rFonts w:eastAsia="Times New Roman"/>
+        </w:rPr>
+      </w:pPr>
+      <w:r>
+        <w:rPr>
+          <w:rFonts w:eastAsia="Times New Roman"/>
+        </w:rPr>
+        <w:t xml:space="preserve">5. JWT issued with employer </w:t>
+      </w:r>
+      <w:proofErr w:type="spellStart"/>
+      <w:r>
+        <w:rPr>
+          <w:rFonts w:eastAsia="Times New Roman"/>
+        </w:rPr>
+        <w:t>org_id</w:t>
+      </w:r>
+      <w:proofErr w:type="spellEnd"/>
+      <w:r>
+        <w:rPr>
+          <w:rFonts w:eastAsia="Times New Roman"/>
+        </w:rPr>
+        <w:t xml:space="preserve"> + role.</w:t>
       </w:r>
     </w:p>
     <w:p>
@@ -2508,7 +2599,21 @@
         <w:rPr>
           <w:rFonts w:eastAsia="Times New Roman"/>
         </w:rPr>
-        <w:t>SL-003 alignment: Role from user_org in JWT (Done); deny-by-default matrix (Unchanged); role badge sync (Fixed); refresh token revoke on role change (Unchanged); partner accounting block SL-013 (Unchanged); invite journey role X to accept to role X (Done).</w:t>
+        <w:t xml:space="preserve">SL-003 alignment: Role from </w:t>
+      </w:r>
+      <w:proofErr w:type="spellStart"/>
+      <w:r>
+        <w:rPr>
+          <w:rFonts w:eastAsia="Times New Roman"/>
+        </w:rPr>
+        <w:t>user_org</w:t>
+      </w:r>
+      <w:proofErr w:type="spellEnd"/>
+      <w:r>
+        <w:rPr>
+          <w:rFonts w:eastAsia="Times New Roman"/>
+        </w:rPr>
+        <w:t xml:space="preserve"> in JWT (Done); deny-by-default matrix (Unchanged); role badge sync (Fixed); refresh token revoke on role change (Unchanged); partner accounting block SL-013 (Unchanged); invite journey role X to accept to role X (Done).</w:t>
       </w:r>
     </w:p>
     <w:p>
@@ -2535,33 +2640,189 @@
         <w:rPr>
           <w:rFonts w:eastAsia="Times New Roman"/>
         </w:rPr>
-        <w:t>Backend: helpers.php, class-orabooks-team.php, class-orabooks-auth.php, class-orabooks-two-factor.php</w:t>
-      </w:r>
-    </w:p>
-    <w:p>
-      <w:pPr>
-        <w:rPr>
-          <w:rFonts w:eastAsia="Times New Roman"/>
-        </w:rPr>
-      </w:pPr>
-      <w:r>
-        <w:rPr>
-          <w:rFonts w:eastAsia="Times New Roman"/>
-        </w:rPr>
-        <w:t>Frontend: auth-routing.ts, RegisterPage.tsx, TierSelectionPage.tsx, ClientShell.tsx</w:t>
-      </w:r>
-    </w:p>
-    <w:p>
-      <w:pPr>
-        <w:rPr>
-          <w:rFonts w:eastAsia="Times New Roman"/>
-        </w:rPr>
-      </w:pPr>
-      <w:r>
-        <w:rPr>
-          <w:rFonts w:eastAsia="Times New Roman"/>
-        </w:rPr>
-        <w:t>Tests: OraBooks_RBAC_Test.php - 9/9 pass</w:t>
+        <w:t xml:space="preserve">Backend: </w:t>
+      </w:r>
+      <w:proofErr w:type="spellStart"/>
+      <w:r>
+        <w:rPr>
+          <w:rFonts w:eastAsia="Times New Roman"/>
+        </w:rPr>
+        <w:t>helpers.php</w:t>
+      </w:r>
+      <w:proofErr w:type="spellEnd"/>
+      <w:r>
+        <w:rPr>
+          <w:rFonts w:eastAsia="Times New Roman"/>
+        </w:rPr>
+        <w:t>, class-</w:t>
+      </w:r>
+      <w:proofErr w:type="spellStart"/>
+      <w:r>
+        <w:rPr>
+          <w:rFonts w:eastAsia="Times New Roman"/>
+        </w:rPr>
+        <w:t>orabooks</w:t>
+      </w:r>
+      <w:proofErr w:type="spellEnd"/>
+      <w:r>
+        <w:rPr>
+          <w:rFonts w:eastAsia="Times New Roman"/>
+        </w:rPr>
+        <w:t>-</w:t>
+      </w:r>
+      <w:proofErr w:type="spellStart"/>
+      <w:r>
+        <w:rPr>
+          <w:rFonts w:eastAsia="Times New Roman"/>
+        </w:rPr>
+        <w:t>team.php</w:t>
+      </w:r>
+      <w:proofErr w:type="spellEnd"/>
+      <w:r>
+        <w:rPr>
+          <w:rFonts w:eastAsia="Times New Roman"/>
+        </w:rPr>
+        <w:t>, class-</w:t>
+      </w:r>
+      <w:proofErr w:type="spellStart"/>
+      <w:r>
+        <w:rPr>
+          <w:rFonts w:eastAsia="Times New Roman"/>
+        </w:rPr>
+        <w:t>orabooks</w:t>
+      </w:r>
+      <w:proofErr w:type="spellEnd"/>
+      <w:r>
+        <w:rPr>
+          <w:rFonts w:eastAsia="Times New Roman"/>
+        </w:rPr>
+        <w:t>-</w:t>
+      </w:r>
+      <w:proofErr w:type="spellStart"/>
+      <w:r>
+        <w:rPr>
+          <w:rFonts w:eastAsia="Times New Roman"/>
+        </w:rPr>
+        <w:t>auth.php</w:t>
+      </w:r>
+      <w:proofErr w:type="spellEnd"/>
+      <w:r>
+        <w:rPr>
+          <w:rFonts w:eastAsia="Times New Roman"/>
+        </w:rPr>
+        <w:t>, class-</w:t>
+      </w:r>
+      <w:proofErr w:type="spellStart"/>
+      <w:r>
+        <w:rPr>
+          <w:rFonts w:eastAsia="Times New Roman"/>
+        </w:rPr>
+        <w:t>orabooks</w:t>
+      </w:r>
+      <w:proofErr w:type="spellEnd"/>
+      <w:r>
+        <w:rPr>
+          <w:rFonts w:eastAsia="Times New Roman"/>
+        </w:rPr>
+        <w:t>-two-</w:t>
+      </w:r>
+      <w:proofErr w:type="spellStart"/>
+      <w:r>
+        <w:rPr>
+          <w:rFonts w:eastAsia="Times New Roman"/>
+        </w:rPr>
+        <w:t>factor.php</w:t>
+      </w:r>
+      <w:proofErr w:type="spellEnd"/>
+    </w:p>
+    <w:p>
+      <w:pPr>
+        <w:rPr>
+          <w:rFonts w:eastAsia="Times New Roman"/>
+        </w:rPr>
+      </w:pPr>
+      <w:r>
+        <w:rPr>
+          <w:rFonts w:eastAsia="Times New Roman"/>
+        </w:rPr>
+        <w:t>Frontend: auth-</w:t>
+      </w:r>
+      <w:proofErr w:type="spellStart"/>
+      <w:r>
+        <w:rPr>
+          <w:rFonts w:eastAsia="Times New Roman"/>
+        </w:rPr>
+        <w:t>routing.ts</w:t>
+      </w:r>
+      <w:proofErr w:type="spellEnd"/>
+      <w:r>
+        <w:rPr>
+          <w:rFonts w:eastAsia="Times New Roman"/>
+        </w:rPr>
+        <w:t xml:space="preserve">, </w:t>
+      </w:r>
+      <w:proofErr w:type="spellStart"/>
+      <w:r>
+        <w:rPr>
+          <w:rFonts w:eastAsia="Times New Roman"/>
+        </w:rPr>
+        <w:t>RegisterPage.tsx</w:t>
+      </w:r>
+      <w:proofErr w:type="spellEnd"/>
+      <w:r>
+        <w:rPr>
+          <w:rFonts w:eastAsia="Times New Roman"/>
+        </w:rPr>
+        <w:t xml:space="preserve">, </w:t>
+      </w:r>
+      <w:proofErr w:type="spellStart"/>
+      <w:r>
+        <w:rPr>
+          <w:rFonts w:eastAsia="Times New Roman"/>
+        </w:rPr>
+        <w:t>TierSelectionPage.tsx</w:t>
+      </w:r>
+      <w:proofErr w:type="spellEnd"/>
+      <w:r>
+        <w:rPr>
+          <w:rFonts w:eastAsia="Times New Roman"/>
+        </w:rPr>
+        <w:t xml:space="preserve">, </w:t>
+      </w:r>
+      <w:proofErr w:type="spellStart"/>
+      <w:r>
+        <w:rPr>
+          <w:rFonts w:eastAsia="Times New Roman"/>
+        </w:rPr>
+        <w:t>ClientShell.tsx</w:t>
+      </w:r>
+      <w:proofErr w:type="spellEnd"/>
+    </w:p>
+    <w:p>
+      <w:pPr>
+        <w:rPr>
+          <w:rFonts w:eastAsia="Times New Roman"/>
+        </w:rPr>
+      </w:pPr>
+      <w:r>
+        <w:rPr>
+          <w:rFonts w:eastAsia="Times New Roman"/>
+        </w:rPr>
+        <w:t xml:space="preserve">Tests: </w:t>
+      </w:r>
+      <w:proofErr w:type="spellStart"/>
+      <w:r>
+        <w:rPr>
+          <w:rFonts w:eastAsia="Times New Roman"/>
+        </w:rPr>
+        <w:t>OraBooks_RBAC_Test.php</w:t>
+      </w:r>
+      <w:proofErr w:type="spellEnd"/>
+      <w:r>
+        <w:rPr>
+          <w:rFonts w:eastAsia="Times New Roman"/>
+        </w:rPr>
+        <w:t xml:space="preserve"> - 9/9 pass</w:t>
       </w:r>
     </w:p>
     <w:p>
@@ -2588,7 +2849,21 @@
         <w:rPr>
           <w:rFonts w:eastAsia="Times New Roman"/>
         </w:rPr>
-        <w:t>Owner invites staff, invite link, register with invited email, verify, login, auto-accept without tier selection, JWT org_id=owner org and role=staff, redirect owner-subdomain/team/, badge Role: Staff, staff permissions.</w:t>
+        <w:t xml:space="preserve">Owner invites staff, invite link, register with invited email, verify, login, auto-accept without tier selection, JWT </w:t>
+      </w:r>
+      <w:proofErr w:type="spellStart"/>
+      <w:r>
+        <w:rPr>
+          <w:rFonts w:eastAsia="Times New Roman"/>
+        </w:rPr>
+        <w:t>org_id</w:t>
+      </w:r>
+      <w:proofErr w:type="spellEnd"/>
+      <w:r>
+        <w:rPr>
+          <w:rFonts w:eastAsia="Times New Roman"/>
+        </w:rPr>
+        <w:t>=owner org and role=staff, redirect owner-subdomain/team/, badge Role: Staff, staff permissions.</w:t>
       </w:r>
     </w:p>
     <w:p>
@@ -2668,20 +2943,71 @@
         <w:rPr>
           <w:rFonts w:eastAsia="Times New Roman"/>
         </w:rPr>
-        <w:t>6. PHPUnit</w:t>
-      </w:r>
-    </w:p>
-    <w:p>
-      <w:pPr>
-        <w:rPr>
-          <w:rFonts w:eastAsia="Times New Roman"/>
-        </w:rPr>
-      </w:pPr>
-      <w:r>
-        <w:rPr>
-          <w:rFonts w:eastAsia="Times New Roman"/>
-        </w:rPr>
-        <w:t>cd OraBooks Lean MVP/tests &amp;&amp; vendor/bin/phpunit --configuration phpunit.xml OraBooks_RBAC_Test.php (Expected: 9 tests pass)</w:t>
+        <w:lastRenderedPageBreak/>
+        <w:t xml:space="preserve">6. </w:t>
+      </w:r>
+      <w:proofErr w:type="spellStart"/>
+      <w:r>
+        <w:rPr>
+          <w:rFonts w:eastAsia="Times New Roman"/>
+        </w:rPr>
+        <w:t>PHPUnit</w:t>
+      </w:r>
+      <w:proofErr w:type="spellEnd"/>
+    </w:p>
+    <w:p>
+      <w:pPr>
+        <w:rPr>
+          <w:rFonts w:eastAsia="Times New Roman"/>
+        </w:rPr>
+      </w:pPr>
+      <w:r>
+        <w:rPr>
+          <w:rFonts w:eastAsia="Times New Roman"/>
+        </w:rPr>
+        <w:t xml:space="preserve">cd </w:t>
+      </w:r>
+      <w:proofErr w:type="spellStart"/>
+      <w:r>
+        <w:rPr>
+          <w:rFonts w:eastAsia="Times New Roman"/>
+        </w:rPr>
+        <w:t>OraBooks</w:t>
+      </w:r>
+      <w:proofErr w:type="spellEnd"/>
+      <w:r>
+        <w:rPr>
+          <w:rFonts w:eastAsia="Times New Roman"/>
+        </w:rPr>
+        <w:t xml:space="preserve"> Lean MVP/tests &amp;&amp; vendor/bin/</w:t>
+      </w:r>
+      <w:proofErr w:type="spellStart"/>
+      <w:r>
+        <w:rPr>
+          <w:rFonts w:eastAsia="Times New Roman"/>
+        </w:rPr>
+        <w:t>phpunit</w:t>
+      </w:r>
+      <w:proofErr w:type="spellEnd"/>
+      <w:r>
+        <w:rPr>
+          <w:rFonts w:eastAsia="Times New Roman"/>
+        </w:rPr>
+        <w:t xml:space="preserve"> --configuration phpunit.xml </w:t>
+      </w:r>
+      <w:proofErr w:type="spellStart"/>
+      <w:r>
+        <w:rPr>
+          <w:rFonts w:eastAsia="Times New Roman"/>
+        </w:rPr>
+        <w:t>OraBooks_RBAC_Test.php</w:t>
+      </w:r>
+      <w:proofErr w:type="spellEnd"/>
+      <w:r>
+        <w:rPr>
+          <w:rFonts w:eastAsia="Times New Roman"/>
+        </w:rPr>
+        <w:t xml:space="preserve"> (Expected: 9 tests pass)</w:t>
       </w:r>
     </w:p>
     <w:p>
@@ -2708,7 +3034,21 @@
         <w:rPr>
           <w:rFonts w:eastAsia="Times New Roman"/>
         </w:rPr>
-        <w:t>Sync shared folder to live; hard refresh Ctrl+Shift+R; existing wrong-org users log out and log in again on invited email.</w:t>
+        <w:t xml:space="preserve">Sync shared folder to live; hard refresh </w:t>
+      </w:r>
+      <w:proofErr w:type="spellStart"/>
+      <w:r>
+        <w:rPr>
+          <w:rFonts w:eastAsia="Times New Roman"/>
+        </w:rPr>
+        <w:t>Ctrl+Shift+R</w:t>
+      </w:r>
+      <w:proofErr w:type="spellEnd"/>
+      <w:r>
+        <w:rPr>
+          <w:rFonts w:eastAsia="Times New Roman"/>
+        </w:rPr>
+        <w:t>; existing wrong-org users log out and log in again on invited email.</w:t>
       </w:r>
     </w:p>
     <w:p>

</xml_diff>

<commit_message>
Auto commit: 2026-06-21 17:27:04
</commit_message>
<xml_diff>
--- a/OraBooks Lean MVP/docs/rbac work report(morshed).docx
+++ b/OraBooks Lean MVP/docs/rbac work report(morshed).docx
@@ -6,8 +6,13 @@
       <w:pPr>
         <w:pStyle w:val="Title"/>
       </w:pPr>
-      <w:r>
-        <w:t>OraBooks Lean MVP</w:t>
+      <w:proofErr w:type="spellStart"/>
+      <w:r>
+        <w:t>OraBooks</w:t>
+      </w:r>
+      <w:proofErr w:type="spellEnd"/>
+      <w:r>
+        <w:t xml:space="preserve"> Lean MVP</w:t>
       </w:r>
     </w:p>
     <w:p>
@@ -15,18 +20,31 @@
         <w:pStyle w:val="Subtitle"/>
       </w:pPr>
       <w:r>
-        <w:t>SL-003 RBAC / ABAC â€” Complete Implementation Report</w:t>
-      </w:r>
-    </w:p>
-    <w:p>
-      <w:r>
-        <w:t>Prepared for: Morshed / OraBooks Project Team</w:t>
-      </w:r>
-    </w:p>
-    <w:p>
-      <w:r>
-        <w:t>Date: 21 June 2026 | Spec: SL-003 RBAC/ABAC, SL-013 Auth, SL-014 Team, SL-004 Multi-tenant</w:t>
-      </w:r>
+        <w:t>SL-003 RBAC / ABAC Complete Implementation Report</w:t>
+      </w:r>
+    </w:p>
+    <w:p>
+      <w:r>
+        <w:t xml:space="preserve">Prepared for: Morshed / </w:t>
+      </w:r>
+      <w:proofErr w:type="spellStart"/>
+      <w:r>
+        <w:t>OraBooks</w:t>
+      </w:r>
+      <w:proofErr w:type="spellEnd"/>
+      <w:r>
+        <w:t xml:space="preserve"> Project Team</w:t>
+      </w:r>
+    </w:p>
+    <w:p>
+      <w:r>
+        <w:t xml:space="preserve">Date: 21 June 2026 | Spec: SL-003 RBAC/ABAC, SL-013 Auth, SL-014 Team, SL-004 </w:t>
+      </w:r>
+      <w:proofErr w:type="gramStart"/>
+      <w:r>
+        <w:t>Multi-tenant</w:t>
+      </w:r>
+      <w:proofErr w:type="gramEnd"/>
     </w:p>
     <w:p>
       <w:r>
@@ -43,7 +61,39 @@
     </w:p>
     <w:p>
       <w:r>
-        <w:t>SL-003 implements org-scoped Role-Based Access Control across the OraBooks Lean MVP. Five fixed roles (owner, admin, approver, staff, viewer) map to a deny-by-default permission matrix. OBN_Access_Control is the central facade for permission checks, dedicated permission_denied audit logging, and UI permission matrix delivery. JWT carries org_id and role claims. Role changes revoke refresh tokens. Partner organizations are blocked from accounting APIs. Invited staff onboarding skips tier selection and auto-joins the employer org with the invited role.</w:t>
+        <w:t xml:space="preserve">SL-003 implements org-scoped Role-Based Access Control across the </w:t>
+      </w:r>
+      <w:proofErr w:type="spellStart"/>
+      <w:r>
+        <w:t>OraBooks</w:t>
+      </w:r>
+      <w:proofErr w:type="spellEnd"/>
+      <w:r>
+        <w:t xml:space="preserve"> Lean MVP. Five fixed roles (owner, admin, approver, staff, viewer) map to a deny-by-default permission matrix. </w:t>
+      </w:r>
+      <w:proofErr w:type="spellStart"/>
+      <w:r>
+        <w:t>OBN_Access_Control</w:t>
+      </w:r>
+      <w:proofErr w:type="spellEnd"/>
+      <w:r>
+        <w:t xml:space="preserve"> is the central facade for permission checks, dedicated </w:t>
+      </w:r>
+      <w:proofErr w:type="spellStart"/>
+      <w:r>
+        <w:t>permission_denied</w:t>
+      </w:r>
+      <w:proofErr w:type="spellEnd"/>
+      <w:r>
+        <w:t xml:space="preserve"> audit logging, and UI permission matrix delivery. JWT carries </w:t>
+      </w:r>
+      <w:proofErr w:type="spellStart"/>
+      <w:r>
+        <w:t>org_id</w:t>
+      </w:r>
+      <w:proofErr w:type="spellEnd"/>
+      <w:r>
+        <w:t xml:space="preserve"> and role claims. Role changes revoke refresh tokens. Partner organizations are blocked from accounting APIs. Invited staff onboarding skips tier selection and auto-joins the employer org with the invited role.</w:t>
       </w:r>
     </w:p>
     <w:p>
@@ -56,12 +106,222 @@
     </w:p>
     <w:p>
       <w:r>
-        <w:t>Request flow: API/AJAX handler calls OraBooks_RBAC::require_permission(), which delegates to OBN_Access_Control::require_permission(). Checks include alias normalization, org active status, cross-tenant validation, partner accounting block, then role matrix lookup. Denied attempts write to wp_orabooks_permission_audit_log and orabooks audit events.</w:t>
-      </w:r>
-    </w:p>
-    <w:p>
-      <w:r>
-        <w:t>Key files: includes/class-orabooks-rbac.php, includes/class-orabooks-obn-access-control.php (class-obn-access-control.php), includes/helpers.php, includes/class-orabooks-auth.php, includes/class-orabooks-team.php, includes/class-orabooks-ajax.php, orabooks-ui ClientShell.tsx and TeamPage.tsx.</w:t>
+        <w:t xml:space="preserve">Request flow: API/AJAX handler calls </w:t>
+      </w:r>
+      <w:proofErr w:type="spellStart"/>
+      <w:r>
+        <w:t>OraBooks_</w:t>
+      </w:r>
+      <w:proofErr w:type="gramStart"/>
+      <w:r>
+        <w:t>RBAC</w:t>
+      </w:r>
+      <w:proofErr w:type="spellEnd"/>
+      <w:r>
+        <w:t>::</w:t>
+      </w:r>
+      <w:proofErr w:type="spellStart"/>
+      <w:proofErr w:type="gramEnd"/>
+      <w:r>
+        <w:t>require_</w:t>
+      </w:r>
+      <w:proofErr w:type="gramStart"/>
+      <w:r>
+        <w:t>permission</w:t>
+      </w:r>
+      <w:proofErr w:type="spellEnd"/>
+      <w:r>
+        <w:t>(</w:t>
+      </w:r>
+      <w:proofErr w:type="gramEnd"/>
+      <w:r>
+        <w:t xml:space="preserve">), which delegates to </w:t>
+      </w:r>
+      <w:proofErr w:type="spellStart"/>
+      <w:r>
+        <w:t>OBN_Access_</w:t>
+      </w:r>
+      <w:proofErr w:type="gramStart"/>
+      <w:r>
+        <w:t>Control</w:t>
+      </w:r>
+      <w:proofErr w:type="spellEnd"/>
+      <w:r>
+        <w:t>::</w:t>
+      </w:r>
+      <w:proofErr w:type="spellStart"/>
+      <w:proofErr w:type="gramEnd"/>
+      <w:r>
+        <w:t>require_</w:t>
+      </w:r>
+      <w:proofErr w:type="gramStart"/>
+      <w:r>
+        <w:t>permission</w:t>
+      </w:r>
+      <w:proofErr w:type="spellEnd"/>
+      <w:r>
+        <w:t>(</w:t>
+      </w:r>
+      <w:proofErr w:type="gramEnd"/>
+      <w:r>
+        <w:t xml:space="preserve">). Checks include alias normalization, org active status, cross-tenant validation, partner accounting block, then role matrix lookup. Denied attempts write to </w:t>
+      </w:r>
+      <w:proofErr w:type="spellStart"/>
+      <w:r>
+        <w:t>wp_orabooks_permission_audit_log</w:t>
+      </w:r>
+      <w:proofErr w:type="spellEnd"/>
+      <w:r>
+        <w:t xml:space="preserve"> and </w:t>
+      </w:r>
+      <w:proofErr w:type="spellStart"/>
+      <w:r>
+        <w:t>orabooks</w:t>
+      </w:r>
+      <w:proofErr w:type="spellEnd"/>
+      <w:r>
+        <w:t xml:space="preserve"> audit events.</w:t>
+      </w:r>
+    </w:p>
+    <w:p>
+      <w:r>
+        <w:t>Key files: includes/class-</w:t>
+      </w:r>
+      <w:proofErr w:type="spellStart"/>
+      <w:r>
+        <w:t>orabooks</w:t>
+      </w:r>
+      <w:proofErr w:type="spellEnd"/>
+      <w:r>
+        <w:t>-</w:t>
+      </w:r>
+      <w:proofErr w:type="spellStart"/>
+      <w:r>
+        <w:t>rbac.php</w:t>
+      </w:r>
+      <w:proofErr w:type="spellEnd"/>
+      <w:r>
+        <w:t>, includes/class-</w:t>
+      </w:r>
+      <w:proofErr w:type="spellStart"/>
+      <w:r>
+        <w:t>orabooks</w:t>
+      </w:r>
+      <w:proofErr w:type="spellEnd"/>
+      <w:r>
+        <w:t>-</w:t>
+      </w:r>
+      <w:proofErr w:type="spellStart"/>
+      <w:r>
+        <w:t>obn</w:t>
+      </w:r>
+      <w:proofErr w:type="spellEnd"/>
+      <w:r>
+        <w:t>-access-</w:t>
+      </w:r>
+      <w:proofErr w:type="spellStart"/>
+      <w:r>
+        <w:t>control.php</w:t>
+      </w:r>
+      <w:proofErr w:type="spellEnd"/>
+      <w:r>
+        <w:t xml:space="preserve"> (class-</w:t>
+      </w:r>
+      <w:proofErr w:type="spellStart"/>
+      <w:r>
+        <w:t>obn</w:t>
+      </w:r>
+      <w:proofErr w:type="spellEnd"/>
+      <w:r>
+        <w:t>-access-</w:t>
+      </w:r>
+      <w:proofErr w:type="spellStart"/>
+      <w:r>
+        <w:t>control.php</w:t>
+      </w:r>
+      <w:proofErr w:type="spellEnd"/>
+      <w:r>
+        <w:t>), includes/</w:t>
+      </w:r>
+      <w:proofErr w:type="spellStart"/>
+      <w:r>
+        <w:t>helpers.php</w:t>
+      </w:r>
+      <w:proofErr w:type="spellEnd"/>
+      <w:r>
+        <w:t>, includes/class-</w:t>
+      </w:r>
+      <w:proofErr w:type="spellStart"/>
+      <w:r>
+        <w:t>orabooks</w:t>
+      </w:r>
+      <w:proofErr w:type="spellEnd"/>
+      <w:r>
+        <w:t>-</w:t>
+      </w:r>
+      <w:proofErr w:type="spellStart"/>
+      <w:r>
+        <w:t>auth.php</w:t>
+      </w:r>
+      <w:proofErr w:type="spellEnd"/>
+      <w:r>
+        <w:t>, includes/class-</w:t>
+      </w:r>
+      <w:proofErr w:type="spellStart"/>
+      <w:r>
+        <w:t>orabooks</w:t>
+      </w:r>
+      <w:proofErr w:type="spellEnd"/>
+      <w:r>
+        <w:t>-</w:t>
+      </w:r>
+      <w:proofErr w:type="spellStart"/>
+      <w:r>
+        <w:t>team.php</w:t>
+      </w:r>
+      <w:proofErr w:type="spellEnd"/>
+      <w:r>
+        <w:t>, includes/class-</w:t>
+      </w:r>
+      <w:proofErr w:type="spellStart"/>
+      <w:r>
+        <w:t>orabooks</w:t>
+      </w:r>
+      <w:proofErr w:type="spellEnd"/>
+      <w:r>
+        <w:t>-</w:t>
+      </w:r>
+      <w:proofErr w:type="spellStart"/>
+      <w:r>
+        <w:t>ajax.php</w:t>
+      </w:r>
+      <w:proofErr w:type="spellEnd"/>
+      <w:r>
+        <w:t xml:space="preserve">, </w:t>
+      </w:r>
+      <w:proofErr w:type="spellStart"/>
+      <w:r>
+        <w:t>orabooks-ui</w:t>
+      </w:r>
+      <w:proofErr w:type="spellEnd"/>
+      <w:r>
+        <w:t xml:space="preserve"> </w:t>
+      </w:r>
+      <w:proofErr w:type="spellStart"/>
+      <w:r>
+        <w:t>ClientShell.tsx</w:t>
+      </w:r>
+      <w:proofErr w:type="spellEnd"/>
+      <w:r>
+        <w:t xml:space="preserve"> and </w:t>
+      </w:r>
+      <w:proofErr w:type="spellStart"/>
+      <w:r>
+        <w:t>TeamPage.tsx</w:t>
+      </w:r>
+      <w:proofErr w:type="spellEnd"/>
+      <w:r>
+        <w:t>.</w:t>
       </w:r>
     </w:p>
     <w:p>
@@ -94,6 +354,7 @@
     </w:p>
     <w:p>
       <w:r>
+        <w:lastRenderedPageBreak/>
         <w:t>viewer â€” Read-only access to reports, invoices, expenses, classification.</w:t>
       </w:r>
     </w:p>
@@ -249,9 +510,11 @@
             <w:tcW w:w="1560" w:type="dxa"/>
           </w:tcPr>
           <w:p>
+            <w:proofErr w:type="spellStart"/>
             <w:r>
               <w:t>view_reports</w:t>
             </w:r>
+            <w:proofErr w:type="spellEnd"/>
           </w:p>
         </w:tc>
         <w:tc>
@@ -327,9 +590,11 @@
             <w:tcW w:w="1560" w:type="dxa"/>
           </w:tcPr>
           <w:p>
+            <w:proofErr w:type="spellStart"/>
             <w:r>
               <w:t>submit_transaction</w:t>
             </w:r>
+            <w:proofErr w:type="spellEnd"/>
           </w:p>
         </w:tc>
         <w:tc>
@@ -402,9 +667,11 @@
             <w:tcW w:w="1560" w:type="dxa"/>
           </w:tcPr>
           <w:p>
+            <w:proofErr w:type="spellStart"/>
             <w:r>
               <w:t>approve_journal</w:t>
             </w:r>
+            <w:proofErr w:type="spellEnd"/>
           </w:p>
         </w:tc>
         <w:tc>
@@ -474,9 +741,19 @@
             <w:tcW w:w="1560" w:type="dxa"/>
           </w:tcPr>
           <w:p>
-            <w:r>
-              <w:t>manage_employees / invite_user</w:t>
-            </w:r>
+            <w:proofErr w:type="spellStart"/>
+            <w:r>
+              <w:t>manage_employees</w:t>
+            </w:r>
+            <w:proofErr w:type="spellEnd"/>
+            <w:r>
+              <w:t xml:space="preserve"> / </w:t>
+            </w:r>
+            <w:proofErr w:type="spellStart"/>
+            <w:r>
+              <w:t>invite_user</w:t>
+            </w:r>
+            <w:proofErr w:type="spellEnd"/>
           </w:p>
         </w:tc>
         <w:tc>
@@ -546,9 +823,19 @@
             <w:tcW w:w="1560" w:type="dxa"/>
           </w:tcPr>
           <w:p>
-            <w:r>
-              <w:t>manage_roles / change_role</w:t>
-            </w:r>
+            <w:proofErr w:type="spellStart"/>
+            <w:r>
+              <w:t>manage_roles</w:t>
+            </w:r>
+            <w:proofErr w:type="spellEnd"/>
+            <w:r>
+              <w:t xml:space="preserve"> / </w:t>
+            </w:r>
+            <w:proofErr w:type="spellStart"/>
+            <w:r>
+              <w:t>change_role</w:t>
+            </w:r>
+            <w:proofErr w:type="spellEnd"/>
           </w:p>
         </w:tc>
         <w:tc>
@@ -612,9 +899,11 @@
             <w:tcW w:w="1560" w:type="dxa"/>
           </w:tcPr>
           <w:p>
+            <w:proofErr w:type="spellStart"/>
             <w:r>
               <w:t>remove_user</w:t>
             </w:r>
+            <w:proofErr w:type="spellEnd"/>
           </w:p>
         </w:tc>
         <w:tc>
@@ -681,9 +970,11 @@
             <w:tcW w:w="1560" w:type="dxa"/>
           </w:tcPr>
           <w:p>
+            <w:proofErr w:type="spellStart"/>
             <w:r>
               <w:t>manage_settings</w:t>
             </w:r>
+            <w:proofErr w:type="spellEnd"/>
           </w:p>
         </w:tc>
         <w:tc>
@@ -750,9 +1041,11 @@
             <w:tcW w:w="1560" w:type="dxa"/>
           </w:tcPr>
           <w:p>
+            <w:proofErr w:type="spellStart"/>
             <w:r>
               <w:t>view_coa</w:t>
             </w:r>
+            <w:proofErr w:type="spellEnd"/>
           </w:p>
         </w:tc>
         <w:tc>
@@ -822,9 +1115,11 @@
             <w:tcW w:w="1560" w:type="dxa"/>
           </w:tcPr>
           <w:p>
+            <w:proofErr w:type="spellStart"/>
             <w:r>
               <w:t>export_reports</w:t>
             </w:r>
+            <w:proofErr w:type="spellEnd"/>
           </w:p>
         </w:tc>
         <w:tc>
@@ -894,9 +1189,11 @@
             <w:tcW w:w="1560" w:type="dxa"/>
           </w:tcPr>
           <w:p>
+            <w:proofErr w:type="spellStart"/>
             <w:r>
               <w:t>view_audit_logs</w:t>
             </w:r>
+            <w:proofErr w:type="spellEnd"/>
           </w:p>
         </w:tc>
         <w:tc>
@@ -966,9 +1263,11 @@
             <w:tcW w:w="1560" w:type="dxa"/>
           </w:tcPr>
           <w:p>
+            <w:proofErr w:type="spellStart"/>
             <w:r>
               <w:t>manage_inventory</w:t>
             </w:r>
+            <w:proofErr w:type="spellEnd"/>
           </w:p>
         </w:tc>
         <w:tc>
@@ -1038,9 +1337,11 @@
             <w:tcW w:w="1560" w:type="dxa"/>
           </w:tcPr>
           <w:p>
+            <w:proofErr w:type="spellStart"/>
             <w:r>
               <w:t>create_invoice</w:t>
             </w:r>
+            <w:proofErr w:type="spellEnd"/>
           </w:p>
         </w:tc>
         <w:tc>
@@ -1113,9 +1414,11 @@
             <w:tcW w:w="1560" w:type="dxa"/>
           </w:tcPr>
           <w:p>
+            <w:proofErr w:type="spellStart"/>
             <w:r>
               <w:t>partner_commission_access</w:t>
             </w:r>
+            <w:proofErr w:type="spellEnd"/>
           </w:p>
         </w:tc>
         <w:tc>
@@ -1188,9 +1491,11 @@
             <w:tcW w:w="1560" w:type="dxa"/>
           </w:tcPr>
           <w:p>
+            <w:proofErr w:type="spellStart"/>
             <w:r>
               <w:t>view_ai_review_queue</w:t>
             </w:r>
+            <w:proofErr w:type="spellEnd"/>
           </w:p>
         </w:tc>
         <w:tc>
@@ -1256,7 +1561,23 @@
     </w:tbl>
     <w:p>
       <w:r>
-        <w:t>* Staff/Viewer may receive partner_commission_access when org flag partner_commission_for_staff_viewer is enabled.</w:t>
+        <w:t xml:space="preserve">* Staff/Viewer may receive </w:t>
+      </w:r>
+      <w:proofErr w:type="spellStart"/>
+      <w:r>
+        <w:t>partner_commission_access</w:t>
+      </w:r>
+      <w:proofErr w:type="spellEnd"/>
+      <w:r>
+        <w:t xml:space="preserve"> when org flag </w:t>
+      </w:r>
+      <w:proofErr w:type="spellStart"/>
+      <w:r>
+        <w:t>partner_commission_for_staff_viewer</w:t>
+      </w:r>
+      <w:proofErr w:type="spellEnd"/>
+      <w:r>
+        <w:t xml:space="preserve"> is enabled.</w:t>
       </w:r>
     </w:p>
     <w:p>
@@ -1268,23 +1589,71 @@
       </w:r>
     </w:p>
     <w:p>
-      <w:r>
-        <w:t>manage_employees maps to invite_user (Owner, Admin).</w:t>
-      </w:r>
-    </w:p>
-    <w:p>
-      <w:r>
-        <w:t>manage_settings maps to manage_org_settings (Owner, Admin).</w:t>
-      </w:r>
-    </w:p>
-    <w:p>
-      <w:r>
-        <w:t>manage_roles maps to change_role (Owner only).</w:t>
-      </w:r>
-    </w:p>
-    <w:p>
-      <w:r>
-        <w:t>Aliases are normalized on every permission check and exposed in frontend permission_matrix for sidebar and Team page.</w:t>
+      <w:proofErr w:type="spellStart"/>
+      <w:r>
+        <w:t>manage_employees</w:t>
+      </w:r>
+      <w:proofErr w:type="spellEnd"/>
+      <w:r>
+        <w:t xml:space="preserve"> maps to </w:t>
+      </w:r>
+      <w:proofErr w:type="spellStart"/>
+      <w:r>
+        <w:t>invite_user</w:t>
+      </w:r>
+      <w:proofErr w:type="spellEnd"/>
+      <w:r>
+        <w:t xml:space="preserve"> (Owner, Admin).</w:t>
+      </w:r>
+    </w:p>
+    <w:p>
+      <w:proofErr w:type="spellStart"/>
+      <w:r>
+        <w:t>manage_settings</w:t>
+      </w:r>
+      <w:proofErr w:type="spellEnd"/>
+      <w:r>
+        <w:t xml:space="preserve"> maps to </w:t>
+      </w:r>
+      <w:proofErr w:type="spellStart"/>
+      <w:r>
+        <w:t>manage_org_settings</w:t>
+      </w:r>
+      <w:proofErr w:type="spellEnd"/>
+      <w:r>
+        <w:t xml:space="preserve"> (Owner, Admin).</w:t>
+      </w:r>
+    </w:p>
+    <w:p>
+      <w:proofErr w:type="spellStart"/>
+      <w:r>
+        <w:lastRenderedPageBreak/>
+        <w:t>manage_roles</w:t>
+      </w:r>
+      <w:proofErr w:type="spellEnd"/>
+      <w:r>
+        <w:t xml:space="preserve"> maps to </w:t>
+      </w:r>
+      <w:proofErr w:type="spellStart"/>
+      <w:r>
+        <w:t>change_role</w:t>
+      </w:r>
+      <w:proofErr w:type="spellEnd"/>
+      <w:r>
+        <w:t xml:space="preserve"> (Owner only).</w:t>
+      </w:r>
+    </w:p>
+    <w:p>
+      <w:r>
+        <w:t xml:space="preserve">Aliases are normalized on every permission check and exposed in frontend </w:t>
+      </w:r>
+      <w:proofErr w:type="spellStart"/>
+      <w:r>
+        <w:t>permission_matrix</w:t>
+      </w:r>
+      <w:proofErr w:type="spellEnd"/>
+      <w:r>
+        <w:t xml:space="preserve"> for sidebar and Team page.</w:t>
       </w:r>
     </w:p>
     <w:p>
@@ -1297,12 +1666,89 @@
     </w:p>
     <w:p>
       <w:r>
-        <w:t>JWT claims: user_id, email, org_id, role, subdomain, is_partner, exp/iat.</w:t>
-      </w:r>
-    </w:p>
-    <w:p>
-      <w:r>
-        <w:t>Role is read from user_org (with organizations.owner_id fallback) at login and refresh. orabooks_assert_tenant_access blocks JWT org_id mismatch. Refresh token rotation re-reads role from database. Role change revokes all refresh tokens for user in org forcing re-authentication.</w:t>
+        <w:t xml:space="preserve">JWT claims: </w:t>
+      </w:r>
+      <w:proofErr w:type="spellStart"/>
+      <w:r>
+        <w:t>user_id</w:t>
+      </w:r>
+      <w:proofErr w:type="spellEnd"/>
+      <w:r>
+        <w:t xml:space="preserve">, email, </w:t>
+      </w:r>
+      <w:proofErr w:type="spellStart"/>
+      <w:r>
+        <w:t>org_id</w:t>
+      </w:r>
+      <w:proofErr w:type="spellEnd"/>
+      <w:r>
+        <w:t xml:space="preserve">, role, subdomain, </w:t>
+      </w:r>
+      <w:proofErr w:type="spellStart"/>
+      <w:r>
+        <w:t>is_partner</w:t>
+      </w:r>
+      <w:proofErr w:type="spellEnd"/>
+      <w:r>
+        <w:t>, exp/</w:t>
+      </w:r>
+      <w:proofErr w:type="spellStart"/>
+      <w:r>
+        <w:t>iat</w:t>
+      </w:r>
+      <w:proofErr w:type="spellEnd"/>
+      <w:r>
+        <w:t>.</w:t>
+      </w:r>
+    </w:p>
+    <w:p>
+      <w:r>
+        <w:t xml:space="preserve">Role is read from </w:t>
+      </w:r>
+      <w:proofErr w:type="spellStart"/>
+      <w:r>
+        <w:t>user_org</w:t>
+      </w:r>
+      <w:proofErr w:type="spellEnd"/>
+      <w:r>
+        <w:t xml:space="preserve"> (with </w:t>
+      </w:r>
+      <w:proofErr w:type="spellStart"/>
+      <w:proofErr w:type="gramStart"/>
+      <w:r>
+        <w:t>organizations.owner</w:t>
+      </w:r>
+      <w:proofErr w:type="gramEnd"/>
+      <w:r>
+        <w:t>_id</w:t>
+      </w:r>
+      <w:proofErr w:type="spellEnd"/>
+      <w:r>
+        <w:t xml:space="preserve"> fallback) at login and refresh. </w:t>
+      </w:r>
+      <w:proofErr w:type="spellStart"/>
+      <w:r>
+        <w:t>orabooks_assert_tenant_access</w:t>
+      </w:r>
+      <w:proofErr w:type="spellEnd"/>
+      <w:r>
+        <w:t xml:space="preserve"> blocks JWT </w:t>
+      </w:r>
+      <w:proofErr w:type="spellStart"/>
+      <w:r>
+        <w:t>org_id</w:t>
+      </w:r>
+      <w:proofErr w:type="spellEnd"/>
+      <w:r>
+        <w:t xml:space="preserve"> mismatch. Refresh token rotation re-</w:t>
+      </w:r>
+      <w:proofErr w:type="gramStart"/>
+      <w:r>
+        <w:t>reads</w:t>
+      </w:r>
+      <w:proofErr w:type="gramEnd"/>
+      <w:r>
+        <w:t xml:space="preserve"> role from database. Role change revokes all refresh tokens for user in org forcing re-authentication.</w:t>
       </w:r>
     </w:p>
     <w:p>
@@ -1315,12 +1761,132 @@
     </w:p>
     <w:p>
       <w:r>
-        <w:t>Table: wp_orabooks_permission_audit_log with org_id, user_id, event_type permission_denied, permission, role, reason, ip_address, user_agent, metadata JSON, created_at.</w:t>
-      </w:r>
-    </w:p>
-    <w:p>
-      <w:r>
-        <w:t>Reason codes: missing_context, cross_tenant, missing_org, inactive_org, missing_role, partner_accounting_blocked, permission_denied.</w:t>
+        <w:t xml:space="preserve">Table: </w:t>
+      </w:r>
+      <w:proofErr w:type="spellStart"/>
+      <w:r>
+        <w:t>wp_orabooks_permission_audit_log</w:t>
+      </w:r>
+      <w:proofErr w:type="spellEnd"/>
+      <w:r>
+        <w:t xml:space="preserve"> with </w:t>
+      </w:r>
+      <w:proofErr w:type="spellStart"/>
+      <w:r>
+        <w:t>org_id</w:t>
+      </w:r>
+      <w:proofErr w:type="spellEnd"/>
+      <w:r>
+        <w:t xml:space="preserve">, </w:t>
+      </w:r>
+      <w:proofErr w:type="spellStart"/>
+      <w:r>
+        <w:t>user_id</w:t>
+      </w:r>
+      <w:proofErr w:type="spellEnd"/>
+      <w:r>
+        <w:t xml:space="preserve">, </w:t>
+      </w:r>
+      <w:proofErr w:type="spellStart"/>
+      <w:r>
+        <w:t>event_type</w:t>
+      </w:r>
+      <w:proofErr w:type="spellEnd"/>
+      <w:r>
+        <w:t xml:space="preserve"> </w:t>
+      </w:r>
+      <w:proofErr w:type="spellStart"/>
+      <w:r>
+        <w:t>permission_denied</w:t>
+      </w:r>
+      <w:proofErr w:type="spellEnd"/>
+      <w:r>
+        <w:t xml:space="preserve">, permission, role, reason, </w:t>
+      </w:r>
+      <w:proofErr w:type="spellStart"/>
+      <w:r>
+        <w:t>ip_address</w:t>
+      </w:r>
+      <w:proofErr w:type="spellEnd"/>
+      <w:r>
+        <w:t xml:space="preserve">, </w:t>
+      </w:r>
+      <w:proofErr w:type="spellStart"/>
+      <w:r>
+        <w:t>user_agent</w:t>
+      </w:r>
+      <w:proofErr w:type="spellEnd"/>
+      <w:r>
+        <w:t xml:space="preserve">, metadata JSON, </w:t>
+      </w:r>
+      <w:proofErr w:type="spellStart"/>
+      <w:r>
+        <w:t>created_at</w:t>
+      </w:r>
+      <w:proofErr w:type="spellEnd"/>
+      <w:r>
+        <w:t>.</w:t>
+      </w:r>
+    </w:p>
+    <w:p>
+      <w:r>
+        <w:t xml:space="preserve">Reason codes: </w:t>
+      </w:r>
+      <w:proofErr w:type="spellStart"/>
+      <w:r>
+        <w:t>missing_context</w:t>
+      </w:r>
+      <w:proofErr w:type="spellEnd"/>
+      <w:r>
+        <w:t xml:space="preserve">, </w:t>
+      </w:r>
+      <w:proofErr w:type="spellStart"/>
+      <w:r>
+        <w:t>cross_tenant</w:t>
+      </w:r>
+      <w:proofErr w:type="spellEnd"/>
+      <w:r>
+        <w:t xml:space="preserve">, </w:t>
+      </w:r>
+      <w:proofErr w:type="spellStart"/>
+      <w:r>
+        <w:t>missing_org</w:t>
+      </w:r>
+      <w:proofErr w:type="spellEnd"/>
+      <w:r>
+        <w:t xml:space="preserve">, </w:t>
+      </w:r>
+      <w:proofErr w:type="spellStart"/>
+      <w:r>
+        <w:t>inactive_org</w:t>
+      </w:r>
+      <w:proofErr w:type="spellEnd"/>
+      <w:r>
+        <w:t xml:space="preserve">, </w:t>
+      </w:r>
+      <w:proofErr w:type="spellStart"/>
+      <w:r>
+        <w:t>missing_role</w:t>
+      </w:r>
+      <w:proofErr w:type="spellEnd"/>
+      <w:r>
+        <w:t xml:space="preserve">, </w:t>
+      </w:r>
+      <w:proofErr w:type="spellStart"/>
+      <w:r>
+        <w:t>partner_accounting_blocked</w:t>
+      </w:r>
+      <w:proofErr w:type="spellEnd"/>
+      <w:r>
+        <w:t xml:space="preserve">, </w:t>
+      </w:r>
+      <w:proofErr w:type="spellStart"/>
+      <w:r>
+        <w:t>permission_denied</w:t>
+      </w:r>
+      <w:proofErr w:type="spellEnd"/>
+      <w:r>
+        <w:t>.</w:t>
       </w:r>
     </w:p>
     <w:p>
@@ -1337,8 +1903,108 @@
       </w:r>
     </w:p>
     <w:p>
-      <w:r>
-        <w:t>OraBooks_Team::update_role() and remove_user() call OraBooks_Auth::revoke_user_tokens(). OBN_Access_Control::log_role_change() records SL-003 audit trail. User must log in again to receive JWT with updated role.</w:t>
+      <w:proofErr w:type="spellStart"/>
+      <w:r>
+        <w:t>OraBooks_</w:t>
+      </w:r>
+      <w:proofErr w:type="gramStart"/>
+      <w:r>
+        <w:t>Team</w:t>
+      </w:r>
+      <w:proofErr w:type="spellEnd"/>
+      <w:r>
+        <w:t>::</w:t>
+      </w:r>
+      <w:proofErr w:type="spellStart"/>
+      <w:proofErr w:type="gramEnd"/>
+      <w:r>
+        <w:t>update_</w:t>
+      </w:r>
+      <w:proofErr w:type="gramStart"/>
+      <w:r>
+        <w:t>role</w:t>
+      </w:r>
+      <w:proofErr w:type="spellEnd"/>
+      <w:r>
+        <w:t>(</w:t>
+      </w:r>
+      <w:proofErr w:type="gramEnd"/>
+      <w:r>
+        <w:t xml:space="preserve">) and </w:t>
+      </w:r>
+      <w:proofErr w:type="spellStart"/>
+      <w:r>
+        <w:t>remove_</w:t>
+      </w:r>
+      <w:proofErr w:type="gramStart"/>
+      <w:r>
+        <w:t>user</w:t>
+      </w:r>
+      <w:proofErr w:type="spellEnd"/>
+      <w:r>
+        <w:t>(</w:t>
+      </w:r>
+      <w:proofErr w:type="gramEnd"/>
+      <w:r>
+        <w:t xml:space="preserve">) call </w:t>
+      </w:r>
+      <w:proofErr w:type="spellStart"/>
+      <w:r>
+        <w:t>OraBooks_</w:t>
+      </w:r>
+      <w:proofErr w:type="gramStart"/>
+      <w:r>
+        <w:t>Auth</w:t>
+      </w:r>
+      <w:proofErr w:type="spellEnd"/>
+      <w:r>
+        <w:t>::</w:t>
+      </w:r>
+      <w:proofErr w:type="spellStart"/>
+      <w:proofErr w:type="gramEnd"/>
+      <w:r>
+        <w:t>revoke_user_</w:t>
+      </w:r>
+      <w:proofErr w:type="gramStart"/>
+      <w:r>
+        <w:t>tokens</w:t>
+      </w:r>
+      <w:proofErr w:type="spellEnd"/>
+      <w:r>
+        <w:t>(</w:t>
+      </w:r>
+      <w:proofErr w:type="gramEnd"/>
+      <w:r>
+        <w:t xml:space="preserve">). </w:t>
+      </w:r>
+      <w:proofErr w:type="spellStart"/>
+      <w:r>
+        <w:t>OBN_Access_</w:t>
+      </w:r>
+      <w:proofErr w:type="gramStart"/>
+      <w:r>
+        <w:t>Control</w:t>
+      </w:r>
+      <w:proofErr w:type="spellEnd"/>
+      <w:r>
+        <w:t>::</w:t>
+      </w:r>
+      <w:proofErr w:type="spellStart"/>
+      <w:proofErr w:type="gramEnd"/>
+      <w:r>
+        <w:t>log_role_</w:t>
+      </w:r>
+      <w:proofErr w:type="gramStart"/>
+      <w:r>
+        <w:t>change</w:t>
+      </w:r>
+      <w:proofErr w:type="spellEnd"/>
+      <w:r>
+        <w:t>(</w:t>
+      </w:r>
+      <w:proofErr w:type="gramEnd"/>
+      <w:r>
+        <w:t>) records SL-003 audit trail. User must log in again to receive JWT with updated role.</w:t>
       </w:r>
     </w:p>
     <w:p>
@@ -1351,12 +2017,79 @@
     </w:p>
     <w:p>
       <w:r>
-        <w:t>Partner orgs (organization_type = partner) cannot access accounting permissions even for owner role. OBN_Access_Control blocks view_reports, submit_transaction, approve_journal, COA, invoices, expenses, inventory, exports, and related permissions.</w:t>
-      </w:r>
-    </w:p>
-    <w:p>
-      <w:r>
-        <w:t>partner_commission_access: default Owner and Admin. Staff/Viewer allowed when organizations.partner_commission_for_staff_viewer = 1 or global option orabooks_partner_commission_for_staff_viewer is enabled (ABAC). Partner nav shows Commissions/Onboarding only.</w:t>
+        <w:t>Partner orgs (</w:t>
+      </w:r>
+      <w:proofErr w:type="spellStart"/>
+      <w:r>
+        <w:t>organization_type</w:t>
+      </w:r>
+      <w:proofErr w:type="spellEnd"/>
+      <w:r>
+        <w:t xml:space="preserve"> = partner) cannot access accounting permissions even for owner role. </w:t>
+      </w:r>
+      <w:proofErr w:type="spellStart"/>
+      <w:r>
+        <w:t>OBN_Access_Control</w:t>
+      </w:r>
+      <w:proofErr w:type="spellEnd"/>
+      <w:r>
+        <w:t xml:space="preserve"> blocks </w:t>
+      </w:r>
+      <w:proofErr w:type="spellStart"/>
+      <w:r>
+        <w:t>view_reports</w:t>
+      </w:r>
+      <w:proofErr w:type="spellEnd"/>
+      <w:r>
+        <w:t xml:space="preserve">, </w:t>
+      </w:r>
+      <w:proofErr w:type="spellStart"/>
+      <w:r>
+        <w:t>submit_transaction</w:t>
+      </w:r>
+      <w:proofErr w:type="spellEnd"/>
+      <w:r>
+        <w:t xml:space="preserve">, </w:t>
+      </w:r>
+      <w:proofErr w:type="spellStart"/>
+      <w:r>
+        <w:t>approve_journal</w:t>
+      </w:r>
+      <w:proofErr w:type="spellEnd"/>
+      <w:r>
+        <w:t>, COA, invoices, expenses, inventory, exports, and related permissions.</w:t>
+      </w:r>
+    </w:p>
+    <w:p>
+      <w:proofErr w:type="spellStart"/>
+      <w:r>
+        <w:t>partner_commission_access</w:t>
+      </w:r>
+      <w:proofErr w:type="spellEnd"/>
+      <w:r>
+        <w:t xml:space="preserve">: default Owner and Admin. Staff/Viewer allowed when </w:t>
+      </w:r>
+      <w:proofErr w:type="spellStart"/>
+      <w:proofErr w:type="gramStart"/>
+      <w:r>
+        <w:t>organizations.partner</w:t>
+      </w:r>
+      <w:proofErr w:type="gramEnd"/>
+      <w:r>
+        <w:t>_commission_for_staff_viewer</w:t>
+      </w:r>
+      <w:proofErr w:type="spellEnd"/>
+      <w:r>
+        <w:t xml:space="preserve"> = 1 or global option </w:t>
+      </w:r>
+      <w:proofErr w:type="spellStart"/>
+      <w:r>
+        <w:lastRenderedPageBreak/>
+        <w:t>orabooks_partner_commission_for_staff_viewer</w:t>
+      </w:r>
+      <w:proofErr w:type="spellEnd"/>
+      <w:r>
+        <w:t xml:space="preserve"> is enabled (ABAC). Partner nav shows Commissions/Onboarding only.</w:t>
       </w:r>
     </w:p>
     <w:p>
@@ -1369,12 +2102,60 @@
     </w:p>
     <w:p>
       <w:r>
-        <w:t>Role badge: ClientShell sidebar shows Role: Owner/Staff/etc from frontendContext API.</w:t>
-      </w:r>
-    </w:p>
-    <w:p>
-      <w:r>
-        <w:t>Sidebar filtering: customerNav and partnerNav items tagged with permission; filterNavByPermissions hides unauthorized menu items.</w:t>
+        <w:t xml:space="preserve">Role badge: </w:t>
+      </w:r>
+      <w:proofErr w:type="spellStart"/>
+      <w:r>
+        <w:t>ClientShell</w:t>
+      </w:r>
+      <w:proofErr w:type="spellEnd"/>
+      <w:r>
+        <w:t xml:space="preserve"> sidebar shows Role: Owner/Staff/</w:t>
+      </w:r>
+      <w:proofErr w:type="spellStart"/>
+      <w:r>
+        <w:t>etc</w:t>
+      </w:r>
+      <w:proofErr w:type="spellEnd"/>
+      <w:r>
+        <w:t xml:space="preserve"> from </w:t>
+      </w:r>
+      <w:proofErr w:type="spellStart"/>
+      <w:r>
+        <w:t>frontendContext</w:t>
+      </w:r>
+      <w:proofErr w:type="spellEnd"/>
+      <w:r>
+        <w:t xml:space="preserve"> API.</w:t>
+      </w:r>
+    </w:p>
+    <w:p>
+      <w:r>
+        <w:t xml:space="preserve">Sidebar filtering: </w:t>
+      </w:r>
+      <w:proofErr w:type="spellStart"/>
+      <w:r>
+        <w:t>customerNav</w:t>
+      </w:r>
+      <w:proofErr w:type="spellEnd"/>
+      <w:r>
+        <w:t xml:space="preserve"> and </w:t>
+      </w:r>
+      <w:proofErr w:type="spellStart"/>
+      <w:r>
+        <w:t>partnerNav</w:t>
+      </w:r>
+      <w:proofErr w:type="spellEnd"/>
+      <w:r>
+        <w:t xml:space="preserve"> items tagged with permission; </w:t>
+      </w:r>
+      <w:proofErr w:type="spellStart"/>
+      <w:r>
+        <w:t>filterNavByPermissions</w:t>
+      </w:r>
+      <w:proofErr w:type="spellEnd"/>
+      <w:r>
+        <w:t xml:space="preserve"> hides unauthorized menu items.</w:t>
       </w:r>
     </w:p>
     <w:p>
@@ -1402,7 +2183,39 @@
     </w:p>
     <w:p>
       <w:r>
-        <w:t>Solution: Pending invite detected by email. Tier selection skipped. Login/2FA/OIDC auto-accepts invite via accept_pending_invite_for_user(). user_org row with invited role; users.org_id and JWT set to employer org; redirect to /team/ on employer subdomain. Tier selection API returns 403 while invite pending. Register page shows team invitation banner.</w:t>
+        <w:t xml:space="preserve">Solution: Pending invite detected by email. Tier selection skipped. Login/2FA/OIDC auto-accepts invite via </w:t>
+      </w:r>
+      <w:proofErr w:type="spellStart"/>
+      <w:r>
+        <w:t>accept_pending_invite_for_</w:t>
+      </w:r>
+      <w:proofErr w:type="gramStart"/>
+      <w:r>
+        <w:t>user</w:t>
+      </w:r>
+      <w:proofErr w:type="spellEnd"/>
+      <w:r>
+        <w:t>(</w:t>
+      </w:r>
+      <w:proofErr w:type="gramEnd"/>
+      <w:r>
+        <w:t xml:space="preserve">). </w:t>
+      </w:r>
+      <w:proofErr w:type="spellStart"/>
+      <w:r>
+        <w:t>user_org</w:t>
+      </w:r>
+      <w:proofErr w:type="spellEnd"/>
+      <w:r>
+        <w:t xml:space="preserve"> row with invited role; </w:t>
+      </w:r>
+      <w:proofErr w:type="spellStart"/>
+      <w:r>
+        <w:t>users.org_id</w:t>
+      </w:r>
+      <w:proofErr w:type="spellEnd"/>
+      <w:r>
+        <w:t xml:space="preserve"> and JWT set to employer org; redirect to /team/ on employer subdomain. Tier selection API returns 403 while invite pending. Register page shows team invitation banner.</w:t>
       </w:r>
     </w:p>
     <w:p>
@@ -1420,17 +2233,209 @@
     </w:p>
     <w:p>
       <w:r>
-        <w:t>Backend: class-orabooks-rbac.php, class-obn-access-control.php, class-orabooks-team.php, class-orabooks-auth.php, class-orabooks-ajax.php, class-orabooks-two-factor.php, helpers.php, class-orabooks-database.php (permission_audit_log schema).</w:t>
-      </w:r>
-    </w:p>
-    <w:p>
-      <w:r>
-        <w:t>Frontend: orabooks-ui/src/pages/frontend/components/ClientShell.tsx, pages/TeamPage.tsx, RegisterPage.tsx, TierSelectionPage.tsx, lib/auth-routing.ts.</w:t>
-      </w:r>
-    </w:p>
-    <w:p>
-      <w:r>
-        <w:t>Tests: tests/OraBooks_RBAC_Test.php (9 tests, 28 assertions).</w:t>
+        <w:t>Backend: class-</w:t>
+      </w:r>
+      <w:proofErr w:type="spellStart"/>
+      <w:r>
+        <w:t>orabooks</w:t>
+      </w:r>
+      <w:proofErr w:type="spellEnd"/>
+      <w:r>
+        <w:t>-</w:t>
+      </w:r>
+      <w:proofErr w:type="spellStart"/>
+      <w:r>
+        <w:t>rbac.php</w:t>
+      </w:r>
+      <w:proofErr w:type="spellEnd"/>
+      <w:r>
+        <w:t>, class-</w:t>
+      </w:r>
+      <w:proofErr w:type="spellStart"/>
+      <w:r>
+        <w:t>obn</w:t>
+      </w:r>
+      <w:proofErr w:type="spellEnd"/>
+      <w:r>
+        <w:t>-access-</w:t>
+      </w:r>
+      <w:proofErr w:type="spellStart"/>
+      <w:r>
+        <w:t>control.php</w:t>
+      </w:r>
+      <w:proofErr w:type="spellEnd"/>
+      <w:r>
+        <w:t>, class-</w:t>
+      </w:r>
+      <w:proofErr w:type="spellStart"/>
+      <w:r>
+        <w:t>orabooks</w:t>
+      </w:r>
+      <w:proofErr w:type="spellEnd"/>
+      <w:r>
+        <w:t>-</w:t>
+      </w:r>
+      <w:proofErr w:type="spellStart"/>
+      <w:r>
+        <w:t>team.php</w:t>
+      </w:r>
+      <w:proofErr w:type="spellEnd"/>
+      <w:r>
+        <w:t>, class-</w:t>
+      </w:r>
+      <w:proofErr w:type="spellStart"/>
+      <w:r>
+        <w:t>orabooks</w:t>
+      </w:r>
+      <w:proofErr w:type="spellEnd"/>
+      <w:r>
+        <w:t>-</w:t>
+      </w:r>
+      <w:proofErr w:type="spellStart"/>
+      <w:r>
+        <w:t>auth.php</w:t>
+      </w:r>
+      <w:proofErr w:type="spellEnd"/>
+      <w:r>
+        <w:t>, class-</w:t>
+      </w:r>
+      <w:proofErr w:type="spellStart"/>
+      <w:r>
+        <w:t>orabooks</w:t>
+      </w:r>
+      <w:proofErr w:type="spellEnd"/>
+      <w:r>
+        <w:t>-</w:t>
+      </w:r>
+      <w:proofErr w:type="spellStart"/>
+      <w:r>
+        <w:t>ajax.php</w:t>
+      </w:r>
+      <w:proofErr w:type="spellEnd"/>
+      <w:r>
+        <w:t>, class-</w:t>
+      </w:r>
+      <w:proofErr w:type="spellStart"/>
+      <w:r>
+        <w:t>orabooks</w:t>
+      </w:r>
+      <w:proofErr w:type="spellEnd"/>
+      <w:r>
+        <w:t>-two-</w:t>
+      </w:r>
+      <w:proofErr w:type="spellStart"/>
+      <w:r>
+        <w:t>factor.php</w:t>
+      </w:r>
+      <w:proofErr w:type="spellEnd"/>
+      <w:r>
+        <w:t xml:space="preserve">, </w:t>
+      </w:r>
+      <w:proofErr w:type="spellStart"/>
+      <w:r>
+        <w:t>helpers.php</w:t>
+      </w:r>
+      <w:proofErr w:type="spellEnd"/>
+      <w:r>
+        <w:t>, class-</w:t>
+      </w:r>
+      <w:proofErr w:type="spellStart"/>
+      <w:r>
+        <w:t>orabooks</w:t>
+      </w:r>
+      <w:proofErr w:type="spellEnd"/>
+      <w:r>
+        <w:t>-</w:t>
+      </w:r>
+      <w:proofErr w:type="spellStart"/>
+      <w:r>
+        <w:t>database.php</w:t>
+      </w:r>
+      <w:proofErr w:type="spellEnd"/>
+      <w:r>
+        <w:t xml:space="preserve"> (</w:t>
+      </w:r>
+      <w:proofErr w:type="spellStart"/>
+      <w:r>
+        <w:t>permission_audit_log</w:t>
+      </w:r>
+      <w:proofErr w:type="spellEnd"/>
+      <w:r>
+        <w:t xml:space="preserve"> schema).</w:t>
+      </w:r>
+    </w:p>
+    <w:p>
+      <w:r>
+        <w:t xml:space="preserve">Frontend: </w:t>
+      </w:r>
+      <w:proofErr w:type="spellStart"/>
+      <w:r>
+        <w:t>orabooks-ui</w:t>
+      </w:r>
+      <w:proofErr w:type="spellEnd"/>
+      <w:r>
+        <w:t>/</w:t>
+      </w:r>
+      <w:proofErr w:type="spellStart"/>
+      <w:r>
+        <w:t>src</w:t>
+      </w:r>
+      <w:proofErr w:type="spellEnd"/>
+      <w:r>
+        <w:t>/pages/frontend/components/</w:t>
+      </w:r>
+      <w:proofErr w:type="spellStart"/>
+      <w:r>
+        <w:t>ClientShell.tsx</w:t>
+      </w:r>
+      <w:proofErr w:type="spellEnd"/>
+      <w:r>
+        <w:t>, pages/</w:t>
+      </w:r>
+      <w:proofErr w:type="spellStart"/>
+      <w:r>
+        <w:t>TeamPage.tsx</w:t>
+      </w:r>
+      <w:proofErr w:type="spellEnd"/>
+      <w:r>
+        <w:t xml:space="preserve">, </w:t>
+      </w:r>
+      <w:proofErr w:type="spellStart"/>
+      <w:r>
+        <w:t>RegisterPage.tsx</w:t>
+      </w:r>
+      <w:proofErr w:type="spellEnd"/>
+      <w:r>
+        <w:t xml:space="preserve">, </w:t>
+      </w:r>
+      <w:proofErr w:type="spellStart"/>
+      <w:r>
+        <w:t>TierSelectionPage.tsx</w:t>
+      </w:r>
+      <w:proofErr w:type="spellEnd"/>
+      <w:r>
+        <w:t>, lib/auth-</w:t>
+      </w:r>
+      <w:proofErr w:type="spellStart"/>
+      <w:r>
+        <w:t>routing.ts</w:t>
+      </w:r>
+      <w:proofErr w:type="spellEnd"/>
+      <w:r>
+        <w:t>.</w:t>
+      </w:r>
+    </w:p>
+    <w:p>
+      <w:r>
+        <w:t>Tests: tests/</w:t>
+      </w:r>
+      <w:proofErr w:type="spellStart"/>
+      <w:r>
+        <w:t>OraBooks_RBAC_Test.php</w:t>
+      </w:r>
+      <w:proofErr w:type="spellEnd"/>
+      <w:r>
+        <w:t xml:space="preserve"> (9 tests, 28 assertions).</w:t>
       </w:r>
     </w:p>
     <w:p>
@@ -1438,17 +2443,55 @@
         <w:pStyle w:val="Heading1"/>
       </w:pPr>
       <w:r>
-        <w:t>12. PHPUnit Verification</w:t>
-      </w:r>
-    </w:p>
-    <w:p>
-      <w:r>
-        <w:t>Command: cd "OraBooks Lean MVP/tests" &amp;&amp; vendor/bin/phpunit --configuration phpunit.xml OraBooks_RBAC_Test.php</w:t>
-      </w:r>
-    </w:p>
-    <w:p>
-      <w:r>
-        <w:t>Covers: five roles, deny-by-default, permission aliases, partner commission ABAC, partner accounting block, permission_audit_log row, refresh token revoke on role change, effective permissions, invite AJAX JSON, invite-first role assignment.</w:t>
+        <w:lastRenderedPageBreak/>
+        <w:t xml:space="preserve">12. </w:t>
+      </w:r>
+      <w:proofErr w:type="spellStart"/>
+      <w:r>
+        <w:t>PHPUnit</w:t>
+      </w:r>
+      <w:proofErr w:type="spellEnd"/>
+      <w:r>
+        <w:t xml:space="preserve"> Verification</w:t>
+      </w:r>
+    </w:p>
+    <w:p>
+      <w:r>
+        <w:t>Command: cd "</w:t>
+      </w:r>
+      <w:proofErr w:type="spellStart"/>
+      <w:r>
+        <w:t>OraBooks</w:t>
+      </w:r>
+      <w:proofErr w:type="spellEnd"/>
+      <w:r>
+        <w:t xml:space="preserve"> Lean MVP/tests" &amp;&amp; vendor/bin/</w:t>
+      </w:r>
+      <w:proofErr w:type="spellStart"/>
+      <w:r>
+        <w:t>phpunit</w:t>
+      </w:r>
+      <w:proofErr w:type="spellEnd"/>
+      <w:r>
+        <w:t xml:space="preserve"> --configuration phpunit.xml </w:t>
+      </w:r>
+      <w:proofErr w:type="spellStart"/>
+      <w:r>
+        <w:t>OraBooks_RBAC_Test.php</w:t>
+      </w:r>
+      <w:proofErr w:type="spellEnd"/>
+    </w:p>
+    <w:p>
+      <w:r>
+        <w:t xml:space="preserve">Covers: five roles, deny-by-default, permission aliases, partner commission ABAC, partner accounting block, </w:t>
+      </w:r>
+      <w:proofErr w:type="spellStart"/>
+      <w:r>
+        <w:t>permission_audit_log</w:t>
+      </w:r>
+      <w:proofErr w:type="spellEnd"/>
+      <w:r>
+        <w:t xml:space="preserve"> row, refresh token revoke on role change, effective permissions, invite AJAX JSON, invite-first role assignment.</w:t>
       </w:r>
     </w:p>
     <w:p>
@@ -1461,7 +2504,15 @@
     </w:p>
     <w:p>
       <w:r>
-        <w:t>A. Owner login: badge Role Owner; full sidebar; Team invite works; Roles matrix visible.</w:t>
+        <w:t xml:space="preserve">A. Owner login: badge Role Owner; full sidebar; Team invite works; </w:t>
+      </w:r>
+      <w:proofErr w:type="gramStart"/>
+      <w:r>
+        <w:t>Roles</w:t>
+      </w:r>
+      <w:proofErr w:type="gramEnd"/>
+      <w:r>
+        <w:t xml:space="preserve"> matrix visible.</w:t>
       </w:r>
     </w:p>
     <w:p>
@@ -1486,7 +2537,15 @@
     </w:p>
     <w:p>
       <w:r>
-        <w:t>F. Permission denied: staff hits owner-only API; 403 and permission_denied audit row created.</w:t>
+        <w:t xml:space="preserve">F. Permission denied: staff hits owner-only API; 403 and </w:t>
+      </w:r>
+      <w:proofErr w:type="spellStart"/>
+      <w:r>
+        <w:t>permission_denied</w:t>
+      </w:r>
+      <w:proofErr w:type="spellEnd"/>
+      <w:r>
+        <w:t xml:space="preserve"> audit row created.</w:t>
       </w:r>
     </w:p>
     <w:p>
@@ -1499,22 +2558,62 @@
     </w:p>
     <w:p>
       <w:r>
-        <w:t>[Done] user_org role ENUM NOT NULL with five roles.</w:t>
-      </w:r>
-    </w:p>
-    <w:p>
-      <w:r>
-        <w:t>[Done] JWT role and org_id claims at login/refresh.</w:t>
-      </w:r>
-    </w:p>
-    <w:p>
-      <w:r>
-        <w:t>[Done] requirePermission middleware via OBN_Access_Control; deny-by-default.</w:t>
-      </w:r>
-    </w:p>
-    <w:p>
-      <w:r>
-        <w:t>[Done] API endpoints guarded with require_permission.</w:t>
+        <w:t xml:space="preserve">[Done] </w:t>
+      </w:r>
+      <w:proofErr w:type="spellStart"/>
+      <w:r>
+        <w:t>user_org</w:t>
+      </w:r>
+      <w:proofErr w:type="spellEnd"/>
+      <w:r>
+        <w:t xml:space="preserve"> role ENUM NOT NULL with five roles.</w:t>
+      </w:r>
+    </w:p>
+    <w:p>
+      <w:r>
+        <w:t xml:space="preserve">[Done] JWT role and </w:t>
+      </w:r>
+      <w:proofErr w:type="spellStart"/>
+      <w:r>
+        <w:t>org_id</w:t>
+      </w:r>
+      <w:proofErr w:type="spellEnd"/>
+      <w:r>
+        <w:t xml:space="preserve"> claims at login/refresh.</w:t>
+      </w:r>
+    </w:p>
+    <w:p>
+      <w:r>
+        <w:t xml:space="preserve">[Done] </w:t>
+      </w:r>
+      <w:proofErr w:type="spellStart"/>
+      <w:r>
+        <w:t>requirePermission</w:t>
+      </w:r>
+      <w:proofErr w:type="spellEnd"/>
+      <w:r>
+        <w:t xml:space="preserve"> middleware via </w:t>
+      </w:r>
+      <w:proofErr w:type="spellStart"/>
+      <w:r>
+        <w:t>OBN_Access_Control</w:t>
+      </w:r>
+      <w:proofErr w:type="spellEnd"/>
+      <w:r>
+        <w:t>; deny-by-default.</w:t>
+      </w:r>
+    </w:p>
+    <w:p>
+      <w:r>
+        <w:t xml:space="preserve">[Done] API endpoints guarded with </w:t>
+      </w:r>
+      <w:proofErr w:type="spellStart"/>
+      <w:r>
+        <w:t>require_permission</w:t>
+      </w:r>
+      <w:proofErr w:type="spellEnd"/>
+      <w:r>
+        <w:t>.</w:t>
       </w:r>
     </w:p>
     <w:p>
@@ -1524,7 +2623,15 @@
     </w:p>
     <w:p>
       <w:r>
-        <w:t>[Done] permission_denied audit in dedicated table.</w:t>
+        <w:t xml:space="preserve">[Done] </w:t>
+      </w:r>
+      <w:proofErr w:type="spellStart"/>
+      <w:r>
+        <w:t>permission_denied</w:t>
+      </w:r>
+      <w:proofErr w:type="spellEnd"/>
+      <w:r>
+        <w:t xml:space="preserve"> audit in dedicated table.</w:t>
       </w:r>
     </w:p>
     <w:p>
@@ -1534,7 +2641,15 @@
     </w:p>
     <w:p>
       <w:r>
-        <w:t>[Done] partner_commission_for_staff_viewer org config ABAC.</w:t>
+        <w:t xml:space="preserve">[Done] </w:t>
+      </w:r>
+      <w:proofErr w:type="spellStart"/>
+      <w:r>
+        <w:t>partner_commission_for_staff_viewer</w:t>
+      </w:r>
+      <w:proofErr w:type="spellEnd"/>
+      <w:r>
+        <w:t xml:space="preserve"> org config ABAC.</w:t>
       </w:r>
     </w:p>
     <w:p>
@@ -1544,12 +2659,29 @@
     </w:p>
     <w:p>
       <w:r>
-        <w:t>[Done] PHPUnit role/permission tests.</w:t>
-      </w:r>
-    </w:p>
-    <w:p>
-      <w:r>
-        <w:t>[Partial] Roles matrix UI is read-only (no custom role editing).</w:t>
+        <w:t xml:space="preserve">[Done] </w:t>
+      </w:r>
+      <w:proofErr w:type="spellStart"/>
+      <w:r>
+        <w:t>PHPUnit</w:t>
+      </w:r>
+      <w:proofErr w:type="spellEnd"/>
+      <w:r>
+        <w:t xml:space="preserve"> role/permission tests.</w:t>
+      </w:r>
+    </w:p>
+    <w:p>
+      <w:r>
+        <w:lastRenderedPageBreak/>
+        <w:t xml:space="preserve">[Partial] </w:t>
+      </w:r>
+      <w:proofErr w:type="gramStart"/>
+      <w:r>
+        <w:t>Roles</w:t>
+      </w:r>
+      <w:proofErr w:type="gramEnd"/>
+      <w:r>
+        <w:t xml:space="preserve"> matrix UI is read-only (no custom role editing).</w:t>
       </w:r>
     </w:p>
     <w:p>

</xml_diff>

<commit_message>
Auto commit: 2026-06-21 17:27:52
</commit_message>
<xml_diff>
--- a/OraBooks Lean MVP/docs/rbac work report(morshed).docx
+++ b/OraBooks Lean MVP/docs/rbac work report(morshed).docx
@@ -6,13 +6,8 @@
       <w:pPr>
         <w:pStyle w:val="Title"/>
       </w:pPr>
-      <w:proofErr w:type="spellStart"/>
-      <w:r>
-        <w:t>OraBooks</w:t>
-      </w:r>
-      <w:proofErr w:type="spellEnd"/>
-      <w:r>
-        <w:t xml:space="preserve"> Lean MVP</w:t>
+      <w:r>
+        <w:t>OraBooks Lean MVP</w:t>
       </w:r>
     </w:p>
     <w:p>
@@ -25,26 +20,13 @@
     </w:p>
     <w:p>
       <w:r>
-        <w:t xml:space="preserve">Prepared for: Morshed / </w:t>
-      </w:r>
-      <w:proofErr w:type="spellStart"/>
-      <w:r>
-        <w:t>OraBooks</w:t>
-      </w:r>
-      <w:proofErr w:type="spellEnd"/>
-      <w:r>
-        <w:t xml:space="preserve"> Project Team</w:t>
-      </w:r>
-    </w:p>
-    <w:p>
-      <w:r>
-        <w:t xml:space="preserve">Date: 21 June 2026 | Spec: SL-003 RBAC/ABAC, SL-013 Auth, SL-014 Team, SL-004 </w:t>
-      </w:r>
-      <w:proofErr w:type="gramStart"/>
-      <w:r>
-        <w:t>Multi-tenant</w:t>
-      </w:r>
-      <w:proofErr w:type="gramEnd"/>
+        <w:t>Prepared for: Morshed / OraBooks Project Team</w:t>
+      </w:r>
+    </w:p>
+    <w:p>
+      <w:r>
+        <w:t>Date: 21 June 2026 | Spec: SL-003 RBAC/ABAC, SL-013 Auth, SL-014 Team, SL-004 Multi-tenant</w:t>
+      </w:r>
     </w:p>
     <w:p>
       <w:r>
@@ -61,39 +43,7 @@
     </w:p>
     <w:p>
       <w:r>
-        <w:t xml:space="preserve">SL-003 implements org-scoped Role-Based Access Control across the </w:t>
-      </w:r>
-      <w:proofErr w:type="spellStart"/>
-      <w:r>
-        <w:t>OraBooks</w:t>
-      </w:r>
-      <w:proofErr w:type="spellEnd"/>
-      <w:r>
-        <w:t xml:space="preserve"> Lean MVP. Five fixed roles (owner, admin, approver, staff, viewer) map to a deny-by-default permission matrix. </w:t>
-      </w:r>
-      <w:proofErr w:type="spellStart"/>
-      <w:r>
-        <w:t>OBN_Access_Control</w:t>
-      </w:r>
-      <w:proofErr w:type="spellEnd"/>
-      <w:r>
-        <w:t xml:space="preserve"> is the central facade for permission checks, dedicated </w:t>
-      </w:r>
-      <w:proofErr w:type="spellStart"/>
-      <w:r>
-        <w:t>permission_denied</w:t>
-      </w:r>
-      <w:proofErr w:type="spellEnd"/>
-      <w:r>
-        <w:t xml:space="preserve"> audit logging, and UI permission matrix delivery. JWT carries </w:t>
-      </w:r>
-      <w:proofErr w:type="spellStart"/>
-      <w:r>
-        <w:t>org_id</w:t>
-      </w:r>
-      <w:proofErr w:type="spellEnd"/>
-      <w:r>
-        <w:t xml:space="preserve"> and role claims. Role changes revoke refresh tokens. Partner organizations are blocked from accounting APIs. Invited staff onboarding skips tier selection and auto-joins the employer org with the invited role.</w:t>
+        <w:t>SL-003 implements org-scoped Role-Based Access Control across the OraBooks Lean MVP. Five fixed roles (owner, admin, approver, staff, viewer) map to a deny-by-default permission matrix. OBN_Access_Control is the central facade for permission checks, dedicated permission_denied audit logging, and UI permission matrix delivery. JWT carries org_id and role claims. Role changes revoke refresh tokens. Partner organizations are blocked from accounting APIs. Invited staff onboarding skips tier selection and auto-joins the employer org with the invited role.</w:t>
       </w:r>
     </w:p>
     <w:p>
@@ -106,222 +56,12 @@
     </w:p>
     <w:p>
       <w:r>
-        <w:t xml:space="preserve">Request flow: API/AJAX handler calls </w:t>
-      </w:r>
-      <w:proofErr w:type="spellStart"/>
-      <w:r>
-        <w:t>OraBooks_</w:t>
-      </w:r>
-      <w:proofErr w:type="gramStart"/>
-      <w:r>
-        <w:t>RBAC</w:t>
-      </w:r>
-      <w:proofErr w:type="spellEnd"/>
-      <w:r>
-        <w:t>::</w:t>
-      </w:r>
-      <w:proofErr w:type="spellStart"/>
-      <w:proofErr w:type="gramEnd"/>
-      <w:r>
-        <w:t>require_</w:t>
-      </w:r>
-      <w:proofErr w:type="gramStart"/>
-      <w:r>
-        <w:t>permission</w:t>
-      </w:r>
-      <w:proofErr w:type="spellEnd"/>
-      <w:r>
-        <w:t>(</w:t>
-      </w:r>
-      <w:proofErr w:type="gramEnd"/>
-      <w:r>
-        <w:t xml:space="preserve">), which delegates to </w:t>
-      </w:r>
-      <w:proofErr w:type="spellStart"/>
-      <w:r>
-        <w:t>OBN_Access_</w:t>
-      </w:r>
-      <w:proofErr w:type="gramStart"/>
-      <w:r>
-        <w:t>Control</w:t>
-      </w:r>
-      <w:proofErr w:type="spellEnd"/>
-      <w:r>
-        <w:t>::</w:t>
-      </w:r>
-      <w:proofErr w:type="spellStart"/>
-      <w:proofErr w:type="gramEnd"/>
-      <w:r>
-        <w:t>require_</w:t>
-      </w:r>
-      <w:proofErr w:type="gramStart"/>
-      <w:r>
-        <w:t>permission</w:t>
-      </w:r>
-      <w:proofErr w:type="spellEnd"/>
-      <w:r>
-        <w:t>(</w:t>
-      </w:r>
-      <w:proofErr w:type="gramEnd"/>
-      <w:r>
-        <w:t xml:space="preserve">). Checks include alias normalization, org active status, cross-tenant validation, partner accounting block, then role matrix lookup. Denied attempts write to </w:t>
-      </w:r>
-      <w:proofErr w:type="spellStart"/>
-      <w:r>
-        <w:t>wp_orabooks_permission_audit_log</w:t>
-      </w:r>
-      <w:proofErr w:type="spellEnd"/>
-      <w:r>
-        <w:t xml:space="preserve"> and </w:t>
-      </w:r>
-      <w:proofErr w:type="spellStart"/>
-      <w:r>
-        <w:t>orabooks</w:t>
-      </w:r>
-      <w:proofErr w:type="spellEnd"/>
-      <w:r>
-        <w:t xml:space="preserve"> audit events.</w:t>
-      </w:r>
-    </w:p>
-    <w:p>
-      <w:r>
-        <w:t>Key files: includes/class-</w:t>
-      </w:r>
-      <w:proofErr w:type="spellStart"/>
-      <w:r>
-        <w:t>orabooks</w:t>
-      </w:r>
-      <w:proofErr w:type="spellEnd"/>
-      <w:r>
-        <w:t>-</w:t>
-      </w:r>
-      <w:proofErr w:type="spellStart"/>
-      <w:r>
-        <w:t>rbac.php</w:t>
-      </w:r>
-      <w:proofErr w:type="spellEnd"/>
-      <w:r>
-        <w:t>, includes/class-</w:t>
-      </w:r>
-      <w:proofErr w:type="spellStart"/>
-      <w:r>
-        <w:t>orabooks</w:t>
-      </w:r>
-      <w:proofErr w:type="spellEnd"/>
-      <w:r>
-        <w:t>-</w:t>
-      </w:r>
-      <w:proofErr w:type="spellStart"/>
-      <w:r>
-        <w:t>obn</w:t>
-      </w:r>
-      <w:proofErr w:type="spellEnd"/>
-      <w:r>
-        <w:t>-access-</w:t>
-      </w:r>
-      <w:proofErr w:type="spellStart"/>
-      <w:r>
-        <w:t>control.php</w:t>
-      </w:r>
-      <w:proofErr w:type="spellEnd"/>
-      <w:r>
-        <w:t xml:space="preserve"> (class-</w:t>
-      </w:r>
-      <w:proofErr w:type="spellStart"/>
-      <w:r>
-        <w:t>obn</w:t>
-      </w:r>
-      <w:proofErr w:type="spellEnd"/>
-      <w:r>
-        <w:t>-access-</w:t>
-      </w:r>
-      <w:proofErr w:type="spellStart"/>
-      <w:r>
-        <w:t>control.php</w:t>
-      </w:r>
-      <w:proofErr w:type="spellEnd"/>
-      <w:r>
-        <w:t>), includes/</w:t>
-      </w:r>
-      <w:proofErr w:type="spellStart"/>
-      <w:r>
-        <w:t>helpers.php</w:t>
-      </w:r>
-      <w:proofErr w:type="spellEnd"/>
-      <w:r>
-        <w:t>, includes/class-</w:t>
-      </w:r>
-      <w:proofErr w:type="spellStart"/>
-      <w:r>
-        <w:t>orabooks</w:t>
-      </w:r>
-      <w:proofErr w:type="spellEnd"/>
-      <w:r>
-        <w:t>-</w:t>
-      </w:r>
-      <w:proofErr w:type="spellStart"/>
-      <w:r>
-        <w:t>auth.php</w:t>
-      </w:r>
-      <w:proofErr w:type="spellEnd"/>
-      <w:r>
-        <w:t>, includes/class-</w:t>
-      </w:r>
-      <w:proofErr w:type="spellStart"/>
-      <w:r>
-        <w:t>orabooks</w:t>
-      </w:r>
-      <w:proofErr w:type="spellEnd"/>
-      <w:r>
-        <w:t>-</w:t>
-      </w:r>
-      <w:proofErr w:type="spellStart"/>
-      <w:r>
-        <w:t>team.php</w:t>
-      </w:r>
-      <w:proofErr w:type="spellEnd"/>
-      <w:r>
-        <w:t>, includes/class-</w:t>
-      </w:r>
-      <w:proofErr w:type="spellStart"/>
-      <w:r>
-        <w:t>orabooks</w:t>
-      </w:r>
-      <w:proofErr w:type="spellEnd"/>
-      <w:r>
-        <w:t>-</w:t>
-      </w:r>
-      <w:proofErr w:type="spellStart"/>
-      <w:r>
-        <w:t>ajax.php</w:t>
-      </w:r>
-      <w:proofErr w:type="spellEnd"/>
-      <w:r>
-        <w:t xml:space="preserve">, </w:t>
-      </w:r>
-      <w:proofErr w:type="spellStart"/>
-      <w:r>
-        <w:t>orabooks-ui</w:t>
-      </w:r>
-      <w:proofErr w:type="spellEnd"/>
-      <w:r>
-        <w:t xml:space="preserve"> </w:t>
-      </w:r>
-      <w:proofErr w:type="spellStart"/>
-      <w:r>
-        <w:t>ClientShell.tsx</w:t>
-      </w:r>
-      <w:proofErr w:type="spellEnd"/>
-      <w:r>
-        <w:t xml:space="preserve"> and </w:t>
-      </w:r>
-      <w:proofErr w:type="spellStart"/>
-      <w:r>
-        <w:t>TeamPage.tsx</w:t>
-      </w:r>
-      <w:proofErr w:type="spellEnd"/>
-      <w:r>
-        <w:t>.</w:t>
+        <w:t>Request flow: API/AJAX handler calls OraBooks_RBAC::require_permission(), which delegates to OBN_Access_Control::require_permission(). Checks include alias normalization, org active status, cross-tenant validation, partner accounting block, then role matrix lookup. Denied attempts write to wp_orabooks_permission_audit_log and orabooks audit events.</w:t>
+      </w:r>
+    </w:p>
+    <w:p>
+      <w:r>
+        <w:t>Key files: includes/class-orabooks-rbac.php, includes/class-orabooks-obn-access-control.php (class-obn-access-control.php), includes/helpers.php, includes/class-orabooks-auth.php, includes/class-orabooks-team.php, includes/class-orabooks-ajax.php, orabooks-ui ClientShell.tsx and TeamPage.tsx.</w:t>
       </w:r>
     </w:p>
     <w:p>
@@ -334,22 +74,55 @@
     </w:p>
     <w:p>
       <w:r>
-        <w:t>owner â€” Full org control including billing, role changes, ownership-critical actions.</w:t>
-      </w:r>
-    </w:p>
-    <w:p>
-      <w:r>
-        <w:t>admin â€” Manage employees, settings, most write operations; cannot change roles or remove owner-only actions.</w:t>
-      </w:r>
-    </w:p>
-    <w:p>
-      <w:r>
-        <w:t>approver â€” Journal and expense approval plus read access.</w:t>
-      </w:r>
-    </w:p>
-    <w:p>
-      <w:r>
-        <w:t>staff â€” Submit transactions, expenses, invoices; limited writes.</w:t>
+        <w:t>owner</w:t>
+      </w:r>
+      <w:r>
+        <w:t xml:space="preserve">: </w:t>
+      </w:r>
+      <w:r>
+        <w:t>Full org control including billing, role changes, ownership-critical actions.</w:t>
+      </w:r>
+    </w:p>
+    <w:p>
+      <w:r>
+        <w:t>A</w:t>
+      </w:r>
+      <w:r>
+        <w:t>dmin</w:t>
+      </w:r>
+      <w:r>
+        <w:t>:</w:t>
+      </w:r>
+      <w:r>
+        <w:t xml:space="preserve"> Manage employees, settings, most write operations; cannot change roles or remove owner-only actions.</w:t>
+      </w:r>
+    </w:p>
+    <w:p>
+      <w:r>
+        <w:t>A</w:t>
+      </w:r>
+      <w:r>
+        <w:t>pprover</w:t>
+      </w:r>
+      <w:r>
+        <w:t xml:space="preserve">: </w:t>
+      </w:r>
+      <w:r>
+        <w:t xml:space="preserve"> Journal and expense approval plus read access.</w:t>
+      </w:r>
+    </w:p>
+    <w:p>
+      <w:r>
+        <w:t>S</w:t>
+      </w:r>
+      <w:r>
+        <w:t>taff</w:t>
+      </w:r>
+      <w:r>
+        <w:t>:</w:t>
+      </w:r>
+      <w:r>
+        <w:t xml:space="preserve"> Submit transactions, expenses, invoices; limited writes.</w:t>
       </w:r>
     </w:p>
     <w:p>
@@ -510,11 +283,9 @@
             <w:tcW w:w="1560" w:type="dxa"/>
           </w:tcPr>
           <w:p>
-            <w:proofErr w:type="spellStart"/>
             <w:r>
               <w:t>view_reports</w:t>
             </w:r>
-            <w:proofErr w:type="spellEnd"/>
           </w:p>
         </w:tc>
         <w:tc>
@@ -590,11 +361,9 @@
             <w:tcW w:w="1560" w:type="dxa"/>
           </w:tcPr>
           <w:p>
-            <w:proofErr w:type="spellStart"/>
             <w:r>
               <w:t>submit_transaction</w:t>
             </w:r>
-            <w:proofErr w:type="spellEnd"/>
           </w:p>
         </w:tc>
         <w:tc>
@@ -667,11 +436,9 @@
             <w:tcW w:w="1560" w:type="dxa"/>
           </w:tcPr>
           <w:p>
-            <w:proofErr w:type="spellStart"/>
             <w:r>
               <w:t>approve_journal</w:t>
             </w:r>
-            <w:proofErr w:type="spellEnd"/>
           </w:p>
         </w:tc>
         <w:tc>
@@ -741,19 +508,9 @@
             <w:tcW w:w="1560" w:type="dxa"/>
           </w:tcPr>
           <w:p>
-            <w:proofErr w:type="spellStart"/>
-            <w:r>
-              <w:t>manage_employees</w:t>
-            </w:r>
-            <w:proofErr w:type="spellEnd"/>
-            <w:r>
-              <w:t xml:space="preserve"> / </w:t>
-            </w:r>
-            <w:proofErr w:type="spellStart"/>
-            <w:r>
-              <w:t>invite_user</w:t>
-            </w:r>
-            <w:proofErr w:type="spellEnd"/>
+            <w:r>
+              <w:t>manage_employees / invite_user</w:t>
+            </w:r>
           </w:p>
         </w:tc>
         <w:tc>
@@ -823,19 +580,9 @@
             <w:tcW w:w="1560" w:type="dxa"/>
           </w:tcPr>
           <w:p>
-            <w:proofErr w:type="spellStart"/>
-            <w:r>
-              <w:t>manage_roles</w:t>
-            </w:r>
-            <w:proofErr w:type="spellEnd"/>
-            <w:r>
-              <w:t xml:space="preserve"> / </w:t>
-            </w:r>
-            <w:proofErr w:type="spellStart"/>
-            <w:r>
-              <w:t>change_role</w:t>
-            </w:r>
-            <w:proofErr w:type="spellEnd"/>
+            <w:r>
+              <w:t>manage_roles / change_role</w:t>
+            </w:r>
           </w:p>
         </w:tc>
         <w:tc>
@@ -899,11 +646,9 @@
             <w:tcW w:w="1560" w:type="dxa"/>
           </w:tcPr>
           <w:p>
-            <w:proofErr w:type="spellStart"/>
             <w:r>
               <w:t>remove_user</w:t>
             </w:r>
-            <w:proofErr w:type="spellEnd"/>
           </w:p>
         </w:tc>
         <w:tc>
@@ -970,11 +715,9 @@
             <w:tcW w:w="1560" w:type="dxa"/>
           </w:tcPr>
           <w:p>
-            <w:proofErr w:type="spellStart"/>
             <w:r>
               <w:t>manage_settings</w:t>
             </w:r>
-            <w:proofErr w:type="spellEnd"/>
           </w:p>
         </w:tc>
         <w:tc>
@@ -1041,11 +784,9 @@
             <w:tcW w:w="1560" w:type="dxa"/>
           </w:tcPr>
           <w:p>
-            <w:proofErr w:type="spellStart"/>
             <w:r>
               <w:t>view_coa</w:t>
             </w:r>
-            <w:proofErr w:type="spellEnd"/>
           </w:p>
         </w:tc>
         <w:tc>
@@ -1115,11 +856,9 @@
             <w:tcW w:w="1560" w:type="dxa"/>
           </w:tcPr>
           <w:p>
-            <w:proofErr w:type="spellStart"/>
             <w:r>
               <w:t>export_reports</w:t>
             </w:r>
-            <w:proofErr w:type="spellEnd"/>
           </w:p>
         </w:tc>
         <w:tc>
@@ -1189,11 +928,9 @@
             <w:tcW w:w="1560" w:type="dxa"/>
           </w:tcPr>
           <w:p>
-            <w:proofErr w:type="spellStart"/>
             <w:r>
               <w:t>view_audit_logs</w:t>
             </w:r>
-            <w:proofErr w:type="spellEnd"/>
           </w:p>
         </w:tc>
         <w:tc>
@@ -1263,11 +1000,9 @@
             <w:tcW w:w="1560" w:type="dxa"/>
           </w:tcPr>
           <w:p>
-            <w:proofErr w:type="spellStart"/>
             <w:r>
               <w:t>manage_inventory</w:t>
             </w:r>
-            <w:proofErr w:type="spellEnd"/>
           </w:p>
         </w:tc>
         <w:tc>
@@ -1337,11 +1072,9 @@
             <w:tcW w:w="1560" w:type="dxa"/>
           </w:tcPr>
           <w:p>
-            <w:proofErr w:type="spellStart"/>
             <w:r>
               <w:t>create_invoice</w:t>
             </w:r>
-            <w:proofErr w:type="spellEnd"/>
           </w:p>
         </w:tc>
         <w:tc>
@@ -1414,11 +1147,9 @@
             <w:tcW w:w="1560" w:type="dxa"/>
           </w:tcPr>
           <w:p>
-            <w:proofErr w:type="spellStart"/>
             <w:r>
               <w:t>partner_commission_access</w:t>
             </w:r>
-            <w:proofErr w:type="spellEnd"/>
           </w:p>
         </w:tc>
         <w:tc>
@@ -1491,11 +1222,9 @@
             <w:tcW w:w="1560" w:type="dxa"/>
           </w:tcPr>
           <w:p>
-            <w:proofErr w:type="spellStart"/>
             <w:r>
               <w:t>view_ai_review_queue</w:t>
             </w:r>
-            <w:proofErr w:type="spellEnd"/>
           </w:p>
         </w:tc>
         <w:tc>
@@ -1561,23 +1290,7 @@
     </w:tbl>
     <w:p>
       <w:r>
-        <w:t xml:space="preserve">* Staff/Viewer may receive </w:t>
-      </w:r>
-      <w:proofErr w:type="spellStart"/>
-      <w:r>
-        <w:t>partner_commission_access</w:t>
-      </w:r>
-      <w:proofErr w:type="spellEnd"/>
-      <w:r>
-        <w:t xml:space="preserve"> when org flag </w:t>
-      </w:r>
-      <w:proofErr w:type="spellStart"/>
-      <w:r>
-        <w:t>partner_commission_for_staff_viewer</w:t>
-      </w:r>
-      <w:proofErr w:type="spellEnd"/>
-      <w:r>
-        <w:t xml:space="preserve"> is enabled.</w:t>
+        <w:t>* Staff/Viewer may receive partner_commission_access when org flag partner_commission_for_staff_viewer is enabled.</w:t>
       </w:r>
     </w:p>
     <w:p>
@@ -1589,71 +1302,24 @@
       </w:r>
     </w:p>
     <w:p>
-      <w:proofErr w:type="spellStart"/>
-      <w:r>
-        <w:t>manage_employees</w:t>
-      </w:r>
-      <w:proofErr w:type="spellEnd"/>
-      <w:r>
-        <w:t xml:space="preserve"> maps to </w:t>
-      </w:r>
-      <w:proofErr w:type="spellStart"/>
-      <w:r>
-        <w:t>invite_user</w:t>
-      </w:r>
-      <w:proofErr w:type="spellEnd"/>
-      <w:r>
-        <w:t xml:space="preserve"> (Owner, Admin).</w:t>
-      </w:r>
-    </w:p>
-    <w:p>
-      <w:proofErr w:type="spellStart"/>
-      <w:r>
-        <w:t>manage_settings</w:t>
-      </w:r>
-      <w:proofErr w:type="spellEnd"/>
-      <w:r>
-        <w:t xml:space="preserve"> maps to </w:t>
-      </w:r>
-      <w:proofErr w:type="spellStart"/>
-      <w:r>
-        <w:t>manage_org_settings</w:t>
-      </w:r>
-      <w:proofErr w:type="spellEnd"/>
-      <w:r>
-        <w:t xml:space="preserve"> (Owner, Admin).</w:t>
-      </w:r>
-    </w:p>
-    <w:p>
-      <w:proofErr w:type="spellStart"/>
+      <w:r>
+        <w:t>manage_employees maps to invite_user (Owner, Admin).</w:t>
+      </w:r>
+    </w:p>
+    <w:p>
+      <w:r>
+        <w:t>manage_settings maps to manage_org_settings (Owner, Admin).</w:t>
+      </w:r>
+    </w:p>
+    <w:p>
       <w:r>
         <w:lastRenderedPageBreak/>
-        <w:t>manage_roles</w:t>
-      </w:r>
-      <w:proofErr w:type="spellEnd"/>
-      <w:r>
-        <w:t xml:space="preserve"> maps to </w:t>
-      </w:r>
-      <w:proofErr w:type="spellStart"/>
-      <w:r>
-        <w:t>change_role</w:t>
-      </w:r>
-      <w:proofErr w:type="spellEnd"/>
-      <w:r>
-        <w:t xml:space="preserve"> (Owner only).</w:t>
-      </w:r>
-    </w:p>
-    <w:p>
-      <w:r>
-        <w:t xml:space="preserve">Aliases are normalized on every permission check and exposed in frontend </w:t>
-      </w:r>
-      <w:proofErr w:type="spellStart"/>
-      <w:r>
-        <w:t>permission_matrix</w:t>
-      </w:r>
-      <w:proofErr w:type="spellEnd"/>
-      <w:r>
-        <w:t xml:space="preserve"> for sidebar and Team page.</w:t>
+        <w:t>manage_roles maps to change_role (Owner only).</w:t>
+      </w:r>
+    </w:p>
+    <w:p>
+      <w:r>
+        <w:t>Aliases are normalized on every permission check and exposed in frontend permission_matrix for sidebar and Team page.</w:t>
       </w:r>
     </w:p>
     <w:p>
@@ -1666,89 +1332,12 @@
     </w:p>
     <w:p>
       <w:r>
-        <w:t xml:space="preserve">JWT claims: </w:t>
-      </w:r>
-      <w:proofErr w:type="spellStart"/>
-      <w:r>
-        <w:t>user_id</w:t>
-      </w:r>
-      <w:proofErr w:type="spellEnd"/>
-      <w:r>
-        <w:t xml:space="preserve">, email, </w:t>
-      </w:r>
-      <w:proofErr w:type="spellStart"/>
-      <w:r>
-        <w:t>org_id</w:t>
-      </w:r>
-      <w:proofErr w:type="spellEnd"/>
-      <w:r>
-        <w:t xml:space="preserve">, role, subdomain, </w:t>
-      </w:r>
-      <w:proofErr w:type="spellStart"/>
-      <w:r>
-        <w:t>is_partner</w:t>
-      </w:r>
-      <w:proofErr w:type="spellEnd"/>
-      <w:r>
-        <w:t>, exp/</w:t>
-      </w:r>
-      <w:proofErr w:type="spellStart"/>
-      <w:r>
-        <w:t>iat</w:t>
-      </w:r>
-      <w:proofErr w:type="spellEnd"/>
-      <w:r>
-        <w:t>.</w:t>
-      </w:r>
-    </w:p>
-    <w:p>
-      <w:r>
-        <w:t xml:space="preserve">Role is read from </w:t>
-      </w:r>
-      <w:proofErr w:type="spellStart"/>
-      <w:r>
-        <w:t>user_org</w:t>
-      </w:r>
-      <w:proofErr w:type="spellEnd"/>
-      <w:r>
-        <w:t xml:space="preserve"> (with </w:t>
-      </w:r>
-      <w:proofErr w:type="spellStart"/>
-      <w:proofErr w:type="gramStart"/>
-      <w:r>
-        <w:t>organizations.owner</w:t>
-      </w:r>
-      <w:proofErr w:type="gramEnd"/>
-      <w:r>
-        <w:t>_id</w:t>
-      </w:r>
-      <w:proofErr w:type="spellEnd"/>
-      <w:r>
-        <w:t xml:space="preserve"> fallback) at login and refresh. </w:t>
-      </w:r>
-      <w:proofErr w:type="spellStart"/>
-      <w:r>
-        <w:t>orabooks_assert_tenant_access</w:t>
-      </w:r>
-      <w:proofErr w:type="spellEnd"/>
-      <w:r>
-        <w:t xml:space="preserve"> blocks JWT </w:t>
-      </w:r>
-      <w:proofErr w:type="spellStart"/>
-      <w:r>
-        <w:t>org_id</w:t>
-      </w:r>
-      <w:proofErr w:type="spellEnd"/>
-      <w:r>
-        <w:t xml:space="preserve"> mismatch. Refresh token rotation re-</w:t>
-      </w:r>
-      <w:proofErr w:type="gramStart"/>
-      <w:r>
-        <w:t>reads</w:t>
-      </w:r>
-      <w:proofErr w:type="gramEnd"/>
-      <w:r>
-        <w:t xml:space="preserve"> role from database. Role change revokes all refresh tokens for user in org forcing re-authentication.</w:t>
+        <w:t>JWT claims: user_id, email, org_id, role, subdomain, is_partner, exp/iat.</w:t>
+      </w:r>
+    </w:p>
+    <w:p>
+      <w:r>
+        <w:t>Role is read from user_org (with organizations.owner_id fallback) at login and refresh. orabooks_assert_tenant_access blocks JWT org_id mismatch. Refresh token rotation re-reads role from database. Role change revokes all refresh tokens for user in org forcing re-authentication.</w:t>
       </w:r>
     </w:p>
     <w:p>
@@ -1761,132 +1350,12 @@
     </w:p>
     <w:p>
       <w:r>
-        <w:t xml:space="preserve">Table: </w:t>
-      </w:r>
-      <w:proofErr w:type="spellStart"/>
-      <w:r>
-        <w:t>wp_orabooks_permission_audit_log</w:t>
-      </w:r>
-      <w:proofErr w:type="spellEnd"/>
-      <w:r>
-        <w:t xml:space="preserve"> with </w:t>
-      </w:r>
-      <w:proofErr w:type="spellStart"/>
-      <w:r>
-        <w:t>org_id</w:t>
-      </w:r>
-      <w:proofErr w:type="spellEnd"/>
-      <w:r>
-        <w:t xml:space="preserve">, </w:t>
-      </w:r>
-      <w:proofErr w:type="spellStart"/>
-      <w:r>
-        <w:t>user_id</w:t>
-      </w:r>
-      <w:proofErr w:type="spellEnd"/>
-      <w:r>
-        <w:t xml:space="preserve">, </w:t>
-      </w:r>
-      <w:proofErr w:type="spellStart"/>
-      <w:r>
-        <w:t>event_type</w:t>
-      </w:r>
-      <w:proofErr w:type="spellEnd"/>
-      <w:r>
-        <w:t xml:space="preserve"> </w:t>
-      </w:r>
-      <w:proofErr w:type="spellStart"/>
-      <w:r>
-        <w:t>permission_denied</w:t>
-      </w:r>
-      <w:proofErr w:type="spellEnd"/>
-      <w:r>
-        <w:t xml:space="preserve">, permission, role, reason, </w:t>
-      </w:r>
-      <w:proofErr w:type="spellStart"/>
-      <w:r>
-        <w:t>ip_address</w:t>
-      </w:r>
-      <w:proofErr w:type="spellEnd"/>
-      <w:r>
-        <w:t xml:space="preserve">, </w:t>
-      </w:r>
-      <w:proofErr w:type="spellStart"/>
-      <w:r>
-        <w:t>user_agent</w:t>
-      </w:r>
-      <w:proofErr w:type="spellEnd"/>
-      <w:r>
-        <w:t xml:space="preserve">, metadata JSON, </w:t>
-      </w:r>
-      <w:proofErr w:type="spellStart"/>
-      <w:r>
-        <w:t>created_at</w:t>
-      </w:r>
-      <w:proofErr w:type="spellEnd"/>
-      <w:r>
-        <w:t>.</w:t>
-      </w:r>
-    </w:p>
-    <w:p>
-      <w:r>
-        <w:t xml:space="preserve">Reason codes: </w:t>
-      </w:r>
-      <w:proofErr w:type="spellStart"/>
-      <w:r>
-        <w:t>missing_context</w:t>
-      </w:r>
-      <w:proofErr w:type="spellEnd"/>
-      <w:r>
-        <w:t xml:space="preserve">, </w:t>
-      </w:r>
-      <w:proofErr w:type="spellStart"/>
-      <w:r>
-        <w:t>cross_tenant</w:t>
-      </w:r>
-      <w:proofErr w:type="spellEnd"/>
-      <w:r>
-        <w:t xml:space="preserve">, </w:t>
-      </w:r>
-      <w:proofErr w:type="spellStart"/>
-      <w:r>
-        <w:t>missing_org</w:t>
-      </w:r>
-      <w:proofErr w:type="spellEnd"/>
-      <w:r>
-        <w:t xml:space="preserve">, </w:t>
-      </w:r>
-      <w:proofErr w:type="spellStart"/>
-      <w:r>
-        <w:t>inactive_org</w:t>
-      </w:r>
-      <w:proofErr w:type="spellEnd"/>
-      <w:r>
-        <w:t xml:space="preserve">, </w:t>
-      </w:r>
-      <w:proofErr w:type="spellStart"/>
-      <w:r>
-        <w:t>missing_role</w:t>
-      </w:r>
-      <w:proofErr w:type="spellEnd"/>
-      <w:r>
-        <w:t xml:space="preserve">, </w:t>
-      </w:r>
-      <w:proofErr w:type="spellStart"/>
-      <w:r>
-        <w:t>partner_accounting_blocked</w:t>
-      </w:r>
-      <w:proofErr w:type="spellEnd"/>
-      <w:r>
-        <w:t xml:space="preserve">, </w:t>
-      </w:r>
-      <w:proofErr w:type="spellStart"/>
-      <w:r>
-        <w:t>permission_denied</w:t>
-      </w:r>
-      <w:proofErr w:type="spellEnd"/>
-      <w:r>
-        <w:t>.</w:t>
+        <w:t>Table: wp_orabooks_permission_audit_log with org_id, user_id, event_type permission_denied, permission, role, reason, ip_address, user_agent, metadata JSON, created_at.</w:t>
+      </w:r>
+    </w:p>
+    <w:p>
+      <w:r>
+        <w:t>Reason codes: missing_context, cross_tenant, missing_org, inactive_org, missing_role, partner_accounting_blocked, permission_denied.</w:t>
       </w:r>
     </w:p>
     <w:p>
@@ -1903,108 +1372,8 @@
       </w:r>
     </w:p>
     <w:p>
-      <w:proofErr w:type="spellStart"/>
-      <w:r>
-        <w:t>OraBooks_</w:t>
-      </w:r>
-      <w:proofErr w:type="gramStart"/>
-      <w:r>
-        <w:t>Team</w:t>
-      </w:r>
-      <w:proofErr w:type="spellEnd"/>
-      <w:r>
-        <w:t>::</w:t>
-      </w:r>
-      <w:proofErr w:type="spellStart"/>
-      <w:proofErr w:type="gramEnd"/>
-      <w:r>
-        <w:t>update_</w:t>
-      </w:r>
-      <w:proofErr w:type="gramStart"/>
-      <w:r>
-        <w:t>role</w:t>
-      </w:r>
-      <w:proofErr w:type="spellEnd"/>
-      <w:r>
-        <w:t>(</w:t>
-      </w:r>
-      <w:proofErr w:type="gramEnd"/>
-      <w:r>
-        <w:t xml:space="preserve">) and </w:t>
-      </w:r>
-      <w:proofErr w:type="spellStart"/>
-      <w:r>
-        <w:t>remove_</w:t>
-      </w:r>
-      <w:proofErr w:type="gramStart"/>
-      <w:r>
-        <w:t>user</w:t>
-      </w:r>
-      <w:proofErr w:type="spellEnd"/>
-      <w:r>
-        <w:t>(</w:t>
-      </w:r>
-      <w:proofErr w:type="gramEnd"/>
-      <w:r>
-        <w:t xml:space="preserve">) call </w:t>
-      </w:r>
-      <w:proofErr w:type="spellStart"/>
-      <w:r>
-        <w:t>OraBooks_</w:t>
-      </w:r>
-      <w:proofErr w:type="gramStart"/>
-      <w:r>
-        <w:t>Auth</w:t>
-      </w:r>
-      <w:proofErr w:type="spellEnd"/>
-      <w:r>
-        <w:t>::</w:t>
-      </w:r>
-      <w:proofErr w:type="spellStart"/>
-      <w:proofErr w:type="gramEnd"/>
-      <w:r>
-        <w:t>revoke_user_</w:t>
-      </w:r>
-      <w:proofErr w:type="gramStart"/>
-      <w:r>
-        <w:t>tokens</w:t>
-      </w:r>
-      <w:proofErr w:type="spellEnd"/>
-      <w:r>
-        <w:t>(</w:t>
-      </w:r>
-      <w:proofErr w:type="gramEnd"/>
-      <w:r>
-        <w:t xml:space="preserve">). </w:t>
-      </w:r>
-      <w:proofErr w:type="spellStart"/>
-      <w:r>
-        <w:t>OBN_Access_</w:t>
-      </w:r>
-      <w:proofErr w:type="gramStart"/>
-      <w:r>
-        <w:t>Control</w:t>
-      </w:r>
-      <w:proofErr w:type="spellEnd"/>
-      <w:r>
-        <w:t>::</w:t>
-      </w:r>
-      <w:proofErr w:type="spellStart"/>
-      <w:proofErr w:type="gramEnd"/>
-      <w:r>
-        <w:t>log_role_</w:t>
-      </w:r>
-      <w:proofErr w:type="gramStart"/>
-      <w:r>
-        <w:t>change</w:t>
-      </w:r>
-      <w:proofErr w:type="spellEnd"/>
-      <w:r>
-        <w:t>(</w:t>
-      </w:r>
-      <w:proofErr w:type="gramEnd"/>
-      <w:r>
-        <w:t>) records SL-003 audit trail. User must log in again to receive JWT with updated role.</w:t>
+      <w:r>
+        <w:t>OraBooks_Team::update_role() and remove_user() call OraBooks_Auth::revoke_user_tokens(). OBN_Access_Control::log_role_change() records SL-003 audit trail. User must log in again to receive JWT with updated role.</w:t>
       </w:r>
     </w:p>
     <w:p>
@@ -2017,79 +1386,16 @@
     </w:p>
     <w:p>
       <w:r>
-        <w:t>Partner orgs (</w:t>
-      </w:r>
-      <w:proofErr w:type="spellStart"/>
-      <w:r>
-        <w:t>organization_type</w:t>
-      </w:r>
-      <w:proofErr w:type="spellEnd"/>
-      <w:r>
-        <w:t xml:space="preserve"> = partner) cannot access accounting permissions even for owner role. </w:t>
-      </w:r>
-      <w:proofErr w:type="spellStart"/>
-      <w:r>
-        <w:t>OBN_Access_Control</w:t>
-      </w:r>
-      <w:proofErr w:type="spellEnd"/>
-      <w:r>
-        <w:t xml:space="preserve"> blocks </w:t>
-      </w:r>
-      <w:proofErr w:type="spellStart"/>
-      <w:r>
-        <w:t>view_reports</w:t>
-      </w:r>
-      <w:proofErr w:type="spellEnd"/>
-      <w:r>
-        <w:t xml:space="preserve">, </w:t>
-      </w:r>
-      <w:proofErr w:type="spellStart"/>
-      <w:r>
-        <w:t>submit_transaction</w:t>
-      </w:r>
-      <w:proofErr w:type="spellEnd"/>
-      <w:r>
-        <w:t xml:space="preserve">, </w:t>
-      </w:r>
-      <w:proofErr w:type="spellStart"/>
-      <w:r>
-        <w:t>approve_journal</w:t>
-      </w:r>
-      <w:proofErr w:type="spellEnd"/>
-      <w:r>
-        <w:t>, COA, invoices, expenses, inventory, exports, and related permissions.</w:t>
-      </w:r>
-    </w:p>
-    <w:p>
-      <w:proofErr w:type="spellStart"/>
-      <w:r>
-        <w:t>partner_commission_access</w:t>
-      </w:r>
-      <w:proofErr w:type="spellEnd"/>
-      <w:r>
-        <w:t xml:space="preserve">: default Owner and Admin. Staff/Viewer allowed when </w:t>
-      </w:r>
-      <w:proofErr w:type="spellStart"/>
-      <w:proofErr w:type="gramStart"/>
-      <w:r>
-        <w:t>organizations.partner</w:t>
-      </w:r>
-      <w:proofErr w:type="gramEnd"/>
-      <w:r>
-        <w:t>_commission_for_staff_viewer</w:t>
-      </w:r>
-      <w:proofErr w:type="spellEnd"/>
-      <w:r>
-        <w:t xml:space="preserve"> = 1 or global option </w:t>
-      </w:r>
-      <w:proofErr w:type="spellStart"/>
+        <w:t>Partner orgs (organization_type = partner) cannot access accounting permissions even for owner role. OBN_Access_Control blocks view_reports, submit_transaction, approve_journal, COA, invoices, expenses, inventory, exports, and related permissions.</w:t>
+      </w:r>
+    </w:p>
+    <w:p>
+      <w:r>
+        <w:t xml:space="preserve">partner_commission_access: default Owner and Admin. Staff/Viewer allowed when organizations.partner_commission_for_staff_viewer = 1 or global option </w:t>
+      </w:r>
       <w:r>
         <w:lastRenderedPageBreak/>
-        <w:t>orabooks_partner_commission_for_staff_viewer</w:t>
-      </w:r>
-      <w:proofErr w:type="spellEnd"/>
-      <w:r>
-        <w:t xml:space="preserve"> is enabled (ABAC). Partner nav shows Commissions/Onboarding only.</w:t>
+        <w:t>orabooks_partner_commission_for_staff_viewer is enabled (ABAC). Partner nav shows Commissions/Onboarding only.</w:t>
       </w:r>
     </w:p>
     <w:p>
@@ -2102,60 +1408,12 @@
     </w:p>
     <w:p>
       <w:r>
-        <w:t xml:space="preserve">Role badge: </w:t>
-      </w:r>
-      <w:proofErr w:type="spellStart"/>
-      <w:r>
-        <w:t>ClientShell</w:t>
-      </w:r>
-      <w:proofErr w:type="spellEnd"/>
-      <w:r>
-        <w:t xml:space="preserve"> sidebar shows Role: Owner/Staff/</w:t>
-      </w:r>
-      <w:proofErr w:type="spellStart"/>
-      <w:r>
-        <w:t>etc</w:t>
-      </w:r>
-      <w:proofErr w:type="spellEnd"/>
-      <w:r>
-        <w:t xml:space="preserve"> from </w:t>
-      </w:r>
-      <w:proofErr w:type="spellStart"/>
-      <w:r>
-        <w:t>frontendContext</w:t>
-      </w:r>
-      <w:proofErr w:type="spellEnd"/>
-      <w:r>
-        <w:t xml:space="preserve"> API.</w:t>
-      </w:r>
-    </w:p>
-    <w:p>
-      <w:r>
-        <w:t xml:space="preserve">Sidebar filtering: </w:t>
-      </w:r>
-      <w:proofErr w:type="spellStart"/>
-      <w:r>
-        <w:t>customerNav</w:t>
-      </w:r>
-      <w:proofErr w:type="spellEnd"/>
-      <w:r>
-        <w:t xml:space="preserve"> and </w:t>
-      </w:r>
-      <w:proofErr w:type="spellStart"/>
-      <w:r>
-        <w:t>partnerNav</w:t>
-      </w:r>
-      <w:proofErr w:type="spellEnd"/>
-      <w:r>
-        <w:t xml:space="preserve"> items tagged with permission; </w:t>
-      </w:r>
-      <w:proofErr w:type="spellStart"/>
-      <w:r>
-        <w:t>filterNavByPermissions</w:t>
-      </w:r>
-      <w:proofErr w:type="spellEnd"/>
-      <w:r>
-        <w:t xml:space="preserve"> hides unauthorized menu items.</w:t>
+        <w:t>Role badge: ClientShell sidebar shows Role: Owner/Staff/etc from frontendContext API.</w:t>
+      </w:r>
+    </w:p>
+    <w:p>
+      <w:r>
+        <w:t>Sidebar filtering: customerNav and partnerNav items tagged with permission; filterNavByPermissions hides unauthorized menu items.</w:t>
       </w:r>
     </w:p>
     <w:p>
@@ -2183,39 +1441,7 @@
     </w:p>
     <w:p>
       <w:r>
-        <w:t xml:space="preserve">Solution: Pending invite detected by email. Tier selection skipped. Login/2FA/OIDC auto-accepts invite via </w:t>
-      </w:r>
-      <w:proofErr w:type="spellStart"/>
-      <w:r>
-        <w:t>accept_pending_invite_for_</w:t>
-      </w:r>
-      <w:proofErr w:type="gramStart"/>
-      <w:r>
-        <w:t>user</w:t>
-      </w:r>
-      <w:proofErr w:type="spellEnd"/>
-      <w:r>
-        <w:t>(</w:t>
-      </w:r>
-      <w:proofErr w:type="gramEnd"/>
-      <w:r>
-        <w:t xml:space="preserve">). </w:t>
-      </w:r>
-      <w:proofErr w:type="spellStart"/>
-      <w:r>
-        <w:t>user_org</w:t>
-      </w:r>
-      <w:proofErr w:type="spellEnd"/>
-      <w:r>
-        <w:t xml:space="preserve"> row with invited role; </w:t>
-      </w:r>
-      <w:proofErr w:type="spellStart"/>
-      <w:r>
-        <w:t>users.org_id</w:t>
-      </w:r>
-      <w:proofErr w:type="spellEnd"/>
-      <w:r>
-        <w:t xml:space="preserve"> and JWT set to employer org; redirect to /team/ on employer subdomain. Tier selection API returns 403 while invite pending. Register page shows team invitation banner.</w:t>
+        <w:t>Solution: Pending invite detected by email. Tier selection skipped. Login/2FA/OIDC auto-accepts invite via accept_pending_invite_for_user(). user_org row with invited role; users.org_id and JWT set to employer org; redirect to /team/ on employer subdomain. Tier selection API returns 403 while invite pending. Register page shows team invitation banner.</w:t>
       </w:r>
     </w:p>
     <w:p>
@@ -2233,209 +1459,17 @@
     </w:p>
     <w:p>
       <w:r>
-        <w:t>Backend: class-</w:t>
-      </w:r>
-      <w:proofErr w:type="spellStart"/>
-      <w:r>
-        <w:t>orabooks</w:t>
-      </w:r>
-      <w:proofErr w:type="spellEnd"/>
-      <w:r>
-        <w:t>-</w:t>
-      </w:r>
-      <w:proofErr w:type="spellStart"/>
-      <w:r>
-        <w:t>rbac.php</w:t>
-      </w:r>
-      <w:proofErr w:type="spellEnd"/>
-      <w:r>
-        <w:t>, class-</w:t>
-      </w:r>
-      <w:proofErr w:type="spellStart"/>
-      <w:r>
-        <w:t>obn</w:t>
-      </w:r>
-      <w:proofErr w:type="spellEnd"/>
-      <w:r>
-        <w:t>-access-</w:t>
-      </w:r>
-      <w:proofErr w:type="spellStart"/>
-      <w:r>
-        <w:t>control.php</w:t>
-      </w:r>
-      <w:proofErr w:type="spellEnd"/>
-      <w:r>
-        <w:t>, class-</w:t>
-      </w:r>
-      <w:proofErr w:type="spellStart"/>
-      <w:r>
-        <w:t>orabooks</w:t>
-      </w:r>
-      <w:proofErr w:type="spellEnd"/>
-      <w:r>
-        <w:t>-</w:t>
-      </w:r>
-      <w:proofErr w:type="spellStart"/>
-      <w:r>
-        <w:t>team.php</w:t>
-      </w:r>
-      <w:proofErr w:type="spellEnd"/>
-      <w:r>
-        <w:t>, class-</w:t>
-      </w:r>
-      <w:proofErr w:type="spellStart"/>
-      <w:r>
-        <w:t>orabooks</w:t>
-      </w:r>
-      <w:proofErr w:type="spellEnd"/>
-      <w:r>
-        <w:t>-</w:t>
-      </w:r>
-      <w:proofErr w:type="spellStart"/>
-      <w:r>
-        <w:t>auth.php</w:t>
-      </w:r>
-      <w:proofErr w:type="spellEnd"/>
-      <w:r>
-        <w:t>, class-</w:t>
-      </w:r>
-      <w:proofErr w:type="spellStart"/>
-      <w:r>
-        <w:t>orabooks</w:t>
-      </w:r>
-      <w:proofErr w:type="spellEnd"/>
-      <w:r>
-        <w:t>-</w:t>
-      </w:r>
-      <w:proofErr w:type="spellStart"/>
-      <w:r>
-        <w:t>ajax.php</w:t>
-      </w:r>
-      <w:proofErr w:type="spellEnd"/>
-      <w:r>
-        <w:t>, class-</w:t>
-      </w:r>
-      <w:proofErr w:type="spellStart"/>
-      <w:r>
-        <w:t>orabooks</w:t>
-      </w:r>
-      <w:proofErr w:type="spellEnd"/>
-      <w:r>
-        <w:t>-two-</w:t>
-      </w:r>
-      <w:proofErr w:type="spellStart"/>
-      <w:r>
-        <w:t>factor.php</w:t>
-      </w:r>
-      <w:proofErr w:type="spellEnd"/>
-      <w:r>
-        <w:t xml:space="preserve">, </w:t>
-      </w:r>
-      <w:proofErr w:type="spellStart"/>
-      <w:r>
-        <w:t>helpers.php</w:t>
-      </w:r>
-      <w:proofErr w:type="spellEnd"/>
-      <w:r>
-        <w:t>, class-</w:t>
-      </w:r>
-      <w:proofErr w:type="spellStart"/>
-      <w:r>
-        <w:t>orabooks</w:t>
-      </w:r>
-      <w:proofErr w:type="spellEnd"/>
-      <w:r>
-        <w:t>-</w:t>
-      </w:r>
-      <w:proofErr w:type="spellStart"/>
-      <w:r>
-        <w:t>database.php</w:t>
-      </w:r>
-      <w:proofErr w:type="spellEnd"/>
-      <w:r>
-        <w:t xml:space="preserve"> (</w:t>
-      </w:r>
-      <w:proofErr w:type="spellStart"/>
-      <w:r>
-        <w:t>permission_audit_log</w:t>
-      </w:r>
-      <w:proofErr w:type="spellEnd"/>
-      <w:r>
-        <w:t xml:space="preserve"> schema).</w:t>
-      </w:r>
-    </w:p>
-    <w:p>
-      <w:r>
-        <w:t xml:space="preserve">Frontend: </w:t>
-      </w:r>
-      <w:proofErr w:type="spellStart"/>
-      <w:r>
-        <w:t>orabooks-ui</w:t>
-      </w:r>
-      <w:proofErr w:type="spellEnd"/>
-      <w:r>
-        <w:t>/</w:t>
-      </w:r>
-      <w:proofErr w:type="spellStart"/>
-      <w:r>
-        <w:t>src</w:t>
-      </w:r>
-      <w:proofErr w:type="spellEnd"/>
-      <w:r>
-        <w:t>/pages/frontend/components/</w:t>
-      </w:r>
-      <w:proofErr w:type="spellStart"/>
-      <w:r>
-        <w:t>ClientShell.tsx</w:t>
-      </w:r>
-      <w:proofErr w:type="spellEnd"/>
-      <w:r>
-        <w:t>, pages/</w:t>
-      </w:r>
-      <w:proofErr w:type="spellStart"/>
-      <w:r>
-        <w:t>TeamPage.tsx</w:t>
-      </w:r>
-      <w:proofErr w:type="spellEnd"/>
-      <w:r>
-        <w:t xml:space="preserve">, </w:t>
-      </w:r>
-      <w:proofErr w:type="spellStart"/>
-      <w:r>
-        <w:t>RegisterPage.tsx</w:t>
-      </w:r>
-      <w:proofErr w:type="spellEnd"/>
-      <w:r>
-        <w:t xml:space="preserve">, </w:t>
-      </w:r>
-      <w:proofErr w:type="spellStart"/>
-      <w:r>
-        <w:t>TierSelectionPage.tsx</w:t>
-      </w:r>
-      <w:proofErr w:type="spellEnd"/>
-      <w:r>
-        <w:t>, lib/auth-</w:t>
-      </w:r>
-      <w:proofErr w:type="spellStart"/>
-      <w:r>
-        <w:t>routing.ts</w:t>
-      </w:r>
-      <w:proofErr w:type="spellEnd"/>
-      <w:r>
-        <w:t>.</w:t>
-      </w:r>
-    </w:p>
-    <w:p>
-      <w:r>
-        <w:t>Tests: tests/</w:t>
-      </w:r>
-      <w:proofErr w:type="spellStart"/>
-      <w:r>
-        <w:t>OraBooks_RBAC_Test.php</w:t>
-      </w:r>
-      <w:proofErr w:type="spellEnd"/>
-      <w:r>
-        <w:t xml:space="preserve"> (9 tests, 28 assertions).</w:t>
+        <w:t>Backend: class-orabooks-rbac.php, class-obn-access-control.php, class-orabooks-team.php, class-orabooks-auth.php, class-orabooks-ajax.php, class-orabooks-two-factor.php, helpers.php, class-orabooks-database.php (permission_audit_log schema).</w:t>
+      </w:r>
+    </w:p>
+    <w:p>
+      <w:r>
+        <w:t>Frontend: orabooks-ui/src/pages/frontend/components/ClientShell.tsx, pages/TeamPage.tsx, RegisterPage.tsx, TierSelectionPage.tsx, lib/auth-routing.ts.</w:t>
+      </w:r>
+    </w:p>
+    <w:p>
+      <w:r>
+        <w:t>Tests: tests/OraBooks_RBAC_Test.php (9 tests, 28 assertions).</w:t>
       </w:r>
     </w:p>
     <w:p>
@@ -2444,54 +1478,17 @@
       </w:pPr>
       <w:r>
         <w:lastRenderedPageBreak/>
-        <w:t xml:space="preserve">12. </w:t>
-      </w:r>
-      <w:proofErr w:type="spellStart"/>
-      <w:r>
-        <w:t>PHPUnit</w:t>
-      </w:r>
-      <w:proofErr w:type="spellEnd"/>
-      <w:r>
-        <w:t xml:space="preserve"> Verification</w:t>
-      </w:r>
-    </w:p>
-    <w:p>
-      <w:r>
-        <w:t>Command: cd "</w:t>
-      </w:r>
-      <w:proofErr w:type="spellStart"/>
-      <w:r>
-        <w:t>OraBooks</w:t>
-      </w:r>
-      <w:proofErr w:type="spellEnd"/>
-      <w:r>
-        <w:t xml:space="preserve"> Lean MVP/tests" &amp;&amp; vendor/bin/</w:t>
-      </w:r>
-      <w:proofErr w:type="spellStart"/>
-      <w:r>
-        <w:t>phpunit</w:t>
-      </w:r>
-      <w:proofErr w:type="spellEnd"/>
-      <w:r>
-        <w:t xml:space="preserve"> --configuration phpunit.xml </w:t>
-      </w:r>
-      <w:proofErr w:type="spellStart"/>
-      <w:r>
-        <w:t>OraBooks_RBAC_Test.php</w:t>
-      </w:r>
-      <w:proofErr w:type="spellEnd"/>
-    </w:p>
-    <w:p>
-      <w:r>
-        <w:t xml:space="preserve">Covers: five roles, deny-by-default, permission aliases, partner commission ABAC, partner accounting block, </w:t>
-      </w:r>
-      <w:proofErr w:type="spellStart"/>
-      <w:r>
-        <w:t>permission_audit_log</w:t>
-      </w:r>
-      <w:proofErr w:type="spellEnd"/>
-      <w:r>
-        <w:t xml:space="preserve"> row, refresh token revoke on role change, effective permissions, invite AJAX JSON, invite-first role assignment.</w:t>
+        <w:t>12. PHPUnit Verification</w:t>
+      </w:r>
+    </w:p>
+    <w:p>
+      <w:r>
+        <w:t>Command: cd "OraBooks Lean MVP/tests" &amp;&amp; vendor/bin/phpunit --configuration phpunit.xml OraBooks_RBAC_Test.php</w:t>
+      </w:r>
+    </w:p>
+    <w:p>
+      <w:r>
+        <w:t>Covers: five roles, deny-by-default, permission aliases, partner commission ABAC, partner accounting block, permission_audit_log row, refresh token revoke on role change, effective permissions, invite AJAX JSON, invite-first role assignment.</w:t>
       </w:r>
     </w:p>
     <w:p>
@@ -2504,15 +1501,7 @@
     </w:p>
     <w:p>
       <w:r>
-        <w:t xml:space="preserve">A. Owner login: badge Role Owner; full sidebar; Team invite works; </w:t>
-      </w:r>
-      <w:proofErr w:type="gramStart"/>
-      <w:r>
-        <w:t>Roles</w:t>
-      </w:r>
-      <w:proofErr w:type="gramEnd"/>
-      <w:r>
-        <w:t xml:space="preserve"> matrix visible.</w:t>
+        <w:t>A. Owner login: badge Role Owner; full sidebar; Team invite works; Roles matrix visible.</w:t>
       </w:r>
     </w:p>
     <w:p>
@@ -2537,15 +1526,7 @@
     </w:p>
     <w:p>
       <w:r>
-        <w:t xml:space="preserve">F. Permission denied: staff hits owner-only API; 403 and </w:t>
-      </w:r>
-      <w:proofErr w:type="spellStart"/>
-      <w:r>
-        <w:t>permission_denied</w:t>
-      </w:r>
-      <w:proofErr w:type="spellEnd"/>
-      <w:r>
-        <w:t xml:space="preserve"> audit row created.</w:t>
+        <w:t>F. Permission denied: staff hits owner-only API; 403 and permission_denied audit row created.</w:t>
       </w:r>
     </w:p>
     <w:p>
@@ -2558,62 +1539,22 @@
     </w:p>
     <w:p>
       <w:r>
-        <w:t xml:space="preserve">[Done] </w:t>
-      </w:r>
-      <w:proofErr w:type="spellStart"/>
-      <w:r>
-        <w:t>user_org</w:t>
-      </w:r>
-      <w:proofErr w:type="spellEnd"/>
-      <w:r>
-        <w:t xml:space="preserve"> role ENUM NOT NULL with five roles.</w:t>
-      </w:r>
-    </w:p>
-    <w:p>
-      <w:r>
-        <w:t xml:space="preserve">[Done] JWT role and </w:t>
-      </w:r>
-      <w:proofErr w:type="spellStart"/>
-      <w:r>
-        <w:t>org_id</w:t>
-      </w:r>
-      <w:proofErr w:type="spellEnd"/>
-      <w:r>
-        <w:t xml:space="preserve"> claims at login/refresh.</w:t>
-      </w:r>
-    </w:p>
-    <w:p>
-      <w:r>
-        <w:t xml:space="preserve">[Done] </w:t>
-      </w:r>
-      <w:proofErr w:type="spellStart"/>
-      <w:r>
-        <w:t>requirePermission</w:t>
-      </w:r>
-      <w:proofErr w:type="spellEnd"/>
-      <w:r>
-        <w:t xml:space="preserve"> middleware via </w:t>
-      </w:r>
-      <w:proofErr w:type="spellStart"/>
-      <w:r>
-        <w:t>OBN_Access_Control</w:t>
-      </w:r>
-      <w:proofErr w:type="spellEnd"/>
-      <w:r>
-        <w:t>; deny-by-default.</w:t>
-      </w:r>
-    </w:p>
-    <w:p>
-      <w:r>
-        <w:t xml:space="preserve">[Done] API endpoints guarded with </w:t>
-      </w:r>
-      <w:proofErr w:type="spellStart"/>
-      <w:r>
-        <w:t>require_permission</w:t>
-      </w:r>
-      <w:proofErr w:type="spellEnd"/>
-      <w:r>
-        <w:t>.</w:t>
+        <w:t>[Done] user_org role ENUM NOT NULL with five roles.</w:t>
+      </w:r>
+    </w:p>
+    <w:p>
+      <w:r>
+        <w:t>[Done] JWT role and org_id claims at login/refresh.</w:t>
+      </w:r>
+    </w:p>
+    <w:p>
+      <w:r>
+        <w:t>[Done] requirePermission middleware via OBN_Access_Control; deny-by-default.</w:t>
+      </w:r>
+    </w:p>
+    <w:p>
+      <w:r>
+        <w:t>[Done] API endpoints guarded with require_permission.</w:t>
       </w:r>
     </w:p>
     <w:p>
@@ -2623,15 +1564,7 @@
     </w:p>
     <w:p>
       <w:r>
-        <w:t xml:space="preserve">[Done] </w:t>
-      </w:r>
-      <w:proofErr w:type="spellStart"/>
-      <w:r>
-        <w:t>permission_denied</w:t>
-      </w:r>
-      <w:proofErr w:type="spellEnd"/>
-      <w:r>
-        <w:t xml:space="preserve"> audit in dedicated table.</w:t>
+        <w:t>[Done] permission_denied audit in dedicated table.</w:t>
       </w:r>
     </w:p>
     <w:p>
@@ -2641,15 +1574,7 @@
     </w:p>
     <w:p>
       <w:r>
-        <w:t xml:space="preserve">[Done] </w:t>
-      </w:r>
-      <w:proofErr w:type="spellStart"/>
-      <w:r>
-        <w:t>partner_commission_for_staff_viewer</w:t>
-      </w:r>
-      <w:proofErr w:type="spellEnd"/>
-      <w:r>
-        <w:t xml:space="preserve"> org config ABAC.</w:t>
+        <w:t>[Done] partner_commission_for_staff_viewer org config ABAC.</w:t>
       </w:r>
     </w:p>
     <w:p>
@@ -2659,29 +1584,13 @@
     </w:p>
     <w:p>
       <w:r>
-        <w:t xml:space="preserve">[Done] </w:t>
-      </w:r>
-      <w:proofErr w:type="spellStart"/>
-      <w:r>
-        <w:t>PHPUnit</w:t>
-      </w:r>
-      <w:proofErr w:type="spellEnd"/>
-      <w:r>
-        <w:t xml:space="preserve"> role/permission tests.</w:t>
+        <w:t>[Done] PHPUnit role/permission tests.</w:t>
       </w:r>
     </w:p>
     <w:p>
       <w:r>
         <w:lastRenderedPageBreak/>
-        <w:t xml:space="preserve">[Partial] </w:t>
-      </w:r>
-      <w:proofErr w:type="gramStart"/>
-      <w:r>
-        <w:t>Roles</w:t>
-      </w:r>
-      <w:proofErr w:type="gramEnd"/>
-      <w:r>
-        <w:t xml:space="preserve"> matrix UI is read-only (no custom role editing).</w:t>
+        <w:t>[Partial] Roles matrix UI is read-only (no custom role editing).</w:t>
       </w:r>
     </w:p>
     <w:p>

</xml_diff>

<commit_message>
Auto commit: 2026-06-21 17:28:10
</commit_message>
<xml_diff>
--- a/OraBooks Lean MVP/docs/rbac work report(morshed).docx
+++ b/OraBooks Lean MVP/docs/rbac work report(morshed).docx
@@ -6,8 +6,13 @@
       <w:pPr>
         <w:pStyle w:val="Title"/>
       </w:pPr>
-      <w:r>
-        <w:t>OraBooks Lean MVP</w:t>
+      <w:proofErr w:type="spellStart"/>
+      <w:r>
+        <w:t>OraBooks</w:t>
+      </w:r>
+      <w:proofErr w:type="spellEnd"/>
+      <w:r>
+        <w:t xml:space="preserve"> Lean MVP</w:t>
       </w:r>
     </w:p>
     <w:p>
@@ -20,7 +25,15 @@
     </w:p>
     <w:p>
       <w:r>
-        <w:t>Prepared for: Morshed / OraBooks Project Team</w:t>
+        <w:t xml:space="preserve">Prepared for: Morshed / </w:t>
+      </w:r>
+      <w:proofErr w:type="spellStart"/>
+      <w:r>
+        <w:t>OraBooks</w:t>
+      </w:r>
+      <w:proofErr w:type="spellEnd"/>
+      <w:r>
+        <w:t xml:space="preserve"> Project Team</w:t>
       </w:r>
     </w:p>
     <w:p>
@@ -43,7 +56,39 @@
     </w:p>
     <w:p>
       <w:r>
-        <w:t>SL-003 implements org-scoped Role-Based Access Control across the OraBooks Lean MVP. Five fixed roles (owner, admin, approver, staff, viewer) map to a deny-by-default permission matrix. OBN_Access_Control is the central facade for permission checks, dedicated permission_denied audit logging, and UI permission matrix delivery. JWT carries org_id and role claims. Role changes revoke refresh tokens. Partner organizations are blocked from accounting APIs. Invited staff onboarding skips tier selection and auto-joins the employer org with the invited role.</w:t>
+        <w:t xml:space="preserve">SL-003 implements org-scoped Role-Based Access Control across the </w:t>
+      </w:r>
+      <w:proofErr w:type="spellStart"/>
+      <w:r>
+        <w:t>OraBooks</w:t>
+      </w:r>
+      <w:proofErr w:type="spellEnd"/>
+      <w:r>
+        <w:t xml:space="preserve"> Lean MVP. Five fixed roles (owner, admin, approver, staff, viewer) map to a deny-by-default permission matrix. </w:t>
+      </w:r>
+      <w:proofErr w:type="spellStart"/>
+      <w:r>
+        <w:t>OBN_Access_Control</w:t>
+      </w:r>
+      <w:proofErr w:type="spellEnd"/>
+      <w:r>
+        <w:t xml:space="preserve"> is the central facade for permission checks, dedicated </w:t>
+      </w:r>
+      <w:proofErr w:type="spellStart"/>
+      <w:r>
+        <w:t>permission_denied</w:t>
+      </w:r>
+      <w:proofErr w:type="spellEnd"/>
+      <w:r>
+        <w:t xml:space="preserve"> audit logging, and UI permission matrix delivery. JWT carries </w:t>
+      </w:r>
+      <w:proofErr w:type="spellStart"/>
+      <w:r>
+        <w:t>org_id</w:t>
+      </w:r>
+      <w:proofErr w:type="spellEnd"/>
+      <w:r>
+        <w:t xml:space="preserve"> and role claims. Role changes revoke refresh tokens. Partner organizations are blocked from accounting APIs. Invited staff onboarding skips tier selection and auto-joins the employer org with the invited role.</w:t>
       </w:r>
     </w:p>
     <w:p>
@@ -56,12 +101,196 @@
     </w:p>
     <w:p>
       <w:r>
-        <w:t>Request flow: API/AJAX handler calls OraBooks_RBAC::require_permission(), which delegates to OBN_Access_Control::require_permission(). Checks include alias normalization, org active status, cross-tenant validation, partner accounting block, then role matrix lookup. Denied attempts write to wp_orabooks_permission_audit_log and orabooks audit events.</w:t>
-      </w:r>
-    </w:p>
-    <w:p>
-      <w:r>
-        <w:t>Key files: includes/class-orabooks-rbac.php, includes/class-orabooks-obn-access-control.php (class-obn-access-control.php), includes/helpers.php, includes/class-orabooks-auth.php, includes/class-orabooks-team.php, includes/class-orabooks-ajax.php, orabooks-ui ClientShell.tsx and TeamPage.tsx.</w:t>
+        <w:t xml:space="preserve">Request flow: API/AJAX handler calls </w:t>
+      </w:r>
+      <w:proofErr w:type="spellStart"/>
+      <w:r>
+        <w:t>OraBooks_RBAC</w:t>
+      </w:r>
+      <w:proofErr w:type="spellEnd"/>
+      <w:r>
+        <w:t>::</w:t>
+      </w:r>
+      <w:proofErr w:type="spellStart"/>
+      <w:r>
+        <w:t>require_permission</w:t>
+      </w:r>
+      <w:proofErr w:type="spellEnd"/>
+      <w:r>
+        <w:t xml:space="preserve">(), which delegates to </w:t>
+      </w:r>
+      <w:proofErr w:type="spellStart"/>
+      <w:r>
+        <w:t>OBN_Access_Control</w:t>
+      </w:r>
+      <w:proofErr w:type="spellEnd"/>
+      <w:r>
+        <w:t>::</w:t>
+      </w:r>
+      <w:proofErr w:type="spellStart"/>
+      <w:r>
+        <w:t>require_permission</w:t>
+      </w:r>
+      <w:proofErr w:type="spellEnd"/>
+      <w:r>
+        <w:t xml:space="preserve">(). Checks include alias normalization, org active status, cross-tenant validation, partner accounting block, then role matrix lookup. Denied attempts write to </w:t>
+      </w:r>
+      <w:proofErr w:type="spellStart"/>
+      <w:r>
+        <w:t>wp_orabooks_permission_audit_log</w:t>
+      </w:r>
+      <w:proofErr w:type="spellEnd"/>
+      <w:r>
+        <w:t xml:space="preserve"> and </w:t>
+      </w:r>
+      <w:proofErr w:type="spellStart"/>
+      <w:r>
+        <w:t>orabooks</w:t>
+      </w:r>
+      <w:proofErr w:type="spellEnd"/>
+      <w:r>
+        <w:t xml:space="preserve"> audit events.</w:t>
+      </w:r>
+    </w:p>
+    <w:p>
+      <w:r>
+        <w:t>Key files: includes/class-</w:t>
+      </w:r>
+      <w:proofErr w:type="spellStart"/>
+      <w:r>
+        <w:t>orabooks</w:t>
+      </w:r>
+      <w:proofErr w:type="spellEnd"/>
+      <w:r>
+        <w:t>-</w:t>
+      </w:r>
+      <w:proofErr w:type="spellStart"/>
+      <w:r>
+        <w:t>rbac.php</w:t>
+      </w:r>
+      <w:proofErr w:type="spellEnd"/>
+      <w:r>
+        <w:t>, includes/class-</w:t>
+      </w:r>
+      <w:proofErr w:type="spellStart"/>
+      <w:r>
+        <w:t>orabooks</w:t>
+      </w:r>
+      <w:proofErr w:type="spellEnd"/>
+      <w:r>
+        <w:t>-</w:t>
+      </w:r>
+      <w:proofErr w:type="spellStart"/>
+      <w:r>
+        <w:t>obn</w:t>
+      </w:r>
+      <w:proofErr w:type="spellEnd"/>
+      <w:r>
+        <w:t>-access-</w:t>
+      </w:r>
+      <w:proofErr w:type="spellStart"/>
+      <w:r>
+        <w:t>control.php</w:t>
+      </w:r>
+      <w:proofErr w:type="spellEnd"/>
+      <w:r>
+        <w:t xml:space="preserve"> (class-</w:t>
+      </w:r>
+      <w:proofErr w:type="spellStart"/>
+      <w:r>
+        <w:t>obn</w:t>
+      </w:r>
+      <w:proofErr w:type="spellEnd"/>
+      <w:r>
+        <w:t>-access-</w:t>
+      </w:r>
+      <w:proofErr w:type="spellStart"/>
+      <w:r>
+        <w:t>control.php</w:t>
+      </w:r>
+      <w:proofErr w:type="spellEnd"/>
+      <w:r>
+        <w:t>), includes/</w:t>
+      </w:r>
+      <w:proofErr w:type="spellStart"/>
+      <w:r>
+        <w:t>helpers.php</w:t>
+      </w:r>
+      <w:proofErr w:type="spellEnd"/>
+      <w:r>
+        <w:t>, includes/class-</w:t>
+      </w:r>
+      <w:proofErr w:type="spellStart"/>
+      <w:r>
+        <w:t>orabooks</w:t>
+      </w:r>
+      <w:proofErr w:type="spellEnd"/>
+      <w:r>
+        <w:t>-</w:t>
+      </w:r>
+      <w:proofErr w:type="spellStart"/>
+      <w:r>
+        <w:t>auth.php</w:t>
+      </w:r>
+      <w:proofErr w:type="spellEnd"/>
+      <w:r>
+        <w:t>, includes/class-</w:t>
+      </w:r>
+      <w:proofErr w:type="spellStart"/>
+      <w:r>
+        <w:t>orabooks</w:t>
+      </w:r>
+      <w:proofErr w:type="spellEnd"/>
+      <w:r>
+        <w:t>-</w:t>
+      </w:r>
+      <w:proofErr w:type="spellStart"/>
+      <w:r>
+        <w:t>team.php</w:t>
+      </w:r>
+      <w:proofErr w:type="spellEnd"/>
+      <w:r>
+        <w:t>, includes/class-</w:t>
+      </w:r>
+      <w:proofErr w:type="spellStart"/>
+      <w:r>
+        <w:t>orabooks</w:t>
+      </w:r>
+      <w:proofErr w:type="spellEnd"/>
+      <w:r>
+        <w:t>-</w:t>
+      </w:r>
+      <w:proofErr w:type="spellStart"/>
+      <w:r>
+        <w:t>ajax.php</w:t>
+      </w:r>
+      <w:proofErr w:type="spellEnd"/>
+      <w:r>
+        <w:t xml:space="preserve">, </w:t>
+      </w:r>
+      <w:proofErr w:type="spellStart"/>
+      <w:r>
+        <w:t>orabooks-ui</w:t>
+      </w:r>
+      <w:proofErr w:type="spellEnd"/>
+      <w:r>
+        <w:t xml:space="preserve"> </w:t>
+      </w:r>
+      <w:proofErr w:type="spellStart"/>
+      <w:r>
+        <w:t>ClientShell.tsx</w:t>
+      </w:r>
+      <w:proofErr w:type="spellEnd"/>
+      <w:r>
+        <w:t xml:space="preserve"> and </w:t>
+      </w:r>
+      <w:proofErr w:type="spellStart"/>
+      <w:r>
+        <w:t>TeamPage.tsx</w:t>
+      </w:r>
+      <w:proofErr w:type="spellEnd"/>
+      <w:r>
+        <w:t>.</w:t>
       </w:r>
     </w:p>
     <w:p>
@@ -128,7 +357,16 @@
     <w:p>
       <w:r>
         <w:lastRenderedPageBreak/>
-        <w:t>viewer â€” Read-only access to reports, invoices, expenses, classification.</w:t>
+        <w:t>V</w:t>
+      </w:r>
+      <w:r>
+        <w:t>iewer</w:t>
+      </w:r>
+      <w:r>
+        <w:t xml:space="preserve">: </w:t>
+      </w:r>
+      <w:r>
+        <w:t xml:space="preserve"> Read-only access to reports, invoices, expenses, classification.</w:t>
       </w:r>
     </w:p>
     <w:p>
@@ -283,9 +521,11 @@
             <w:tcW w:w="1560" w:type="dxa"/>
           </w:tcPr>
           <w:p>
+            <w:proofErr w:type="spellStart"/>
             <w:r>
               <w:t>view_reports</w:t>
             </w:r>
+            <w:proofErr w:type="spellEnd"/>
           </w:p>
         </w:tc>
         <w:tc>
@@ -361,9 +601,11 @@
             <w:tcW w:w="1560" w:type="dxa"/>
           </w:tcPr>
           <w:p>
+            <w:proofErr w:type="spellStart"/>
             <w:r>
               <w:t>submit_transaction</w:t>
             </w:r>
+            <w:proofErr w:type="spellEnd"/>
           </w:p>
         </w:tc>
         <w:tc>
@@ -436,9 +678,11 @@
             <w:tcW w:w="1560" w:type="dxa"/>
           </w:tcPr>
           <w:p>
+            <w:proofErr w:type="spellStart"/>
             <w:r>
               <w:t>approve_journal</w:t>
             </w:r>
+            <w:proofErr w:type="spellEnd"/>
           </w:p>
         </w:tc>
         <w:tc>
@@ -508,9 +752,19 @@
             <w:tcW w:w="1560" w:type="dxa"/>
           </w:tcPr>
           <w:p>
-            <w:r>
-              <w:t>manage_employees / invite_user</w:t>
-            </w:r>
+            <w:proofErr w:type="spellStart"/>
+            <w:r>
+              <w:t>manage_employees</w:t>
+            </w:r>
+            <w:proofErr w:type="spellEnd"/>
+            <w:r>
+              <w:t xml:space="preserve"> / </w:t>
+            </w:r>
+            <w:proofErr w:type="spellStart"/>
+            <w:r>
+              <w:t>invite_user</w:t>
+            </w:r>
+            <w:proofErr w:type="spellEnd"/>
           </w:p>
         </w:tc>
         <w:tc>
@@ -580,9 +834,19 @@
             <w:tcW w:w="1560" w:type="dxa"/>
           </w:tcPr>
           <w:p>
-            <w:r>
-              <w:t>manage_roles / change_role</w:t>
-            </w:r>
+            <w:proofErr w:type="spellStart"/>
+            <w:r>
+              <w:t>manage_roles</w:t>
+            </w:r>
+            <w:proofErr w:type="spellEnd"/>
+            <w:r>
+              <w:t xml:space="preserve"> / </w:t>
+            </w:r>
+            <w:proofErr w:type="spellStart"/>
+            <w:r>
+              <w:t>change_role</w:t>
+            </w:r>
+            <w:proofErr w:type="spellEnd"/>
           </w:p>
         </w:tc>
         <w:tc>
@@ -646,9 +910,11 @@
             <w:tcW w:w="1560" w:type="dxa"/>
           </w:tcPr>
           <w:p>
+            <w:proofErr w:type="spellStart"/>
             <w:r>
               <w:t>remove_user</w:t>
             </w:r>
+            <w:proofErr w:type="spellEnd"/>
           </w:p>
         </w:tc>
         <w:tc>
@@ -715,9 +981,11 @@
             <w:tcW w:w="1560" w:type="dxa"/>
           </w:tcPr>
           <w:p>
+            <w:proofErr w:type="spellStart"/>
             <w:r>
               <w:t>manage_settings</w:t>
             </w:r>
+            <w:proofErr w:type="spellEnd"/>
           </w:p>
         </w:tc>
         <w:tc>
@@ -784,9 +1052,11 @@
             <w:tcW w:w="1560" w:type="dxa"/>
           </w:tcPr>
           <w:p>
+            <w:proofErr w:type="spellStart"/>
             <w:r>
               <w:t>view_coa</w:t>
             </w:r>
+            <w:proofErr w:type="spellEnd"/>
           </w:p>
         </w:tc>
         <w:tc>
@@ -856,9 +1126,11 @@
             <w:tcW w:w="1560" w:type="dxa"/>
           </w:tcPr>
           <w:p>
+            <w:proofErr w:type="spellStart"/>
             <w:r>
               <w:t>export_reports</w:t>
             </w:r>
+            <w:proofErr w:type="spellEnd"/>
           </w:p>
         </w:tc>
         <w:tc>
@@ -928,9 +1200,11 @@
             <w:tcW w:w="1560" w:type="dxa"/>
           </w:tcPr>
           <w:p>
+            <w:proofErr w:type="spellStart"/>
             <w:r>
               <w:t>view_audit_logs</w:t>
             </w:r>
+            <w:proofErr w:type="spellEnd"/>
           </w:p>
         </w:tc>
         <w:tc>
@@ -1000,9 +1274,11 @@
             <w:tcW w:w="1560" w:type="dxa"/>
           </w:tcPr>
           <w:p>
+            <w:proofErr w:type="spellStart"/>
             <w:r>
               <w:t>manage_inventory</w:t>
             </w:r>
+            <w:proofErr w:type="spellEnd"/>
           </w:p>
         </w:tc>
         <w:tc>
@@ -1072,9 +1348,11 @@
             <w:tcW w:w="1560" w:type="dxa"/>
           </w:tcPr>
           <w:p>
+            <w:proofErr w:type="spellStart"/>
             <w:r>
               <w:t>create_invoice</w:t>
             </w:r>
+            <w:proofErr w:type="spellEnd"/>
           </w:p>
         </w:tc>
         <w:tc>
@@ -1147,9 +1425,11 @@
             <w:tcW w:w="1560" w:type="dxa"/>
           </w:tcPr>
           <w:p>
+            <w:proofErr w:type="spellStart"/>
             <w:r>
               <w:t>partner_commission_access</w:t>
             </w:r>
+            <w:proofErr w:type="spellEnd"/>
           </w:p>
         </w:tc>
         <w:tc>
@@ -1222,9 +1502,11 @@
             <w:tcW w:w="1560" w:type="dxa"/>
           </w:tcPr>
           <w:p>
+            <w:proofErr w:type="spellStart"/>
             <w:r>
               <w:t>view_ai_review_queue</w:t>
             </w:r>
+            <w:proofErr w:type="spellEnd"/>
           </w:p>
         </w:tc>
         <w:tc>
@@ -1290,7 +1572,23 @@
     </w:tbl>
     <w:p>
       <w:r>
-        <w:t>* Staff/Viewer may receive partner_commission_access when org flag partner_commission_for_staff_viewer is enabled.</w:t>
+        <w:t xml:space="preserve">* Staff/Viewer may receive </w:t>
+      </w:r>
+      <w:proofErr w:type="spellStart"/>
+      <w:r>
+        <w:t>partner_commission_access</w:t>
+      </w:r>
+      <w:proofErr w:type="spellEnd"/>
+      <w:r>
+        <w:t xml:space="preserve"> when org flag </w:t>
+      </w:r>
+      <w:proofErr w:type="spellStart"/>
+      <w:r>
+        <w:t>partner_commission_for_staff_viewer</w:t>
+      </w:r>
+      <w:proofErr w:type="spellEnd"/>
+      <w:r>
+        <w:t xml:space="preserve"> is enabled.</w:t>
       </w:r>
     </w:p>
     <w:p>
@@ -1302,24 +1600,71 @@
       </w:r>
     </w:p>
     <w:p>
-      <w:r>
-        <w:t>manage_employees maps to invite_user (Owner, Admin).</w:t>
-      </w:r>
-    </w:p>
-    <w:p>
-      <w:r>
-        <w:t>manage_settings maps to manage_org_settings (Owner, Admin).</w:t>
-      </w:r>
-    </w:p>
-    <w:p>
+      <w:proofErr w:type="spellStart"/>
+      <w:r>
+        <w:t>manage_employees</w:t>
+      </w:r>
+      <w:proofErr w:type="spellEnd"/>
+      <w:r>
+        <w:t xml:space="preserve"> maps to </w:t>
+      </w:r>
+      <w:proofErr w:type="spellStart"/>
+      <w:r>
+        <w:t>invite_user</w:t>
+      </w:r>
+      <w:proofErr w:type="spellEnd"/>
+      <w:r>
+        <w:t xml:space="preserve"> (Owner, Admin).</w:t>
+      </w:r>
+    </w:p>
+    <w:p>
+      <w:proofErr w:type="spellStart"/>
+      <w:r>
+        <w:t>manage_settings</w:t>
+      </w:r>
+      <w:proofErr w:type="spellEnd"/>
+      <w:r>
+        <w:t xml:space="preserve"> maps to </w:t>
+      </w:r>
+      <w:proofErr w:type="spellStart"/>
+      <w:r>
+        <w:t>manage_org_settings</w:t>
+      </w:r>
+      <w:proofErr w:type="spellEnd"/>
+      <w:r>
+        <w:t xml:space="preserve"> (Owner, Admin).</w:t>
+      </w:r>
+    </w:p>
+    <w:p>
+      <w:proofErr w:type="spellStart"/>
       <w:r>
         <w:lastRenderedPageBreak/>
-        <w:t>manage_roles maps to change_role (Owner only).</w:t>
-      </w:r>
-    </w:p>
-    <w:p>
-      <w:r>
-        <w:t>Aliases are normalized on every permission check and exposed in frontend permission_matrix for sidebar and Team page.</w:t>
+        <w:t>manage_roles</w:t>
+      </w:r>
+      <w:proofErr w:type="spellEnd"/>
+      <w:r>
+        <w:t xml:space="preserve"> maps to </w:t>
+      </w:r>
+      <w:proofErr w:type="spellStart"/>
+      <w:r>
+        <w:t>change_role</w:t>
+      </w:r>
+      <w:proofErr w:type="spellEnd"/>
+      <w:r>
+        <w:t xml:space="preserve"> (Owner only).</w:t>
+      </w:r>
+    </w:p>
+    <w:p>
+      <w:r>
+        <w:t xml:space="preserve">Aliases are normalized on every permission check and exposed in frontend </w:t>
+      </w:r>
+      <w:proofErr w:type="spellStart"/>
+      <w:r>
+        <w:t>permission_matrix</w:t>
+      </w:r>
+      <w:proofErr w:type="spellEnd"/>
+      <w:r>
+        <w:t xml:space="preserve"> for sidebar and Team page.</w:t>
       </w:r>
     </w:p>
     <w:p>
@@ -1332,12 +1677,76 @@
     </w:p>
     <w:p>
       <w:r>
-        <w:t>JWT claims: user_id, email, org_id, role, subdomain, is_partner, exp/iat.</w:t>
-      </w:r>
-    </w:p>
-    <w:p>
-      <w:r>
-        <w:t>Role is read from user_org (with organizations.owner_id fallback) at login and refresh. orabooks_assert_tenant_access blocks JWT org_id mismatch. Refresh token rotation re-reads role from database. Role change revokes all refresh tokens for user in org forcing re-authentication.</w:t>
+        <w:t xml:space="preserve">JWT claims: </w:t>
+      </w:r>
+      <w:proofErr w:type="spellStart"/>
+      <w:r>
+        <w:t>user_id</w:t>
+      </w:r>
+      <w:proofErr w:type="spellEnd"/>
+      <w:r>
+        <w:t xml:space="preserve">, email, </w:t>
+      </w:r>
+      <w:proofErr w:type="spellStart"/>
+      <w:r>
+        <w:t>org_id</w:t>
+      </w:r>
+      <w:proofErr w:type="spellEnd"/>
+      <w:r>
+        <w:t xml:space="preserve">, role, subdomain, </w:t>
+      </w:r>
+      <w:proofErr w:type="spellStart"/>
+      <w:r>
+        <w:t>is_partner</w:t>
+      </w:r>
+      <w:proofErr w:type="spellEnd"/>
+      <w:r>
+        <w:t>, exp/</w:t>
+      </w:r>
+      <w:proofErr w:type="spellStart"/>
+      <w:r>
+        <w:t>iat</w:t>
+      </w:r>
+      <w:proofErr w:type="spellEnd"/>
+      <w:r>
+        <w:t>.</w:t>
+      </w:r>
+    </w:p>
+    <w:p>
+      <w:r>
+        <w:t xml:space="preserve">Role is read from </w:t>
+      </w:r>
+      <w:proofErr w:type="spellStart"/>
+      <w:r>
+        <w:t>user_org</w:t>
+      </w:r>
+      <w:proofErr w:type="spellEnd"/>
+      <w:r>
+        <w:t xml:space="preserve"> (with </w:t>
+      </w:r>
+      <w:proofErr w:type="spellStart"/>
+      <w:r>
+        <w:t>organizations.owner_id</w:t>
+      </w:r>
+      <w:proofErr w:type="spellEnd"/>
+      <w:r>
+        <w:t xml:space="preserve"> fallback) at login and refresh. </w:t>
+      </w:r>
+      <w:proofErr w:type="spellStart"/>
+      <w:r>
+        <w:t>orabooks_assert_tenant_access</w:t>
+      </w:r>
+      <w:proofErr w:type="spellEnd"/>
+      <w:r>
+        <w:t xml:space="preserve"> blocks JWT </w:t>
+      </w:r>
+      <w:proofErr w:type="spellStart"/>
+      <w:r>
+        <w:t>org_id</w:t>
+      </w:r>
+      <w:proofErr w:type="spellEnd"/>
+      <w:r>
+        <w:t xml:space="preserve"> mismatch. Refresh token rotation re-reads role from database. Role change revokes all refresh tokens for user in org forcing re-authentication.</w:t>
       </w:r>
     </w:p>
     <w:p>
@@ -1350,12 +1759,132 @@
     </w:p>
     <w:p>
       <w:r>
-        <w:t>Table: wp_orabooks_permission_audit_log with org_id, user_id, event_type permission_denied, permission, role, reason, ip_address, user_agent, metadata JSON, created_at.</w:t>
-      </w:r>
-    </w:p>
-    <w:p>
-      <w:r>
-        <w:t>Reason codes: missing_context, cross_tenant, missing_org, inactive_org, missing_role, partner_accounting_blocked, permission_denied.</w:t>
+        <w:t xml:space="preserve">Table: </w:t>
+      </w:r>
+      <w:proofErr w:type="spellStart"/>
+      <w:r>
+        <w:t>wp_orabooks_permission_audit_log</w:t>
+      </w:r>
+      <w:proofErr w:type="spellEnd"/>
+      <w:r>
+        <w:t xml:space="preserve"> with </w:t>
+      </w:r>
+      <w:proofErr w:type="spellStart"/>
+      <w:r>
+        <w:t>org_id</w:t>
+      </w:r>
+      <w:proofErr w:type="spellEnd"/>
+      <w:r>
+        <w:t xml:space="preserve">, </w:t>
+      </w:r>
+      <w:proofErr w:type="spellStart"/>
+      <w:r>
+        <w:t>user_id</w:t>
+      </w:r>
+      <w:proofErr w:type="spellEnd"/>
+      <w:r>
+        <w:t xml:space="preserve">, </w:t>
+      </w:r>
+      <w:proofErr w:type="spellStart"/>
+      <w:r>
+        <w:t>event_type</w:t>
+      </w:r>
+      <w:proofErr w:type="spellEnd"/>
+      <w:r>
+        <w:t xml:space="preserve"> </w:t>
+      </w:r>
+      <w:proofErr w:type="spellStart"/>
+      <w:r>
+        <w:t>permission_denied</w:t>
+      </w:r>
+      <w:proofErr w:type="spellEnd"/>
+      <w:r>
+        <w:t xml:space="preserve">, permission, role, reason, </w:t>
+      </w:r>
+      <w:proofErr w:type="spellStart"/>
+      <w:r>
+        <w:t>ip_address</w:t>
+      </w:r>
+      <w:proofErr w:type="spellEnd"/>
+      <w:r>
+        <w:t xml:space="preserve">, </w:t>
+      </w:r>
+      <w:proofErr w:type="spellStart"/>
+      <w:r>
+        <w:t>user_agent</w:t>
+      </w:r>
+      <w:proofErr w:type="spellEnd"/>
+      <w:r>
+        <w:t xml:space="preserve">, metadata JSON, </w:t>
+      </w:r>
+      <w:proofErr w:type="spellStart"/>
+      <w:r>
+        <w:t>created_at</w:t>
+      </w:r>
+      <w:proofErr w:type="spellEnd"/>
+      <w:r>
+        <w:t>.</w:t>
+      </w:r>
+    </w:p>
+    <w:p>
+      <w:r>
+        <w:t xml:space="preserve">Reason codes: </w:t>
+      </w:r>
+      <w:proofErr w:type="spellStart"/>
+      <w:r>
+        <w:t>missing_context</w:t>
+      </w:r>
+      <w:proofErr w:type="spellEnd"/>
+      <w:r>
+        <w:t xml:space="preserve">, </w:t>
+      </w:r>
+      <w:proofErr w:type="spellStart"/>
+      <w:r>
+        <w:t>cross_tenant</w:t>
+      </w:r>
+      <w:proofErr w:type="spellEnd"/>
+      <w:r>
+        <w:t xml:space="preserve">, </w:t>
+      </w:r>
+      <w:proofErr w:type="spellStart"/>
+      <w:r>
+        <w:t>missing_org</w:t>
+      </w:r>
+      <w:proofErr w:type="spellEnd"/>
+      <w:r>
+        <w:t xml:space="preserve">, </w:t>
+      </w:r>
+      <w:proofErr w:type="spellStart"/>
+      <w:r>
+        <w:t>inactive_org</w:t>
+      </w:r>
+      <w:proofErr w:type="spellEnd"/>
+      <w:r>
+        <w:t xml:space="preserve">, </w:t>
+      </w:r>
+      <w:proofErr w:type="spellStart"/>
+      <w:r>
+        <w:t>missing_role</w:t>
+      </w:r>
+      <w:proofErr w:type="spellEnd"/>
+      <w:r>
+        <w:t xml:space="preserve">, </w:t>
+      </w:r>
+      <w:proofErr w:type="spellStart"/>
+      <w:r>
+        <w:t>partner_accounting_blocked</w:t>
+      </w:r>
+      <w:proofErr w:type="spellEnd"/>
+      <w:r>
+        <w:t xml:space="preserve">, </w:t>
+      </w:r>
+      <w:proofErr w:type="spellStart"/>
+      <w:r>
+        <w:t>permission_denied</w:t>
+      </w:r>
+      <w:proofErr w:type="spellEnd"/>
+      <w:r>
+        <w:t>.</w:t>
       </w:r>
     </w:p>
     <w:p>
@@ -1372,8 +1901,61 @@
       </w:r>
     </w:p>
     <w:p>
-      <w:r>
-        <w:t>OraBooks_Team::update_role() and remove_user() call OraBooks_Auth::revoke_user_tokens(). OBN_Access_Control::log_role_change() records SL-003 audit trail. User must log in again to receive JWT with updated role.</w:t>
+      <w:proofErr w:type="spellStart"/>
+      <w:r>
+        <w:t>OraBooks_Team</w:t>
+      </w:r>
+      <w:proofErr w:type="spellEnd"/>
+      <w:r>
+        <w:t>::</w:t>
+      </w:r>
+      <w:proofErr w:type="spellStart"/>
+      <w:r>
+        <w:t>update_role</w:t>
+      </w:r>
+      <w:proofErr w:type="spellEnd"/>
+      <w:r>
+        <w:t xml:space="preserve">() and </w:t>
+      </w:r>
+      <w:proofErr w:type="spellStart"/>
+      <w:r>
+        <w:t>remove_user</w:t>
+      </w:r>
+      <w:proofErr w:type="spellEnd"/>
+      <w:r>
+        <w:t xml:space="preserve">() call </w:t>
+      </w:r>
+      <w:proofErr w:type="spellStart"/>
+      <w:r>
+        <w:t>OraBooks_Auth</w:t>
+      </w:r>
+      <w:proofErr w:type="spellEnd"/>
+      <w:r>
+        <w:t>::</w:t>
+      </w:r>
+      <w:proofErr w:type="spellStart"/>
+      <w:r>
+        <w:t>revoke_user_tokens</w:t>
+      </w:r>
+      <w:proofErr w:type="spellEnd"/>
+      <w:r>
+        <w:t xml:space="preserve">(). </w:t>
+      </w:r>
+      <w:proofErr w:type="spellStart"/>
+      <w:r>
+        <w:t>OBN_Access_Control</w:t>
+      </w:r>
+      <w:proofErr w:type="spellEnd"/>
+      <w:r>
+        <w:t>::</w:t>
+      </w:r>
+      <w:proofErr w:type="spellStart"/>
+      <w:r>
+        <w:t>log_role_change</w:t>
+      </w:r>
+      <w:proofErr w:type="spellEnd"/>
+      <w:r>
+        <w:t>() records SL-003 audit trail. User must log in again to receive JWT with updated role.</w:t>
       </w:r>
     </w:p>
     <w:p>
@@ -1386,16 +1968,74 @@
     </w:p>
     <w:p>
       <w:r>
-        <w:t>Partner orgs (organization_type = partner) cannot access accounting permissions even for owner role. OBN_Access_Control blocks view_reports, submit_transaction, approve_journal, COA, invoices, expenses, inventory, exports, and related permissions.</w:t>
-      </w:r>
-    </w:p>
-    <w:p>
-      <w:r>
-        <w:t xml:space="preserve">partner_commission_access: default Owner and Admin. Staff/Viewer allowed when organizations.partner_commission_for_staff_viewer = 1 or global option </w:t>
-      </w:r>
+        <w:t>Partner orgs (</w:t>
+      </w:r>
+      <w:proofErr w:type="spellStart"/>
+      <w:r>
+        <w:t>organization_type</w:t>
+      </w:r>
+      <w:proofErr w:type="spellEnd"/>
+      <w:r>
+        <w:t xml:space="preserve"> = partner) cannot access accounting permissions even for owner role. </w:t>
+      </w:r>
+      <w:proofErr w:type="spellStart"/>
+      <w:r>
+        <w:t>OBN_Access_Control</w:t>
+      </w:r>
+      <w:proofErr w:type="spellEnd"/>
+      <w:r>
+        <w:t xml:space="preserve"> blocks </w:t>
+      </w:r>
+      <w:proofErr w:type="spellStart"/>
+      <w:r>
+        <w:t>view_reports</w:t>
+      </w:r>
+      <w:proofErr w:type="spellEnd"/>
+      <w:r>
+        <w:t xml:space="preserve">, </w:t>
+      </w:r>
+      <w:proofErr w:type="spellStart"/>
+      <w:r>
+        <w:t>submit_transaction</w:t>
+      </w:r>
+      <w:proofErr w:type="spellEnd"/>
+      <w:r>
+        <w:t xml:space="preserve">, </w:t>
+      </w:r>
+      <w:proofErr w:type="spellStart"/>
+      <w:r>
+        <w:t>approve_journal</w:t>
+      </w:r>
+      <w:proofErr w:type="spellEnd"/>
+      <w:r>
+        <w:t>, COA, invoices, expenses, inventory, exports, and related permissions.</w:t>
+      </w:r>
+    </w:p>
+    <w:p>
+      <w:proofErr w:type="spellStart"/>
+      <w:r>
+        <w:t>partner_commission_access</w:t>
+      </w:r>
+      <w:proofErr w:type="spellEnd"/>
+      <w:r>
+        <w:t xml:space="preserve">: default Owner and Admin. Staff/Viewer allowed when </w:t>
+      </w:r>
+      <w:proofErr w:type="spellStart"/>
+      <w:r>
+        <w:t>organizations.partner_commission_for_staff_viewer</w:t>
+      </w:r>
+      <w:proofErr w:type="spellEnd"/>
+      <w:r>
+        <w:t xml:space="preserve"> = 1 or global option </w:t>
+      </w:r>
+      <w:proofErr w:type="spellStart"/>
       <w:r>
         <w:lastRenderedPageBreak/>
-        <w:t>orabooks_partner_commission_for_staff_viewer is enabled (ABAC). Partner nav shows Commissions/Onboarding only.</w:t>
+        <w:t>orabooks_partner_commission_for_staff_viewer</w:t>
+      </w:r>
+      <w:proofErr w:type="spellEnd"/>
+      <w:r>
+        <w:t xml:space="preserve"> is enabled (ABAC). Partner nav shows Commissions/Onboarding only.</w:t>
       </w:r>
     </w:p>
     <w:p>
@@ -1408,12 +2048,60 @@
     </w:p>
     <w:p>
       <w:r>
-        <w:t>Role badge: ClientShell sidebar shows Role: Owner/Staff/etc from frontendContext API.</w:t>
-      </w:r>
-    </w:p>
-    <w:p>
-      <w:r>
-        <w:t>Sidebar filtering: customerNav and partnerNav items tagged with permission; filterNavByPermissions hides unauthorized menu items.</w:t>
+        <w:t xml:space="preserve">Role badge: </w:t>
+      </w:r>
+      <w:proofErr w:type="spellStart"/>
+      <w:r>
+        <w:t>ClientShell</w:t>
+      </w:r>
+      <w:proofErr w:type="spellEnd"/>
+      <w:r>
+        <w:t xml:space="preserve"> sidebar shows Role: Owner/Staff/</w:t>
+      </w:r>
+      <w:proofErr w:type="spellStart"/>
+      <w:r>
+        <w:t>etc</w:t>
+      </w:r>
+      <w:proofErr w:type="spellEnd"/>
+      <w:r>
+        <w:t xml:space="preserve"> from </w:t>
+      </w:r>
+      <w:proofErr w:type="spellStart"/>
+      <w:r>
+        <w:t>frontendContext</w:t>
+      </w:r>
+      <w:proofErr w:type="spellEnd"/>
+      <w:r>
+        <w:t xml:space="preserve"> API.</w:t>
+      </w:r>
+    </w:p>
+    <w:p>
+      <w:r>
+        <w:t xml:space="preserve">Sidebar filtering: </w:t>
+      </w:r>
+      <w:proofErr w:type="spellStart"/>
+      <w:r>
+        <w:t>customerNav</w:t>
+      </w:r>
+      <w:proofErr w:type="spellEnd"/>
+      <w:r>
+        <w:t xml:space="preserve"> and </w:t>
+      </w:r>
+      <w:proofErr w:type="spellStart"/>
+      <w:r>
+        <w:t>partnerNav</w:t>
+      </w:r>
+      <w:proofErr w:type="spellEnd"/>
+      <w:r>
+        <w:t xml:space="preserve"> items tagged with permission; </w:t>
+      </w:r>
+      <w:proofErr w:type="spellStart"/>
+      <w:r>
+        <w:t>filterNavByPermissions</w:t>
+      </w:r>
+      <w:proofErr w:type="spellEnd"/>
+      <w:r>
+        <w:t xml:space="preserve"> hides unauthorized menu items.</w:t>
       </w:r>
     </w:p>
     <w:p>
@@ -1441,7 +2129,31 @@
     </w:p>
     <w:p>
       <w:r>
-        <w:t>Solution: Pending invite detected by email. Tier selection skipped. Login/2FA/OIDC auto-accepts invite via accept_pending_invite_for_user(). user_org row with invited role; users.org_id and JWT set to employer org; redirect to /team/ on employer subdomain. Tier selection API returns 403 while invite pending. Register page shows team invitation banner.</w:t>
+        <w:t xml:space="preserve">Solution: Pending invite detected by email. Tier selection skipped. Login/2FA/OIDC auto-accepts invite via </w:t>
+      </w:r>
+      <w:proofErr w:type="spellStart"/>
+      <w:r>
+        <w:t>accept_pending_invite_for_user</w:t>
+      </w:r>
+      <w:proofErr w:type="spellEnd"/>
+      <w:r>
+        <w:t xml:space="preserve">(). </w:t>
+      </w:r>
+      <w:proofErr w:type="spellStart"/>
+      <w:r>
+        <w:t>user_org</w:t>
+      </w:r>
+      <w:proofErr w:type="spellEnd"/>
+      <w:r>
+        <w:t xml:space="preserve"> row with invited role; </w:t>
+      </w:r>
+      <w:proofErr w:type="spellStart"/>
+      <w:r>
+        <w:t>users.org_id</w:t>
+      </w:r>
+      <w:proofErr w:type="spellEnd"/>
+      <w:r>
+        <w:t xml:space="preserve"> and JWT set to employer org; redirect to /team/ on employer subdomain. Tier selection API returns 403 while invite pending. Register page shows team invitation banner.</w:t>
       </w:r>
     </w:p>
     <w:p>
@@ -1459,17 +2171,209 @@
     </w:p>
     <w:p>
       <w:r>
-        <w:t>Backend: class-orabooks-rbac.php, class-obn-access-control.php, class-orabooks-team.php, class-orabooks-auth.php, class-orabooks-ajax.php, class-orabooks-two-factor.php, helpers.php, class-orabooks-database.php (permission_audit_log schema).</w:t>
-      </w:r>
-    </w:p>
-    <w:p>
-      <w:r>
-        <w:t>Frontend: orabooks-ui/src/pages/frontend/components/ClientShell.tsx, pages/TeamPage.tsx, RegisterPage.tsx, TierSelectionPage.tsx, lib/auth-routing.ts.</w:t>
-      </w:r>
-    </w:p>
-    <w:p>
-      <w:r>
-        <w:t>Tests: tests/OraBooks_RBAC_Test.php (9 tests, 28 assertions).</w:t>
+        <w:t>Backend: class-</w:t>
+      </w:r>
+      <w:proofErr w:type="spellStart"/>
+      <w:r>
+        <w:t>orabooks</w:t>
+      </w:r>
+      <w:proofErr w:type="spellEnd"/>
+      <w:r>
+        <w:t>-</w:t>
+      </w:r>
+      <w:proofErr w:type="spellStart"/>
+      <w:r>
+        <w:t>rbac.php</w:t>
+      </w:r>
+      <w:proofErr w:type="spellEnd"/>
+      <w:r>
+        <w:t>, class-</w:t>
+      </w:r>
+      <w:proofErr w:type="spellStart"/>
+      <w:r>
+        <w:t>obn</w:t>
+      </w:r>
+      <w:proofErr w:type="spellEnd"/>
+      <w:r>
+        <w:t>-access-</w:t>
+      </w:r>
+      <w:proofErr w:type="spellStart"/>
+      <w:r>
+        <w:t>control.php</w:t>
+      </w:r>
+      <w:proofErr w:type="spellEnd"/>
+      <w:r>
+        <w:t>, class-</w:t>
+      </w:r>
+      <w:proofErr w:type="spellStart"/>
+      <w:r>
+        <w:t>orabooks</w:t>
+      </w:r>
+      <w:proofErr w:type="spellEnd"/>
+      <w:r>
+        <w:t>-</w:t>
+      </w:r>
+      <w:proofErr w:type="spellStart"/>
+      <w:r>
+        <w:t>team.php</w:t>
+      </w:r>
+      <w:proofErr w:type="spellEnd"/>
+      <w:r>
+        <w:t>, class-</w:t>
+      </w:r>
+      <w:proofErr w:type="spellStart"/>
+      <w:r>
+        <w:t>orabooks</w:t>
+      </w:r>
+      <w:proofErr w:type="spellEnd"/>
+      <w:r>
+        <w:t>-</w:t>
+      </w:r>
+      <w:proofErr w:type="spellStart"/>
+      <w:r>
+        <w:t>auth.php</w:t>
+      </w:r>
+      <w:proofErr w:type="spellEnd"/>
+      <w:r>
+        <w:t>, class-</w:t>
+      </w:r>
+      <w:proofErr w:type="spellStart"/>
+      <w:r>
+        <w:t>orabooks</w:t>
+      </w:r>
+      <w:proofErr w:type="spellEnd"/>
+      <w:r>
+        <w:t>-</w:t>
+      </w:r>
+      <w:proofErr w:type="spellStart"/>
+      <w:r>
+        <w:t>ajax.php</w:t>
+      </w:r>
+      <w:proofErr w:type="spellEnd"/>
+      <w:r>
+        <w:t>, class-</w:t>
+      </w:r>
+      <w:proofErr w:type="spellStart"/>
+      <w:r>
+        <w:t>orabooks</w:t>
+      </w:r>
+      <w:proofErr w:type="spellEnd"/>
+      <w:r>
+        <w:t>-two-</w:t>
+      </w:r>
+      <w:proofErr w:type="spellStart"/>
+      <w:r>
+        <w:t>factor.php</w:t>
+      </w:r>
+      <w:proofErr w:type="spellEnd"/>
+      <w:r>
+        <w:t xml:space="preserve">, </w:t>
+      </w:r>
+      <w:proofErr w:type="spellStart"/>
+      <w:r>
+        <w:t>helpers.php</w:t>
+      </w:r>
+      <w:proofErr w:type="spellEnd"/>
+      <w:r>
+        <w:t>, class-</w:t>
+      </w:r>
+      <w:proofErr w:type="spellStart"/>
+      <w:r>
+        <w:t>orabooks</w:t>
+      </w:r>
+      <w:proofErr w:type="spellEnd"/>
+      <w:r>
+        <w:t>-</w:t>
+      </w:r>
+      <w:proofErr w:type="spellStart"/>
+      <w:r>
+        <w:t>database.php</w:t>
+      </w:r>
+      <w:proofErr w:type="spellEnd"/>
+      <w:r>
+        <w:t xml:space="preserve"> (</w:t>
+      </w:r>
+      <w:proofErr w:type="spellStart"/>
+      <w:r>
+        <w:t>permission_audit_log</w:t>
+      </w:r>
+      <w:proofErr w:type="spellEnd"/>
+      <w:r>
+        <w:t xml:space="preserve"> schema).</w:t>
+      </w:r>
+    </w:p>
+    <w:p>
+      <w:r>
+        <w:t xml:space="preserve">Frontend: </w:t>
+      </w:r>
+      <w:proofErr w:type="spellStart"/>
+      <w:r>
+        <w:t>orabooks-ui</w:t>
+      </w:r>
+      <w:proofErr w:type="spellEnd"/>
+      <w:r>
+        <w:t>/</w:t>
+      </w:r>
+      <w:proofErr w:type="spellStart"/>
+      <w:r>
+        <w:t>src</w:t>
+      </w:r>
+      <w:proofErr w:type="spellEnd"/>
+      <w:r>
+        <w:t>/pages/frontend/components/</w:t>
+      </w:r>
+      <w:proofErr w:type="spellStart"/>
+      <w:r>
+        <w:t>ClientShell.tsx</w:t>
+      </w:r>
+      <w:proofErr w:type="spellEnd"/>
+      <w:r>
+        <w:t>, pages/</w:t>
+      </w:r>
+      <w:proofErr w:type="spellStart"/>
+      <w:r>
+        <w:t>TeamPage.tsx</w:t>
+      </w:r>
+      <w:proofErr w:type="spellEnd"/>
+      <w:r>
+        <w:t xml:space="preserve">, </w:t>
+      </w:r>
+      <w:proofErr w:type="spellStart"/>
+      <w:r>
+        <w:t>RegisterPage.tsx</w:t>
+      </w:r>
+      <w:proofErr w:type="spellEnd"/>
+      <w:r>
+        <w:t xml:space="preserve">, </w:t>
+      </w:r>
+      <w:proofErr w:type="spellStart"/>
+      <w:r>
+        <w:t>TierSelectionPage.tsx</w:t>
+      </w:r>
+      <w:proofErr w:type="spellEnd"/>
+      <w:r>
+        <w:t>, lib/auth-</w:t>
+      </w:r>
+      <w:proofErr w:type="spellStart"/>
+      <w:r>
+        <w:t>routing.ts</w:t>
+      </w:r>
+      <w:proofErr w:type="spellEnd"/>
+      <w:r>
+        <w:t>.</w:t>
+      </w:r>
+    </w:p>
+    <w:p>
+      <w:r>
+        <w:t>Tests: tests/</w:t>
+      </w:r>
+      <w:proofErr w:type="spellStart"/>
+      <w:r>
+        <w:t>OraBooks_RBAC_Test.php</w:t>
+      </w:r>
+      <w:proofErr w:type="spellEnd"/>
+      <w:r>
+        <w:t xml:space="preserve"> (9 tests, 28 assertions).</w:t>
       </w:r>
     </w:p>
     <w:p>
@@ -1478,17 +2382,54 @@
       </w:pPr>
       <w:r>
         <w:lastRenderedPageBreak/>
-        <w:t>12. PHPUnit Verification</w:t>
-      </w:r>
-    </w:p>
-    <w:p>
-      <w:r>
-        <w:t>Command: cd "OraBooks Lean MVP/tests" &amp;&amp; vendor/bin/phpunit --configuration phpunit.xml OraBooks_RBAC_Test.php</w:t>
-      </w:r>
-    </w:p>
-    <w:p>
-      <w:r>
-        <w:t>Covers: five roles, deny-by-default, permission aliases, partner commission ABAC, partner accounting block, permission_audit_log row, refresh token revoke on role change, effective permissions, invite AJAX JSON, invite-first role assignment.</w:t>
+        <w:t xml:space="preserve">12. </w:t>
+      </w:r>
+      <w:proofErr w:type="spellStart"/>
+      <w:r>
+        <w:t>PHPUnit</w:t>
+      </w:r>
+      <w:proofErr w:type="spellEnd"/>
+      <w:r>
+        <w:t xml:space="preserve"> Verification</w:t>
+      </w:r>
+    </w:p>
+    <w:p>
+      <w:r>
+        <w:t>Command: cd "</w:t>
+      </w:r>
+      <w:proofErr w:type="spellStart"/>
+      <w:r>
+        <w:t>OraBooks</w:t>
+      </w:r>
+      <w:proofErr w:type="spellEnd"/>
+      <w:r>
+        <w:t xml:space="preserve"> Lean MVP/tests" &amp;&amp; vendor/bin/</w:t>
+      </w:r>
+      <w:proofErr w:type="spellStart"/>
+      <w:r>
+        <w:t>phpunit</w:t>
+      </w:r>
+      <w:proofErr w:type="spellEnd"/>
+      <w:r>
+        <w:t xml:space="preserve"> --configuration phpunit.xml </w:t>
+      </w:r>
+      <w:proofErr w:type="spellStart"/>
+      <w:r>
+        <w:t>OraBooks_RBAC_Test.php</w:t>
+      </w:r>
+      <w:proofErr w:type="spellEnd"/>
+    </w:p>
+    <w:p>
+      <w:r>
+        <w:t xml:space="preserve">Covers: five roles, deny-by-default, permission aliases, partner commission ABAC, partner accounting block, </w:t>
+      </w:r>
+      <w:proofErr w:type="spellStart"/>
+      <w:r>
+        <w:t>permission_audit_log</w:t>
+      </w:r>
+      <w:proofErr w:type="spellEnd"/>
+      <w:r>
+        <w:t xml:space="preserve"> row, refresh token revoke on role change, effective permissions, invite AJAX JSON, invite-first role assignment.</w:t>
       </w:r>
     </w:p>
     <w:p>
@@ -1526,7 +2467,15 @@
     </w:p>
     <w:p>
       <w:r>
-        <w:t>F. Permission denied: staff hits owner-only API; 403 and permission_denied audit row created.</w:t>
+        <w:t xml:space="preserve">F. Permission denied: staff hits owner-only API; 403 and </w:t>
+      </w:r>
+      <w:proofErr w:type="spellStart"/>
+      <w:r>
+        <w:t>permission_denied</w:t>
+      </w:r>
+      <w:proofErr w:type="spellEnd"/>
+      <w:r>
+        <w:t xml:space="preserve"> audit row created.</w:t>
       </w:r>
     </w:p>
     <w:p>
@@ -1539,22 +2488,62 @@
     </w:p>
     <w:p>
       <w:r>
-        <w:t>[Done] user_org role ENUM NOT NULL with five roles.</w:t>
-      </w:r>
-    </w:p>
-    <w:p>
-      <w:r>
-        <w:t>[Done] JWT role and org_id claims at login/refresh.</w:t>
-      </w:r>
-    </w:p>
-    <w:p>
-      <w:r>
-        <w:t>[Done] requirePermission middleware via OBN_Access_Control; deny-by-default.</w:t>
-      </w:r>
-    </w:p>
-    <w:p>
-      <w:r>
-        <w:t>[Done] API endpoints guarded with require_permission.</w:t>
+        <w:t xml:space="preserve">[Done] </w:t>
+      </w:r>
+      <w:proofErr w:type="spellStart"/>
+      <w:r>
+        <w:t>user_org</w:t>
+      </w:r>
+      <w:proofErr w:type="spellEnd"/>
+      <w:r>
+        <w:t xml:space="preserve"> role ENUM NOT NULL with five roles.</w:t>
+      </w:r>
+    </w:p>
+    <w:p>
+      <w:r>
+        <w:t xml:space="preserve">[Done] JWT role and </w:t>
+      </w:r>
+      <w:proofErr w:type="spellStart"/>
+      <w:r>
+        <w:t>org_id</w:t>
+      </w:r>
+      <w:proofErr w:type="spellEnd"/>
+      <w:r>
+        <w:t xml:space="preserve"> claims at login/refresh.</w:t>
+      </w:r>
+    </w:p>
+    <w:p>
+      <w:r>
+        <w:t xml:space="preserve">[Done] </w:t>
+      </w:r>
+      <w:proofErr w:type="spellStart"/>
+      <w:r>
+        <w:t>requirePermission</w:t>
+      </w:r>
+      <w:proofErr w:type="spellEnd"/>
+      <w:r>
+        <w:t xml:space="preserve"> middleware via </w:t>
+      </w:r>
+      <w:proofErr w:type="spellStart"/>
+      <w:r>
+        <w:t>OBN_Access_Control</w:t>
+      </w:r>
+      <w:proofErr w:type="spellEnd"/>
+      <w:r>
+        <w:t>; deny-by-default.</w:t>
+      </w:r>
+    </w:p>
+    <w:p>
+      <w:r>
+        <w:t xml:space="preserve">[Done] API endpoints guarded with </w:t>
+      </w:r>
+      <w:proofErr w:type="spellStart"/>
+      <w:r>
+        <w:t>require_permission</w:t>
+      </w:r>
+      <w:proofErr w:type="spellEnd"/>
+      <w:r>
+        <w:t>.</w:t>
       </w:r>
     </w:p>
     <w:p>
@@ -1564,7 +2553,15 @@
     </w:p>
     <w:p>
       <w:r>
-        <w:t>[Done] permission_denied audit in dedicated table.</w:t>
+        <w:t xml:space="preserve">[Done] </w:t>
+      </w:r>
+      <w:proofErr w:type="spellStart"/>
+      <w:r>
+        <w:t>permission_denied</w:t>
+      </w:r>
+      <w:proofErr w:type="spellEnd"/>
+      <w:r>
+        <w:t xml:space="preserve"> audit in dedicated table.</w:t>
       </w:r>
     </w:p>
     <w:p>
@@ -1574,7 +2571,15 @@
     </w:p>
     <w:p>
       <w:r>
-        <w:t>[Done] partner_commission_for_staff_viewer org config ABAC.</w:t>
+        <w:t xml:space="preserve">[Done] </w:t>
+      </w:r>
+      <w:proofErr w:type="spellStart"/>
+      <w:r>
+        <w:t>partner_commission_for_staff_viewer</w:t>
+      </w:r>
+      <w:proofErr w:type="spellEnd"/>
+      <w:r>
+        <w:t xml:space="preserve"> org config ABAC.</w:t>
       </w:r>
     </w:p>
     <w:p>
@@ -1584,7 +2589,15 @@
     </w:p>
     <w:p>
       <w:r>
-        <w:t>[Done] PHPUnit role/permission tests.</w:t>
+        <w:t xml:space="preserve">[Done] </w:t>
+      </w:r>
+      <w:proofErr w:type="spellStart"/>
+      <w:r>
+        <w:t>PHPUnit</w:t>
+      </w:r>
+      <w:proofErr w:type="spellEnd"/>
+      <w:r>
+        <w:t xml:space="preserve"> role/permission tests.</w:t>
       </w:r>
     </w:p>
     <w:p>

</xml_diff>

<commit_message>
Auto commit: 2026-06-21 17:31:58
</commit_message>
<xml_diff>
--- a/OraBooks Lean MVP/docs/rbac work report(morshed).docx
+++ b/OraBooks Lean MVP/docs/rbac work report(morshed).docx
@@ -6,13 +6,8 @@
       <w:pPr>
         <w:pStyle w:val="Title"/>
       </w:pPr>
-      <w:proofErr w:type="spellStart"/>
-      <w:r>
-        <w:t>OraBooks</w:t>
-      </w:r>
-      <w:proofErr w:type="spellEnd"/>
-      <w:r>
-        <w:t xml:space="preserve"> Lean MVP</w:t>
+      <w:r>
+        <w:t>OraBooks Lean MVP</w:t>
       </w:r>
     </w:p>
     <w:p>
@@ -25,20 +20,18 @@
     </w:p>
     <w:p>
       <w:r>
-        <w:t xml:space="preserve">Prepared for: Morshed / </w:t>
-      </w:r>
-      <w:proofErr w:type="spellStart"/>
-      <w:r>
-        <w:t>OraBooks</w:t>
-      </w:r>
-      <w:proofErr w:type="spellEnd"/>
-      <w:r>
-        <w:t xml:space="preserve"> Project Team</w:t>
-      </w:r>
-    </w:p>
-    <w:p>
-      <w:r>
-        <w:t>Date: 21 June 2026 | Spec: SL-003 RBAC/ABAC, SL-013 Auth, SL-014 Team, SL-004 Multi-tenant</w:t>
+        <w:t>Prepared for: Morshed / OraBooks Project Team</w:t>
+      </w:r>
+    </w:p>
+    <w:p>
+      <w:r>
+        <w:t>Date: 2</w:t>
+      </w:r>
+      <w:r>
+        <w:t>0</w:t>
+      </w:r>
+      <w:r>
+        <w:t xml:space="preserve"> June 2026 | Spec: SL-003 RBAC/ABAC, SL-013 Auth, SL-014 Team, SL-004 Multi-tenant</w:t>
       </w:r>
     </w:p>
     <w:p>
@@ -56,39 +49,7 @@
     </w:p>
     <w:p>
       <w:r>
-        <w:t xml:space="preserve">SL-003 implements org-scoped Role-Based Access Control across the </w:t>
-      </w:r>
-      <w:proofErr w:type="spellStart"/>
-      <w:r>
-        <w:t>OraBooks</w:t>
-      </w:r>
-      <w:proofErr w:type="spellEnd"/>
-      <w:r>
-        <w:t xml:space="preserve"> Lean MVP. Five fixed roles (owner, admin, approver, staff, viewer) map to a deny-by-default permission matrix. </w:t>
-      </w:r>
-      <w:proofErr w:type="spellStart"/>
-      <w:r>
-        <w:t>OBN_Access_Control</w:t>
-      </w:r>
-      <w:proofErr w:type="spellEnd"/>
-      <w:r>
-        <w:t xml:space="preserve"> is the central facade for permission checks, dedicated </w:t>
-      </w:r>
-      <w:proofErr w:type="spellStart"/>
-      <w:r>
-        <w:t>permission_denied</w:t>
-      </w:r>
-      <w:proofErr w:type="spellEnd"/>
-      <w:r>
-        <w:t xml:space="preserve"> audit logging, and UI permission matrix delivery. JWT carries </w:t>
-      </w:r>
-      <w:proofErr w:type="spellStart"/>
-      <w:r>
-        <w:t>org_id</w:t>
-      </w:r>
-      <w:proofErr w:type="spellEnd"/>
-      <w:r>
-        <w:t xml:space="preserve"> and role claims. Role changes revoke refresh tokens. Partner organizations are blocked from accounting APIs. Invited staff onboarding skips tier selection and auto-joins the employer org with the invited role.</w:t>
+        <w:t>SL-003 implements org-scoped Role-Based Access Control across the OraBooks Lean MVP. Five fixed roles (owner, admin, approver, staff, viewer) map to a deny-by-default permission matrix. OBN_Access_Control is the central facade for permission checks, dedicated permission_denied audit logging, and UI permission matrix delivery. JWT carries org_id and role claims. Role changes revoke refresh tokens. Partner organizations are blocked from accounting APIs. Invited staff onboarding skips tier selection and auto-joins the employer org with the invited role.</w:t>
       </w:r>
     </w:p>
     <w:p>
@@ -101,196 +62,12 @@
     </w:p>
     <w:p>
       <w:r>
-        <w:t xml:space="preserve">Request flow: API/AJAX handler calls </w:t>
-      </w:r>
-      <w:proofErr w:type="spellStart"/>
-      <w:r>
-        <w:t>OraBooks_RBAC</w:t>
-      </w:r>
-      <w:proofErr w:type="spellEnd"/>
-      <w:r>
-        <w:t>::</w:t>
-      </w:r>
-      <w:proofErr w:type="spellStart"/>
-      <w:r>
-        <w:t>require_permission</w:t>
-      </w:r>
-      <w:proofErr w:type="spellEnd"/>
-      <w:r>
-        <w:t xml:space="preserve">(), which delegates to </w:t>
-      </w:r>
-      <w:proofErr w:type="spellStart"/>
-      <w:r>
-        <w:t>OBN_Access_Control</w:t>
-      </w:r>
-      <w:proofErr w:type="spellEnd"/>
-      <w:r>
-        <w:t>::</w:t>
-      </w:r>
-      <w:proofErr w:type="spellStart"/>
-      <w:r>
-        <w:t>require_permission</w:t>
-      </w:r>
-      <w:proofErr w:type="spellEnd"/>
-      <w:r>
-        <w:t xml:space="preserve">(). Checks include alias normalization, org active status, cross-tenant validation, partner accounting block, then role matrix lookup. Denied attempts write to </w:t>
-      </w:r>
-      <w:proofErr w:type="spellStart"/>
-      <w:r>
-        <w:t>wp_orabooks_permission_audit_log</w:t>
-      </w:r>
-      <w:proofErr w:type="spellEnd"/>
-      <w:r>
-        <w:t xml:space="preserve"> and </w:t>
-      </w:r>
-      <w:proofErr w:type="spellStart"/>
-      <w:r>
-        <w:t>orabooks</w:t>
-      </w:r>
-      <w:proofErr w:type="spellEnd"/>
-      <w:r>
-        <w:t xml:space="preserve"> audit events.</w:t>
-      </w:r>
-    </w:p>
-    <w:p>
-      <w:r>
-        <w:t>Key files: includes/class-</w:t>
-      </w:r>
-      <w:proofErr w:type="spellStart"/>
-      <w:r>
-        <w:t>orabooks</w:t>
-      </w:r>
-      <w:proofErr w:type="spellEnd"/>
-      <w:r>
-        <w:t>-</w:t>
-      </w:r>
-      <w:proofErr w:type="spellStart"/>
-      <w:r>
-        <w:t>rbac.php</w:t>
-      </w:r>
-      <w:proofErr w:type="spellEnd"/>
-      <w:r>
-        <w:t>, includes/class-</w:t>
-      </w:r>
-      <w:proofErr w:type="spellStart"/>
-      <w:r>
-        <w:t>orabooks</w:t>
-      </w:r>
-      <w:proofErr w:type="spellEnd"/>
-      <w:r>
-        <w:t>-</w:t>
-      </w:r>
-      <w:proofErr w:type="spellStart"/>
-      <w:r>
-        <w:t>obn</w:t>
-      </w:r>
-      <w:proofErr w:type="spellEnd"/>
-      <w:r>
-        <w:t>-access-</w:t>
-      </w:r>
-      <w:proofErr w:type="spellStart"/>
-      <w:r>
-        <w:t>control.php</w:t>
-      </w:r>
-      <w:proofErr w:type="spellEnd"/>
-      <w:r>
-        <w:t xml:space="preserve"> (class-</w:t>
-      </w:r>
-      <w:proofErr w:type="spellStart"/>
-      <w:r>
-        <w:t>obn</w:t>
-      </w:r>
-      <w:proofErr w:type="spellEnd"/>
-      <w:r>
-        <w:t>-access-</w:t>
-      </w:r>
-      <w:proofErr w:type="spellStart"/>
-      <w:r>
-        <w:t>control.php</w:t>
-      </w:r>
-      <w:proofErr w:type="spellEnd"/>
-      <w:r>
-        <w:t>), includes/</w:t>
-      </w:r>
-      <w:proofErr w:type="spellStart"/>
-      <w:r>
-        <w:t>helpers.php</w:t>
-      </w:r>
-      <w:proofErr w:type="spellEnd"/>
-      <w:r>
-        <w:t>, includes/class-</w:t>
-      </w:r>
-      <w:proofErr w:type="spellStart"/>
-      <w:r>
-        <w:t>orabooks</w:t>
-      </w:r>
-      <w:proofErr w:type="spellEnd"/>
-      <w:r>
-        <w:t>-</w:t>
-      </w:r>
-      <w:proofErr w:type="spellStart"/>
-      <w:r>
-        <w:t>auth.php</w:t>
-      </w:r>
-      <w:proofErr w:type="spellEnd"/>
-      <w:r>
-        <w:t>, includes/class-</w:t>
-      </w:r>
-      <w:proofErr w:type="spellStart"/>
-      <w:r>
-        <w:t>orabooks</w:t>
-      </w:r>
-      <w:proofErr w:type="spellEnd"/>
-      <w:r>
-        <w:t>-</w:t>
-      </w:r>
-      <w:proofErr w:type="spellStart"/>
-      <w:r>
-        <w:t>team.php</w:t>
-      </w:r>
-      <w:proofErr w:type="spellEnd"/>
-      <w:r>
-        <w:t>, includes/class-</w:t>
-      </w:r>
-      <w:proofErr w:type="spellStart"/>
-      <w:r>
-        <w:t>orabooks</w:t>
-      </w:r>
-      <w:proofErr w:type="spellEnd"/>
-      <w:r>
-        <w:t>-</w:t>
-      </w:r>
-      <w:proofErr w:type="spellStart"/>
-      <w:r>
-        <w:t>ajax.php</w:t>
-      </w:r>
-      <w:proofErr w:type="spellEnd"/>
-      <w:r>
-        <w:t xml:space="preserve">, </w:t>
-      </w:r>
-      <w:proofErr w:type="spellStart"/>
-      <w:r>
-        <w:t>orabooks-ui</w:t>
-      </w:r>
-      <w:proofErr w:type="spellEnd"/>
-      <w:r>
-        <w:t xml:space="preserve"> </w:t>
-      </w:r>
-      <w:proofErr w:type="spellStart"/>
-      <w:r>
-        <w:t>ClientShell.tsx</w:t>
-      </w:r>
-      <w:proofErr w:type="spellEnd"/>
-      <w:r>
-        <w:t xml:space="preserve"> and </w:t>
-      </w:r>
-      <w:proofErr w:type="spellStart"/>
-      <w:r>
-        <w:t>TeamPage.tsx</w:t>
-      </w:r>
-      <w:proofErr w:type="spellEnd"/>
-      <w:r>
-        <w:t>.</w:t>
+        <w:t>Request flow: API/AJAX handler calls OraBooks_RBAC::require_permission(), which delegates to OBN_Access_Control::require_permission(). Checks include alias normalization, org active status, cross-tenant validation, partner accounting block, then role matrix lookup. Denied attempts write to wp_orabooks_permission_audit_log and orabooks audit events.</w:t>
+      </w:r>
+    </w:p>
+    <w:p>
+      <w:r>
+        <w:t>Key files: includes/class-orabooks-rbac.php, includes/class-orabooks-obn-access-control.php (class-obn-access-control.php), includes/helpers.php, includes/class-orabooks-auth.php, includes/class-orabooks-team.php, includes/class-orabooks-ajax.php, orabooks-ui ClientShell.tsx and TeamPage.tsx.</w:t>
       </w:r>
     </w:p>
     <w:p>
@@ -521,11 +298,9 @@
             <w:tcW w:w="1560" w:type="dxa"/>
           </w:tcPr>
           <w:p>
-            <w:proofErr w:type="spellStart"/>
             <w:r>
               <w:t>view_reports</w:t>
             </w:r>
-            <w:proofErr w:type="spellEnd"/>
           </w:p>
         </w:tc>
         <w:tc>
@@ -601,11 +376,9 @@
             <w:tcW w:w="1560" w:type="dxa"/>
           </w:tcPr>
           <w:p>
-            <w:proofErr w:type="spellStart"/>
             <w:r>
               <w:t>submit_transaction</w:t>
             </w:r>
-            <w:proofErr w:type="spellEnd"/>
           </w:p>
         </w:tc>
         <w:tc>
@@ -678,11 +451,9 @@
             <w:tcW w:w="1560" w:type="dxa"/>
           </w:tcPr>
           <w:p>
-            <w:proofErr w:type="spellStart"/>
             <w:r>
               <w:t>approve_journal</w:t>
             </w:r>
-            <w:proofErr w:type="spellEnd"/>
           </w:p>
         </w:tc>
         <w:tc>
@@ -752,19 +523,9 @@
             <w:tcW w:w="1560" w:type="dxa"/>
           </w:tcPr>
           <w:p>
-            <w:proofErr w:type="spellStart"/>
-            <w:r>
-              <w:t>manage_employees</w:t>
-            </w:r>
-            <w:proofErr w:type="spellEnd"/>
-            <w:r>
-              <w:t xml:space="preserve"> / </w:t>
-            </w:r>
-            <w:proofErr w:type="spellStart"/>
-            <w:r>
-              <w:t>invite_user</w:t>
-            </w:r>
-            <w:proofErr w:type="spellEnd"/>
+            <w:r>
+              <w:t>manage_employees / invite_user</w:t>
+            </w:r>
           </w:p>
         </w:tc>
         <w:tc>
@@ -834,19 +595,9 @@
             <w:tcW w:w="1560" w:type="dxa"/>
           </w:tcPr>
           <w:p>
-            <w:proofErr w:type="spellStart"/>
-            <w:r>
-              <w:t>manage_roles</w:t>
-            </w:r>
-            <w:proofErr w:type="spellEnd"/>
-            <w:r>
-              <w:t xml:space="preserve"> / </w:t>
-            </w:r>
-            <w:proofErr w:type="spellStart"/>
-            <w:r>
-              <w:t>change_role</w:t>
-            </w:r>
-            <w:proofErr w:type="spellEnd"/>
+            <w:r>
+              <w:t>manage_roles / change_role</w:t>
+            </w:r>
           </w:p>
         </w:tc>
         <w:tc>
@@ -910,11 +661,9 @@
             <w:tcW w:w="1560" w:type="dxa"/>
           </w:tcPr>
           <w:p>
-            <w:proofErr w:type="spellStart"/>
             <w:r>
               <w:t>remove_user</w:t>
             </w:r>
-            <w:proofErr w:type="spellEnd"/>
           </w:p>
         </w:tc>
         <w:tc>
@@ -981,11 +730,9 @@
             <w:tcW w:w="1560" w:type="dxa"/>
           </w:tcPr>
           <w:p>
-            <w:proofErr w:type="spellStart"/>
             <w:r>
               <w:t>manage_settings</w:t>
             </w:r>
-            <w:proofErr w:type="spellEnd"/>
           </w:p>
         </w:tc>
         <w:tc>
@@ -1052,11 +799,9 @@
             <w:tcW w:w="1560" w:type="dxa"/>
           </w:tcPr>
           <w:p>
-            <w:proofErr w:type="spellStart"/>
             <w:r>
               <w:t>view_coa</w:t>
             </w:r>
-            <w:proofErr w:type="spellEnd"/>
           </w:p>
         </w:tc>
         <w:tc>
@@ -1126,11 +871,9 @@
             <w:tcW w:w="1560" w:type="dxa"/>
           </w:tcPr>
           <w:p>
-            <w:proofErr w:type="spellStart"/>
             <w:r>
               <w:t>export_reports</w:t>
             </w:r>
-            <w:proofErr w:type="spellEnd"/>
           </w:p>
         </w:tc>
         <w:tc>
@@ -1200,11 +943,9 @@
             <w:tcW w:w="1560" w:type="dxa"/>
           </w:tcPr>
           <w:p>
-            <w:proofErr w:type="spellStart"/>
             <w:r>
               <w:t>view_audit_logs</w:t>
             </w:r>
-            <w:proofErr w:type="spellEnd"/>
           </w:p>
         </w:tc>
         <w:tc>
@@ -1274,11 +1015,9 @@
             <w:tcW w:w="1560" w:type="dxa"/>
           </w:tcPr>
           <w:p>
-            <w:proofErr w:type="spellStart"/>
             <w:r>
               <w:t>manage_inventory</w:t>
             </w:r>
-            <w:proofErr w:type="spellEnd"/>
           </w:p>
         </w:tc>
         <w:tc>
@@ -1348,11 +1087,9 @@
             <w:tcW w:w="1560" w:type="dxa"/>
           </w:tcPr>
           <w:p>
-            <w:proofErr w:type="spellStart"/>
             <w:r>
               <w:t>create_invoice</w:t>
             </w:r>
-            <w:proofErr w:type="spellEnd"/>
           </w:p>
         </w:tc>
         <w:tc>
@@ -1425,11 +1162,9 @@
             <w:tcW w:w="1560" w:type="dxa"/>
           </w:tcPr>
           <w:p>
-            <w:proofErr w:type="spellStart"/>
             <w:r>
               <w:t>partner_commission_access</w:t>
             </w:r>
-            <w:proofErr w:type="spellEnd"/>
           </w:p>
         </w:tc>
         <w:tc>
@@ -1502,11 +1237,9 @@
             <w:tcW w:w="1560" w:type="dxa"/>
           </w:tcPr>
           <w:p>
-            <w:proofErr w:type="spellStart"/>
             <w:r>
               <w:t>view_ai_review_queue</w:t>
             </w:r>
-            <w:proofErr w:type="spellEnd"/>
           </w:p>
         </w:tc>
         <w:tc>
@@ -1572,23 +1305,7 @@
     </w:tbl>
     <w:p>
       <w:r>
-        <w:t xml:space="preserve">* Staff/Viewer may receive </w:t>
-      </w:r>
-      <w:proofErr w:type="spellStart"/>
-      <w:r>
-        <w:t>partner_commission_access</w:t>
-      </w:r>
-      <w:proofErr w:type="spellEnd"/>
-      <w:r>
-        <w:t xml:space="preserve"> when org flag </w:t>
-      </w:r>
-      <w:proofErr w:type="spellStart"/>
-      <w:r>
-        <w:t>partner_commission_for_staff_viewer</w:t>
-      </w:r>
-      <w:proofErr w:type="spellEnd"/>
-      <w:r>
-        <w:t xml:space="preserve"> is enabled.</w:t>
+        <w:t>* Staff/Viewer may receive partner_commission_access when org flag partner_commission_for_staff_viewer is enabled.</w:t>
       </w:r>
     </w:p>
     <w:p>
@@ -1600,71 +1317,24 @@
       </w:r>
     </w:p>
     <w:p>
-      <w:proofErr w:type="spellStart"/>
-      <w:r>
-        <w:t>manage_employees</w:t>
-      </w:r>
-      <w:proofErr w:type="spellEnd"/>
-      <w:r>
-        <w:t xml:space="preserve"> maps to </w:t>
-      </w:r>
-      <w:proofErr w:type="spellStart"/>
-      <w:r>
-        <w:t>invite_user</w:t>
-      </w:r>
-      <w:proofErr w:type="spellEnd"/>
-      <w:r>
-        <w:t xml:space="preserve"> (Owner, Admin).</w:t>
-      </w:r>
-    </w:p>
-    <w:p>
-      <w:proofErr w:type="spellStart"/>
-      <w:r>
-        <w:t>manage_settings</w:t>
-      </w:r>
-      <w:proofErr w:type="spellEnd"/>
-      <w:r>
-        <w:t xml:space="preserve"> maps to </w:t>
-      </w:r>
-      <w:proofErr w:type="spellStart"/>
-      <w:r>
-        <w:t>manage_org_settings</w:t>
-      </w:r>
-      <w:proofErr w:type="spellEnd"/>
-      <w:r>
-        <w:t xml:space="preserve"> (Owner, Admin).</w:t>
-      </w:r>
-    </w:p>
-    <w:p>
-      <w:proofErr w:type="spellStart"/>
+      <w:r>
+        <w:t>manage_employees maps to invite_user (Owner, Admin).</w:t>
+      </w:r>
+    </w:p>
+    <w:p>
+      <w:r>
+        <w:t>manage_settings maps to manage_org_settings (Owner, Admin).</w:t>
+      </w:r>
+    </w:p>
+    <w:p>
       <w:r>
         <w:lastRenderedPageBreak/>
-        <w:t>manage_roles</w:t>
-      </w:r>
-      <w:proofErr w:type="spellEnd"/>
-      <w:r>
-        <w:t xml:space="preserve"> maps to </w:t>
-      </w:r>
-      <w:proofErr w:type="spellStart"/>
-      <w:r>
-        <w:t>change_role</w:t>
-      </w:r>
-      <w:proofErr w:type="spellEnd"/>
-      <w:r>
-        <w:t xml:space="preserve"> (Owner only).</w:t>
-      </w:r>
-    </w:p>
-    <w:p>
-      <w:r>
-        <w:t xml:space="preserve">Aliases are normalized on every permission check and exposed in frontend </w:t>
-      </w:r>
-      <w:proofErr w:type="spellStart"/>
-      <w:r>
-        <w:t>permission_matrix</w:t>
-      </w:r>
-      <w:proofErr w:type="spellEnd"/>
-      <w:r>
-        <w:t xml:space="preserve"> for sidebar and Team page.</w:t>
+        <w:t>manage_roles maps to change_role (Owner only).</w:t>
+      </w:r>
+    </w:p>
+    <w:p>
+      <w:r>
+        <w:t>Aliases are normalized on every permission check and exposed in frontend permission_matrix for sidebar and Team page.</w:t>
       </w:r>
     </w:p>
     <w:p>
@@ -1677,76 +1347,12 @@
     </w:p>
     <w:p>
       <w:r>
-        <w:t xml:space="preserve">JWT claims: </w:t>
-      </w:r>
-      <w:proofErr w:type="spellStart"/>
-      <w:r>
-        <w:t>user_id</w:t>
-      </w:r>
-      <w:proofErr w:type="spellEnd"/>
-      <w:r>
-        <w:t xml:space="preserve">, email, </w:t>
-      </w:r>
-      <w:proofErr w:type="spellStart"/>
-      <w:r>
-        <w:t>org_id</w:t>
-      </w:r>
-      <w:proofErr w:type="spellEnd"/>
-      <w:r>
-        <w:t xml:space="preserve">, role, subdomain, </w:t>
-      </w:r>
-      <w:proofErr w:type="spellStart"/>
-      <w:r>
-        <w:t>is_partner</w:t>
-      </w:r>
-      <w:proofErr w:type="spellEnd"/>
-      <w:r>
-        <w:t>, exp/</w:t>
-      </w:r>
-      <w:proofErr w:type="spellStart"/>
-      <w:r>
-        <w:t>iat</w:t>
-      </w:r>
-      <w:proofErr w:type="spellEnd"/>
-      <w:r>
-        <w:t>.</w:t>
-      </w:r>
-    </w:p>
-    <w:p>
-      <w:r>
-        <w:t xml:space="preserve">Role is read from </w:t>
-      </w:r>
-      <w:proofErr w:type="spellStart"/>
-      <w:r>
-        <w:t>user_org</w:t>
-      </w:r>
-      <w:proofErr w:type="spellEnd"/>
-      <w:r>
-        <w:t xml:space="preserve"> (with </w:t>
-      </w:r>
-      <w:proofErr w:type="spellStart"/>
-      <w:r>
-        <w:t>organizations.owner_id</w:t>
-      </w:r>
-      <w:proofErr w:type="spellEnd"/>
-      <w:r>
-        <w:t xml:space="preserve"> fallback) at login and refresh. </w:t>
-      </w:r>
-      <w:proofErr w:type="spellStart"/>
-      <w:r>
-        <w:t>orabooks_assert_tenant_access</w:t>
-      </w:r>
-      <w:proofErr w:type="spellEnd"/>
-      <w:r>
-        <w:t xml:space="preserve"> blocks JWT </w:t>
-      </w:r>
-      <w:proofErr w:type="spellStart"/>
-      <w:r>
-        <w:t>org_id</w:t>
-      </w:r>
-      <w:proofErr w:type="spellEnd"/>
-      <w:r>
-        <w:t xml:space="preserve"> mismatch. Refresh token rotation re-reads role from database. Role change revokes all refresh tokens for user in org forcing re-authentication.</w:t>
+        <w:t>JWT claims: user_id, email, org_id, role, subdomain, is_partner, exp/iat.</w:t>
+      </w:r>
+    </w:p>
+    <w:p>
+      <w:r>
+        <w:t>Role is read from user_org (with organizations.owner_id fallback) at login and refresh. orabooks_assert_tenant_access blocks JWT org_id mismatch. Refresh token rotation re-reads role from database. Role change revokes all refresh tokens for user in org forcing re-authentication.</w:t>
       </w:r>
     </w:p>
     <w:p>
@@ -1759,132 +1365,12 @@
     </w:p>
     <w:p>
       <w:r>
-        <w:t xml:space="preserve">Table: </w:t>
-      </w:r>
-      <w:proofErr w:type="spellStart"/>
-      <w:r>
-        <w:t>wp_orabooks_permission_audit_log</w:t>
-      </w:r>
-      <w:proofErr w:type="spellEnd"/>
-      <w:r>
-        <w:t xml:space="preserve"> with </w:t>
-      </w:r>
-      <w:proofErr w:type="spellStart"/>
-      <w:r>
-        <w:t>org_id</w:t>
-      </w:r>
-      <w:proofErr w:type="spellEnd"/>
-      <w:r>
-        <w:t xml:space="preserve">, </w:t>
-      </w:r>
-      <w:proofErr w:type="spellStart"/>
-      <w:r>
-        <w:t>user_id</w:t>
-      </w:r>
-      <w:proofErr w:type="spellEnd"/>
-      <w:r>
-        <w:t xml:space="preserve">, </w:t>
-      </w:r>
-      <w:proofErr w:type="spellStart"/>
-      <w:r>
-        <w:t>event_type</w:t>
-      </w:r>
-      <w:proofErr w:type="spellEnd"/>
-      <w:r>
-        <w:t xml:space="preserve"> </w:t>
-      </w:r>
-      <w:proofErr w:type="spellStart"/>
-      <w:r>
-        <w:t>permission_denied</w:t>
-      </w:r>
-      <w:proofErr w:type="spellEnd"/>
-      <w:r>
-        <w:t xml:space="preserve">, permission, role, reason, </w:t>
-      </w:r>
-      <w:proofErr w:type="spellStart"/>
-      <w:r>
-        <w:t>ip_address</w:t>
-      </w:r>
-      <w:proofErr w:type="spellEnd"/>
-      <w:r>
-        <w:t xml:space="preserve">, </w:t>
-      </w:r>
-      <w:proofErr w:type="spellStart"/>
-      <w:r>
-        <w:t>user_agent</w:t>
-      </w:r>
-      <w:proofErr w:type="spellEnd"/>
-      <w:r>
-        <w:t xml:space="preserve">, metadata JSON, </w:t>
-      </w:r>
-      <w:proofErr w:type="spellStart"/>
-      <w:r>
-        <w:t>created_at</w:t>
-      </w:r>
-      <w:proofErr w:type="spellEnd"/>
-      <w:r>
-        <w:t>.</w:t>
-      </w:r>
-    </w:p>
-    <w:p>
-      <w:r>
-        <w:t xml:space="preserve">Reason codes: </w:t>
-      </w:r>
-      <w:proofErr w:type="spellStart"/>
-      <w:r>
-        <w:t>missing_context</w:t>
-      </w:r>
-      <w:proofErr w:type="spellEnd"/>
-      <w:r>
-        <w:t xml:space="preserve">, </w:t>
-      </w:r>
-      <w:proofErr w:type="spellStart"/>
-      <w:r>
-        <w:t>cross_tenant</w:t>
-      </w:r>
-      <w:proofErr w:type="spellEnd"/>
-      <w:r>
-        <w:t xml:space="preserve">, </w:t>
-      </w:r>
-      <w:proofErr w:type="spellStart"/>
-      <w:r>
-        <w:t>missing_org</w:t>
-      </w:r>
-      <w:proofErr w:type="spellEnd"/>
-      <w:r>
-        <w:t xml:space="preserve">, </w:t>
-      </w:r>
-      <w:proofErr w:type="spellStart"/>
-      <w:r>
-        <w:t>inactive_org</w:t>
-      </w:r>
-      <w:proofErr w:type="spellEnd"/>
-      <w:r>
-        <w:t xml:space="preserve">, </w:t>
-      </w:r>
-      <w:proofErr w:type="spellStart"/>
-      <w:r>
-        <w:t>missing_role</w:t>
-      </w:r>
-      <w:proofErr w:type="spellEnd"/>
-      <w:r>
-        <w:t xml:space="preserve">, </w:t>
-      </w:r>
-      <w:proofErr w:type="spellStart"/>
-      <w:r>
-        <w:t>partner_accounting_blocked</w:t>
-      </w:r>
-      <w:proofErr w:type="spellEnd"/>
-      <w:r>
-        <w:t xml:space="preserve">, </w:t>
-      </w:r>
-      <w:proofErr w:type="spellStart"/>
-      <w:r>
-        <w:t>permission_denied</w:t>
-      </w:r>
-      <w:proofErr w:type="spellEnd"/>
-      <w:r>
-        <w:t>.</w:t>
+        <w:t>Table: wp_orabooks_permission_audit_log with org_id, user_id, event_type permission_denied, permission, role, reason, ip_address, user_agent, metadata JSON, created_at.</w:t>
+      </w:r>
+    </w:p>
+    <w:p>
+      <w:r>
+        <w:t>Reason codes: missing_context, cross_tenant, missing_org, inactive_org, missing_role, partner_accounting_blocked, permission_denied.</w:t>
       </w:r>
     </w:p>
     <w:p>
@@ -1901,61 +1387,8 @@
       </w:r>
     </w:p>
     <w:p>
-      <w:proofErr w:type="spellStart"/>
-      <w:r>
-        <w:t>OraBooks_Team</w:t>
-      </w:r>
-      <w:proofErr w:type="spellEnd"/>
-      <w:r>
-        <w:t>::</w:t>
-      </w:r>
-      <w:proofErr w:type="spellStart"/>
-      <w:r>
-        <w:t>update_role</w:t>
-      </w:r>
-      <w:proofErr w:type="spellEnd"/>
-      <w:r>
-        <w:t xml:space="preserve">() and </w:t>
-      </w:r>
-      <w:proofErr w:type="spellStart"/>
-      <w:r>
-        <w:t>remove_user</w:t>
-      </w:r>
-      <w:proofErr w:type="spellEnd"/>
-      <w:r>
-        <w:t xml:space="preserve">() call </w:t>
-      </w:r>
-      <w:proofErr w:type="spellStart"/>
-      <w:r>
-        <w:t>OraBooks_Auth</w:t>
-      </w:r>
-      <w:proofErr w:type="spellEnd"/>
-      <w:r>
-        <w:t>::</w:t>
-      </w:r>
-      <w:proofErr w:type="spellStart"/>
-      <w:r>
-        <w:t>revoke_user_tokens</w:t>
-      </w:r>
-      <w:proofErr w:type="spellEnd"/>
-      <w:r>
-        <w:t xml:space="preserve">(). </w:t>
-      </w:r>
-      <w:proofErr w:type="spellStart"/>
-      <w:r>
-        <w:t>OBN_Access_Control</w:t>
-      </w:r>
-      <w:proofErr w:type="spellEnd"/>
-      <w:r>
-        <w:t>::</w:t>
-      </w:r>
-      <w:proofErr w:type="spellStart"/>
-      <w:r>
-        <w:t>log_role_change</w:t>
-      </w:r>
-      <w:proofErr w:type="spellEnd"/>
-      <w:r>
-        <w:t>() records SL-003 audit trail. User must log in again to receive JWT with updated role.</w:t>
+      <w:r>
+        <w:t>OraBooks_Team::update_role() and remove_user() call OraBooks_Auth::revoke_user_tokens(). OBN_Access_Control::log_role_change() records SL-003 audit trail. User must log in again to receive JWT with updated role.</w:t>
       </w:r>
     </w:p>
     <w:p>
@@ -1968,74 +1401,16 @@
     </w:p>
     <w:p>
       <w:r>
-        <w:t>Partner orgs (</w:t>
-      </w:r>
-      <w:proofErr w:type="spellStart"/>
-      <w:r>
-        <w:t>organization_type</w:t>
-      </w:r>
-      <w:proofErr w:type="spellEnd"/>
-      <w:r>
-        <w:t xml:space="preserve"> = partner) cannot access accounting permissions even for owner role. </w:t>
-      </w:r>
-      <w:proofErr w:type="spellStart"/>
-      <w:r>
-        <w:t>OBN_Access_Control</w:t>
-      </w:r>
-      <w:proofErr w:type="spellEnd"/>
-      <w:r>
-        <w:t xml:space="preserve"> blocks </w:t>
-      </w:r>
-      <w:proofErr w:type="spellStart"/>
-      <w:r>
-        <w:t>view_reports</w:t>
-      </w:r>
-      <w:proofErr w:type="spellEnd"/>
-      <w:r>
-        <w:t xml:space="preserve">, </w:t>
-      </w:r>
-      <w:proofErr w:type="spellStart"/>
-      <w:r>
-        <w:t>submit_transaction</w:t>
-      </w:r>
-      <w:proofErr w:type="spellEnd"/>
-      <w:r>
-        <w:t xml:space="preserve">, </w:t>
-      </w:r>
-      <w:proofErr w:type="spellStart"/>
-      <w:r>
-        <w:t>approve_journal</w:t>
-      </w:r>
-      <w:proofErr w:type="spellEnd"/>
-      <w:r>
-        <w:t>, COA, invoices, expenses, inventory, exports, and related permissions.</w:t>
-      </w:r>
-    </w:p>
-    <w:p>
-      <w:proofErr w:type="spellStart"/>
-      <w:r>
-        <w:t>partner_commission_access</w:t>
-      </w:r>
-      <w:proofErr w:type="spellEnd"/>
-      <w:r>
-        <w:t xml:space="preserve">: default Owner and Admin. Staff/Viewer allowed when </w:t>
-      </w:r>
-      <w:proofErr w:type="spellStart"/>
-      <w:r>
-        <w:t>organizations.partner_commission_for_staff_viewer</w:t>
-      </w:r>
-      <w:proofErr w:type="spellEnd"/>
-      <w:r>
-        <w:t xml:space="preserve"> = 1 or global option </w:t>
-      </w:r>
-      <w:proofErr w:type="spellStart"/>
+        <w:t>Partner orgs (organization_type = partner) cannot access accounting permissions even for owner role. OBN_Access_Control blocks view_reports, submit_transaction, approve_journal, COA, invoices, expenses, inventory, exports, and related permissions.</w:t>
+      </w:r>
+    </w:p>
+    <w:p>
+      <w:r>
+        <w:t xml:space="preserve">partner_commission_access: default Owner and Admin. Staff/Viewer allowed when organizations.partner_commission_for_staff_viewer = 1 or global option </w:t>
+      </w:r>
       <w:r>
         <w:lastRenderedPageBreak/>
-        <w:t>orabooks_partner_commission_for_staff_viewer</w:t>
-      </w:r>
-      <w:proofErr w:type="spellEnd"/>
-      <w:r>
-        <w:t xml:space="preserve"> is enabled (ABAC). Partner nav shows Commissions/Onboarding only.</w:t>
+        <w:t>orabooks_partner_commission_for_staff_viewer is enabled (ABAC). Partner nav shows Commissions/Onboarding only.</w:t>
       </w:r>
     </w:p>
     <w:p>
@@ -2048,60 +1423,12 @@
     </w:p>
     <w:p>
       <w:r>
-        <w:t xml:space="preserve">Role badge: </w:t>
-      </w:r>
-      <w:proofErr w:type="spellStart"/>
-      <w:r>
-        <w:t>ClientShell</w:t>
-      </w:r>
-      <w:proofErr w:type="spellEnd"/>
-      <w:r>
-        <w:t xml:space="preserve"> sidebar shows Role: Owner/Staff/</w:t>
-      </w:r>
-      <w:proofErr w:type="spellStart"/>
-      <w:r>
-        <w:t>etc</w:t>
-      </w:r>
-      <w:proofErr w:type="spellEnd"/>
-      <w:r>
-        <w:t xml:space="preserve"> from </w:t>
-      </w:r>
-      <w:proofErr w:type="spellStart"/>
-      <w:r>
-        <w:t>frontendContext</w:t>
-      </w:r>
-      <w:proofErr w:type="spellEnd"/>
-      <w:r>
-        <w:t xml:space="preserve"> API.</w:t>
-      </w:r>
-    </w:p>
-    <w:p>
-      <w:r>
-        <w:t xml:space="preserve">Sidebar filtering: </w:t>
-      </w:r>
-      <w:proofErr w:type="spellStart"/>
-      <w:r>
-        <w:t>customerNav</w:t>
-      </w:r>
-      <w:proofErr w:type="spellEnd"/>
-      <w:r>
-        <w:t xml:space="preserve"> and </w:t>
-      </w:r>
-      <w:proofErr w:type="spellStart"/>
-      <w:r>
-        <w:t>partnerNav</w:t>
-      </w:r>
-      <w:proofErr w:type="spellEnd"/>
-      <w:r>
-        <w:t xml:space="preserve"> items tagged with permission; </w:t>
-      </w:r>
-      <w:proofErr w:type="spellStart"/>
-      <w:r>
-        <w:t>filterNavByPermissions</w:t>
-      </w:r>
-      <w:proofErr w:type="spellEnd"/>
-      <w:r>
-        <w:t xml:space="preserve"> hides unauthorized menu items.</w:t>
+        <w:t>Role badge: ClientShell sidebar shows Role: Owner/Staff/etc from frontendContext API.</w:t>
+      </w:r>
+    </w:p>
+    <w:p>
+      <w:r>
+        <w:t>Sidebar filtering: customerNav and partnerNav items tagged with permission; filterNavByPermissions hides unauthorized menu items.</w:t>
       </w:r>
     </w:p>
     <w:p>
@@ -2129,31 +1456,7 @@
     </w:p>
     <w:p>
       <w:r>
-        <w:t xml:space="preserve">Solution: Pending invite detected by email. Tier selection skipped. Login/2FA/OIDC auto-accepts invite via </w:t>
-      </w:r>
-      <w:proofErr w:type="spellStart"/>
-      <w:r>
-        <w:t>accept_pending_invite_for_user</w:t>
-      </w:r>
-      <w:proofErr w:type="spellEnd"/>
-      <w:r>
-        <w:t xml:space="preserve">(). </w:t>
-      </w:r>
-      <w:proofErr w:type="spellStart"/>
-      <w:r>
-        <w:t>user_org</w:t>
-      </w:r>
-      <w:proofErr w:type="spellEnd"/>
-      <w:r>
-        <w:t xml:space="preserve"> row with invited role; </w:t>
-      </w:r>
-      <w:proofErr w:type="spellStart"/>
-      <w:r>
-        <w:t>users.org_id</w:t>
-      </w:r>
-      <w:proofErr w:type="spellEnd"/>
-      <w:r>
-        <w:t xml:space="preserve"> and JWT set to employer org; redirect to /team/ on employer subdomain. Tier selection API returns 403 while invite pending. Register page shows team invitation banner.</w:t>
+        <w:t>Solution: Pending invite detected by email. Tier selection skipped. Login/2FA/OIDC auto-accepts invite via accept_pending_invite_for_user(). user_org row with invited role; users.org_id and JWT set to employer org; redirect to /team/ on employer subdomain. Tier selection API returns 403 while invite pending. Register page shows team invitation banner.</w:t>
       </w:r>
     </w:p>
     <w:p>
@@ -2171,209 +1474,17 @@
     </w:p>
     <w:p>
       <w:r>
-        <w:t>Backend: class-</w:t>
-      </w:r>
-      <w:proofErr w:type="spellStart"/>
-      <w:r>
-        <w:t>orabooks</w:t>
-      </w:r>
-      <w:proofErr w:type="spellEnd"/>
-      <w:r>
-        <w:t>-</w:t>
-      </w:r>
-      <w:proofErr w:type="spellStart"/>
-      <w:r>
-        <w:t>rbac.php</w:t>
-      </w:r>
-      <w:proofErr w:type="spellEnd"/>
-      <w:r>
-        <w:t>, class-</w:t>
-      </w:r>
-      <w:proofErr w:type="spellStart"/>
-      <w:r>
-        <w:t>obn</w:t>
-      </w:r>
-      <w:proofErr w:type="spellEnd"/>
-      <w:r>
-        <w:t>-access-</w:t>
-      </w:r>
-      <w:proofErr w:type="spellStart"/>
-      <w:r>
-        <w:t>control.php</w:t>
-      </w:r>
-      <w:proofErr w:type="spellEnd"/>
-      <w:r>
-        <w:t>, class-</w:t>
-      </w:r>
-      <w:proofErr w:type="spellStart"/>
-      <w:r>
-        <w:t>orabooks</w:t>
-      </w:r>
-      <w:proofErr w:type="spellEnd"/>
-      <w:r>
-        <w:t>-</w:t>
-      </w:r>
-      <w:proofErr w:type="spellStart"/>
-      <w:r>
-        <w:t>team.php</w:t>
-      </w:r>
-      <w:proofErr w:type="spellEnd"/>
-      <w:r>
-        <w:t>, class-</w:t>
-      </w:r>
-      <w:proofErr w:type="spellStart"/>
-      <w:r>
-        <w:t>orabooks</w:t>
-      </w:r>
-      <w:proofErr w:type="spellEnd"/>
-      <w:r>
-        <w:t>-</w:t>
-      </w:r>
-      <w:proofErr w:type="spellStart"/>
-      <w:r>
-        <w:t>auth.php</w:t>
-      </w:r>
-      <w:proofErr w:type="spellEnd"/>
-      <w:r>
-        <w:t>, class-</w:t>
-      </w:r>
-      <w:proofErr w:type="spellStart"/>
-      <w:r>
-        <w:t>orabooks</w:t>
-      </w:r>
-      <w:proofErr w:type="spellEnd"/>
-      <w:r>
-        <w:t>-</w:t>
-      </w:r>
-      <w:proofErr w:type="spellStart"/>
-      <w:r>
-        <w:t>ajax.php</w:t>
-      </w:r>
-      <w:proofErr w:type="spellEnd"/>
-      <w:r>
-        <w:t>, class-</w:t>
-      </w:r>
-      <w:proofErr w:type="spellStart"/>
-      <w:r>
-        <w:t>orabooks</w:t>
-      </w:r>
-      <w:proofErr w:type="spellEnd"/>
-      <w:r>
-        <w:t>-two-</w:t>
-      </w:r>
-      <w:proofErr w:type="spellStart"/>
-      <w:r>
-        <w:t>factor.php</w:t>
-      </w:r>
-      <w:proofErr w:type="spellEnd"/>
-      <w:r>
-        <w:t xml:space="preserve">, </w:t>
-      </w:r>
-      <w:proofErr w:type="spellStart"/>
-      <w:r>
-        <w:t>helpers.php</w:t>
-      </w:r>
-      <w:proofErr w:type="spellEnd"/>
-      <w:r>
-        <w:t>, class-</w:t>
-      </w:r>
-      <w:proofErr w:type="spellStart"/>
-      <w:r>
-        <w:t>orabooks</w:t>
-      </w:r>
-      <w:proofErr w:type="spellEnd"/>
-      <w:r>
-        <w:t>-</w:t>
-      </w:r>
-      <w:proofErr w:type="spellStart"/>
-      <w:r>
-        <w:t>database.php</w:t>
-      </w:r>
-      <w:proofErr w:type="spellEnd"/>
-      <w:r>
-        <w:t xml:space="preserve"> (</w:t>
-      </w:r>
-      <w:proofErr w:type="spellStart"/>
-      <w:r>
-        <w:t>permission_audit_log</w:t>
-      </w:r>
-      <w:proofErr w:type="spellEnd"/>
-      <w:r>
-        <w:t xml:space="preserve"> schema).</w:t>
-      </w:r>
-    </w:p>
-    <w:p>
-      <w:r>
-        <w:t xml:space="preserve">Frontend: </w:t>
-      </w:r>
-      <w:proofErr w:type="spellStart"/>
-      <w:r>
-        <w:t>orabooks-ui</w:t>
-      </w:r>
-      <w:proofErr w:type="spellEnd"/>
-      <w:r>
-        <w:t>/</w:t>
-      </w:r>
-      <w:proofErr w:type="spellStart"/>
-      <w:r>
-        <w:t>src</w:t>
-      </w:r>
-      <w:proofErr w:type="spellEnd"/>
-      <w:r>
-        <w:t>/pages/frontend/components/</w:t>
-      </w:r>
-      <w:proofErr w:type="spellStart"/>
-      <w:r>
-        <w:t>ClientShell.tsx</w:t>
-      </w:r>
-      <w:proofErr w:type="spellEnd"/>
-      <w:r>
-        <w:t>, pages/</w:t>
-      </w:r>
-      <w:proofErr w:type="spellStart"/>
-      <w:r>
-        <w:t>TeamPage.tsx</w:t>
-      </w:r>
-      <w:proofErr w:type="spellEnd"/>
-      <w:r>
-        <w:t xml:space="preserve">, </w:t>
-      </w:r>
-      <w:proofErr w:type="spellStart"/>
-      <w:r>
-        <w:t>RegisterPage.tsx</w:t>
-      </w:r>
-      <w:proofErr w:type="spellEnd"/>
-      <w:r>
-        <w:t xml:space="preserve">, </w:t>
-      </w:r>
-      <w:proofErr w:type="spellStart"/>
-      <w:r>
-        <w:t>TierSelectionPage.tsx</w:t>
-      </w:r>
-      <w:proofErr w:type="spellEnd"/>
-      <w:r>
-        <w:t>, lib/auth-</w:t>
-      </w:r>
-      <w:proofErr w:type="spellStart"/>
-      <w:r>
-        <w:t>routing.ts</w:t>
-      </w:r>
-      <w:proofErr w:type="spellEnd"/>
-      <w:r>
-        <w:t>.</w:t>
-      </w:r>
-    </w:p>
-    <w:p>
-      <w:r>
-        <w:t>Tests: tests/</w:t>
-      </w:r>
-      <w:proofErr w:type="spellStart"/>
-      <w:r>
-        <w:t>OraBooks_RBAC_Test.php</w:t>
-      </w:r>
-      <w:proofErr w:type="spellEnd"/>
-      <w:r>
-        <w:t xml:space="preserve"> (9 tests, 28 assertions).</w:t>
+        <w:t>Backend: class-orabooks-rbac.php, class-obn-access-control.php, class-orabooks-team.php, class-orabooks-auth.php, class-orabooks-ajax.php, class-orabooks-two-factor.php, helpers.php, class-orabooks-database.php (permission_audit_log schema).</w:t>
+      </w:r>
+    </w:p>
+    <w:p>
+      <w:r>
+        <w:t>Frontend: orabooks-ui/src/pages/frontend/components/ClientShell.tsx, pages/TeamPage.tsx, RegisterPage.tsx, TierSelectionPage.tsx, lib/auth-routing.ts.</w:t>
+      </w:r>
+    </w:p>
+    <w:p>
+      <w:r>
+        <w:t>Tests: tests/OraBooks_RBAC_Test.php (9 tests, 28 assertions).</w:t>
       </w:r>
     </w:p>
     <w:p>
@@ -2382,54 +1493,17 @@
       </w:pPr>
       <w:r>
         <w:lastRenderedPageBreak/>
-        <w:t xml:space="preserve">12. </w:t>
-      </w:r>
-      <w:proofErr w:type="spellStart"/>
-      <w:r>
-        <w:t>PHPUnit</w:t>
-      </w:r>
-      <w:proofErr w:type="spellEnd"/>
-      <w:r>
-        <w:t xml:space="preserve"> Verification</w:t>
-      </w:r>
-    </w:p>
-    <w:p>
-      <w:r>
-        <w:t>Command: cd "</w:t>
-      </w:r>
-      <w:proofErr w:type="spellStart"/>
-      <w:r>
-        <w:t>OraBooks</w:t>
-      </w:r>
-      <w:proofErr w:type="spellEnd"/>
-      <w:r>
-        <w:t xml:space="preserve"> Lean MVP/tests" &amp;&amp; vendor/bin/</w:t>
-      </w:r>
-      <w:proofErr w:type="spellStart"/>
-      <w:r>
-        <w:t>phpunit</w:t>
-      </w:r>
-      <w:proofErr w:type="spellEnd"/>
-      <w:r>
-        <w:t xml:space="preserve"> --configuration phpunit.xml </w:t>
-      </w:r>
-      <w:proofErr w:type="spellStart"/>
-      <w:r>
-        <w:t>OraBooks_RBAC_Test.php</w:t>
-      </w:r>
-      <w:proofErr w:type="spellEnd"/>
-    </w:p>
-    <w:p>
-      <w:r>
-        <w:t xml:space="preserve">Covers: five roles, deny-by-default, permission aliases, partner commission ABAC, partner accounting block, </w:t>
-      </w:r>
-      <w:proofErr w:type="spellStart"/>
-      <w:r>
-        <w:t>permission_audit_log</w:t>
-      </w:r>
-      <w:proofErr w:type="spellEnd"/>
-      <w:r>
-        <w:t xml:space="preserve"> row, refresh token revoke on role change, effective permissions, invite AJAX JSON, invite-first role assignment.</w:t>
+        <w:t>12. PHPUnit Verification</w:t>
+      </w:r>
+    </w:p>
+    <w:p>
+      <w:r>
+        <w:t>Command: cd "OraBooks Lean MVP/tests" &amp;&amp; vendor/bin/phpunit --configuration phpunit.xml OraBooks_RBAC_Test.php</w:t>
+      </w:r>
+    </w:p>
+    <w:p>
+      <w:r>
+        <w:t>Covers: five roles, deny-by-default, permission aliases, partner commission ABAC, partner accounting block, permission_audit_log row, refresh token revoke on role change, effective permissions, invite AJAX JSON, invite-first role assignment.</w:t>
       </w:r>
     </w:p>
     <w:p>
@@ -2467,15 +1541,7 @@
     </w:p>
     <w:p>
       <w:r>
-        <w:t xml:space="preserve">F. Permission denied: staff hits owner-only API; 403 and </w:t>
-      </w:r>
-      <w:proofErr w:type="spellStart"/>
-      <w:r>
-        <w:t>permission_denied</w:t>
-      </w:r>
-      <w:proofErr w:type="spellEnd"/>
-      <w:r>
-        <w:t xml:space="preserve"> audit row created.</w:t>
+        <w:t>F. Permission denied: staff hits owner-only API; 403 and permission_denied audit row created.</w:t>
       </w:r>
     </w:p>
     <w:p>
@@ -2488,62 +1554,22 @@
     </w:p>
     <w:p>
       <w:r>
-        <w:t xml:space="preserve">[Done] </w:t>
-      </w:r>
-      <w:proofErr w:type="spellStart"/>
-      <w:r>
-        <w:t>user_org</w:t>
-      </w:r>
-      <w:proofErr w:type="spellEnd"/>
-      <w:r>
-        <w:t xml:space="preserve"> role ENUM NOT NULL with five roles.</w:t>
-      </w:r>
-    </w:p>
-    <w:p>
-      <w:r>
-        <w:t xml:space="preserve">[Done] JWT role and </w:t>
-      </w:r>
-      <w:proofErr w:type="spellStart"/>
-      <w:r>
-        <w:t>org_id</w:t>
-      </w:r>
-      <w:proofErr w:type="spellEnd"/>
-      <w:r>
-        <w:t xml:space="preserve"> claims at login/refresh.</w:t>
-      </w:r>
-    </w:p>
-    <w:p>
-      <w:r>
-        <w:t xml:space="preserve">[Done] </w:t>
-      </w:r>
-      <w:proofErr w:type="spellStart"/>
-      <w:r>
-        <w:t>requirePermission</w:t>
-      </w:r>
-      <w:proofErr w:type="spellEnd"/>
-      <w:r>
-        <w:t xml:space="preserve"> middleware via </w:t>
-      </w:r>
-      <w:proofErr w:type="spellStart"/>
-      <w:r>
-        <w:t>OBN_Access_Control</w:t>
-      </w:r>
-      <w:proofErr w:type="spellEnd"/>
-      <w:r>
-        <w:t>; deny-by-default.</w:t>
-      </w:r>
-    </w:p>
-    <w:p>
-      <w:r>
-        <w:t xml:space="preserve">[Done] API endpoints guarded with </w:t>
-      </w:r>
-      <w:proofErr w:type="spellStart"/>
-      <w:r>
-        <w:t>require_permission</w:t>
-      </w:r>
-      <w:proofErr w:type="spellEnd"/>
-      <w:r>
-        <w:t>.</w:t>
+        <w:t>[Done] user_org role ENUM NOT NULL with five roles.</w:t>
+      </w:r>
+    </w:p>
+    <w:p>
+      <w:r>
+        <w:t>[Done] JWT role and org_id claims at login/refresh.</w:t>
+      </w:r>
+    </w:p>
+    <w:p>
+      <w:r>
+        <w:t>[Done] requirePermission middleware via OBN_Access_Control; deny-by-default.</w:t>
+      </w:r>
+    </w:p>
+    <w:p>
+      <w:r>
+        <w:t>[Done] API endpoints guarded with require_permission.</w:t>
       </w:r>
     </w:p>
     <w:p>
@@ -2553,15 +1579,7 @@
     </w:p>
     <w:p>
       <w:r>
-        <w:t xml:space="preserve">[Done] </w:t>
-      </w:r>
-      <w:proofErr w:type="spellStart"/>
-      <w:r>
-        <w:t>permission_denied</w:t>
-      </w:r>
-      <w:proofErr w:type="spellEnd"/>
-      <w:r>
-        <w:t xml:space="preserve"> audit in dedicated table.</w:t>
+        <w:t>[Done] permission_denied audit in dedicated table.</w:t>
       </w:r>
     </w:p>
     <w:p>
@@ -2571,15 +1589,7 @@
     </w:p>
     <w:p>
       <w:r>
-        <w:t xml:space="preserve">[Done] </w:t>
-      </w:r>
-      <w:proofErr w:type="spellStart"/>
-      <w:r>
-        <w:t>partner_commission_for_staff_viewer</w:t>
-      </w:r>
-      <w:proofErr w:type="spellEnd"/>
-      <w:r>
-        <w:t xml:space="preserve"> org config ABAC.</w:t>
+        <w:t>[Done] partner_commission_for_staff_viewer org config ABAC.</w:t>
       </w:r>
     </w:p>
     <w:p>
@@ -2589,15 +1599,7 @@
     </w:p>
     <w:p>
       <w:r>
-        <w:t xml:space="preserve">[Done] </w:t>
-      </w:r>
-      <w:proofErr w:type="spellStart"/>
-      <w:r>
-        <w:t>PHPUnit</w:t>
-      </w:r>
-      <w:proofErr w:type="spellEnd"/>
-      <w:r>
-        <w:t xml:space="preserve"> role/permission tests.</w:t>
+        <w:t>[Done] PHPUnit role/permission tests.</w:t>
       </w:r>
     </w:p>
     <w:p>

</xml_diff>

<commit_message>
Auto commit: 2026-06-21 17:32:16
</commit_message>
<xml_diff>
--- a/OraBooks Lean MVP/docs/rbac work report(morshed).docx
+++ b/OraBooks Lean MVP/docs/rbac work report(morshed).docx
@@ -6,8 +6,13 @@
       <w:pPr>
         <w:pStyle w:val="Title"/>
       </w:pPr>
-      <w:r>
-        <w:t>OraBooks Lean MVP</w:t>
+      <w:proofErr w:type="spellStart"/>
+      <w:r>
+        <w:t>OraBooks</w:t>
+      </w:r>
+      <w:proofErr w:type="spellEnd"/>
+      <w:r>
+        <w:t xml:space="preserve"> Lean MVP</w:t>
       </w:r>
     </w:p>
     <w:p>
@@ -20,19 +25,32 @@
     </w:p>
     <w:p>
       <w:r>
-        <w:t>Prepared for: Morshed / OraBooks Project Team</w:t>
-      </w:r>
-    </w:p>
-    <w:p>
-      <w:r>
-        <w:t>Date: 2</w:t>
-      </w:r>
-      <w:r>
-        <w:t>0</w:t>
-      </w:r>
-      <w:r>
-        <w:t xml:space="preserve"> June 2026 | Spec: SL-003 RBAC/ABAC, SL-013 Auth, SL-014 Team, SL-004 Multi-tenant</w:t>
-      </w:r>
+        <w:t xml:space="preserve">Prepared for: Morshed / </w:t>
+      </w:r>
+      <w:proofErr w:type="spellStart"/>
+      <w:r>
+        <w:t>OraBooks</w:t>
+      </w:r>
+      <w:proofErr w:type="spellEnd"/>
+      <w:r>
+        <w:t xml:space="preserve"> Project Team</w:t>
+      </w:r>
+    </w:p>
+    <w:p>
+      <w:r>
+        <w:t xml:space="preserve">Date: </w:t>
+      </w:r>
+      <w:r>
+        <w:t>18</w:t>
+      </w:r>
+      <w:r>
+        <w:t xml:space="preserve"> June 2026 | Spec: SL-003 RBAC/ABAC, SL-013 Auth, SL-014 Team, SL-004 </w:t>
+      </w:r>
+      <w:proofErr w:type="gramStart"/>
+      <w:r>
+        <w:t>Multi-tenant</w:t>
+      </w:r>
+      <w:proofErr w:type="gramEnd"/>
     </w:p>
     <w:p>
       <w:r>
@@ -49,7 +67,39 @@
     </w:p>
     <w:p>
       <w:r>
-        <w:t>SL-003 implements org-scoped Role-Based Access Control across the OraBooks Lean MVP. Five fixed roles (owner, admin, approver, staff, viewer) map to a deny-by-default permission matrix. OBN_Access_Control is the central facade for permission checks, dedicated permission_denied audit logging, and UI permission matrix delivery. JWT carries org_id and role claims. Role changes revoke refresh tokens. Partner organizations are blocked from accounting APIs. Invited staff onboarding skips tier selection and auto-joins the employer org with the invited role.</w:t>
+        <w:t xml:space="preserve">SL-003 implements org-scoped Role-Based Access Control across the </w:t>
+      </w:r>
+      <w:proofErr w:type="spellStart"/>
+      <w:r>
+        <w:t>OraBooks</w:t>
+      </w:r>
+      <w:proofErr w:type="spellEnd"/>
+      <w:r>
+        <w:t xml:space="preserve"> Lean MVP. Five fixed roles (owner, admin, approver, staff, viewer) map to a deny-by-default permission matrix. </w:t>
+      </w:r>
+      <w:proofErr w:type="spellStart"/>
+      <w:r>
+        <w:t>OBN_Access_Control</w:t>
+      </w:r>
+      <w:proofErr w:type="spellEnd"/>
+      <w:r>
+        <w:t xml:space="preserve"> is the central facade for permission checks, dedicated </w:t>
+      </w:r>
+      <w:proofErr w:type="spellStart"/>
+      <w:r>
+        <w:t>permission_denied</w:t>
+      </w:r>
+      <w:proofErr w:type="spellEnd"/>
+      <w:r>
+        <w:t xml:space="preserve"> audit logging, and UI permission matrix delivery. JWT carries </w:t>
+      </w:r>
+      <w:proofErr w:type="spellStart"/>
+      <w:r>
+        <w:t>org_id</w:t>
+      </w:r>
+      <w:proofErr w:type="spellEnd"/>
+      <w:r>
+        <w:t xml:space="preserve"> and role claims. Role changes revoke refresh tokens. Partner organizations are blocked from accounting APIs. Invited staff onboarding skips tier selection and auto-joins the employer org with the invited role.</w:t>
       </w:r>
     </w:p>
     <w:p>
@@ -62,12 +112,222 @@
     </w:p>
     <w:p>
       <w:r>
-        <w:t>Request flow: API/AJAX handler calls OraBooks_RBAC::require_permission(), which delegates to OBN_Access_Control::require_permission(). Checks include alias normalization, org active status, cross-tenant validation, partner accounting block, then role matrix lookup. Denied attempts write to wp_orabooks_permission_audit_log and orabooks audit events.</w:t>
-      </w:r>
-    </w:p>
-    <w:p>
-      <w:r>
-        <w:t>Key files: includes/class-orabooks-rbac.php, includes/class-orabooks-obn-access-control.php (class-obn-access-control.php), includes/helpers.php, includes/class-orabooks-auth.php, includes/class-orabooks-team.php, includes/class-orabooks-ajax.php, orabooks-ui ClientShell.tsx and TeamPage.tsx.</w:t>
+        <w:t xml:space="preserve">Request flow: API/AJAX handler calls </w:t>
+      </w:r>
+      <w:proofErr w:type="spellStart"/>
+      <w:r>
+        <w:t>OraBooks_</w:t>
+      </w:r>
+      <w:proofErr w:type="gramStart"/>
+      <w:r>
+        <w:t>RBAC</w:t>
+      </w:r>
+      <w:proofErr w:type="spellEnd"/>
+      <w:r>
+        <w:t>::</w:t>
+      </w:r>
+      <w:proofErr w:type="spellStart"/>
+      <w:proofErr w:type="gramEnd"/>
+      <w:r>
+        <w:t>require_</w:t>
+      </w:r>
+      <w:proofErr w:type="gramStart"/>
+      <w:r>
+        <w:t>permission</w:t>
+      </w:r>
+      <w:proofErr w:type="spellEnd"/>
+      <w:r>
+        <w:t>(</w:t>
+      </w:r>
+      <w:proofErr w:type="gramEnd"/>
+      <w:r>
+        <w:t xml:space="preserve">), which delegates to </w:t>
+      </w:r>
+      <w:proofErr w:type="spellStart"/>
+      <w:r>
+        <w:t>OBN_Access_</w:t>
+      </w:r>
+      <w:proofErr w:type="gramStart"/>
+      <w:r>
+        <w:t>Control</w:t>
+      </w:r>
+      <w:proofErr w:type="spellEnd"/>
+      <w:r>
+        <w:t>::</w:t>
+      </w:r>
+      <w:proofErr w:type="spellStart"/>
+      <w:proofErr w:type="gramEnd"/>
+      <w:r>
+        <w:t>require_</w:t>
+      </w:r>
+      <w:proofErr w:type="gramStart"/>
+      <w:r>
+        <w:t>permission</w:t>
+      </w:r>
+      <w:proofErr w:type="spellEnd"/>
+      <w:r>
+        <w:t>(</w:t>
+      </w:r>
+      <w:proofErr w:type="gramEnd"/>
+      <w:r>
+        <w:t xml:space="preserve">). Checks include alias normalization, org active status, cross-tenant validation, partner accounting block, then role matrix lookup. Denied attempts write to </w:t>
+      </w:r>
+      <w:proofErr w:type="spellStart"/>
+      <w:r>
+        <w:t>wp_orabooks_permission_audit_log</w:t>
+      </w:r>
+      <w:proofErr w:type="spellEnd"/>
+      <w:r>
+        <w:t xml:space="preserve"> and </w:t>
+      </w:r>
+      <w:proofErr w:type="spellStart"/>
+      <w:r>
+        <w:t>orabooks</w:t>
+      </w:r>
+      <w:proofErr w:type="spellEnd"/>
+      <w:r>
+        <w:t xml:space="preserve"> audit events.</w:t>
+      </w:r>
+    </w:p>
+    <w:p>
+      <w:r>
+        <w:t>Key files: includes/class-</w:t>
+      </w:r>
+      <w:proofErr w:type="spellStart"/>
+      <w:r>
+        <w:t>orabooks</w:t>
+      </w:r>
+      <w:proofErr w:type="spellEnd"/>
+      <w:r>
+        <w:t>-</w:t>
+      </w:r>
+      <w:proofErr w:type="spellStart"/>
+      <w:r>
+        <w:t>rbac.php</w:t>
+      </w:r>
+      <w:proofErr w:type="spellEnd"/>
+      <w:r>
+        <w:t>, includes/class-</w:t>
+      </w:r>
+      <w:proofErr w:type="spellStart"/>
+      <w:r>
+        <w:t>orabooks</w:t>
+      </w:r>
+      <w:proofErr w:type="spellEnd"/>
+      <w:r>
+        <w:t>-</w:t>
+      </w:r>
+      <w:proofErr w:type="spellStart"/>
+      <w:r>
+        <w:t>obn</w:t>
+      </w:r>
+      <w:proofErr w:type="spellEnd"/>
+      <w:r>
+        <w:t>-access-</w:t>
+      </w:r>
+      <w:proofErr w:type="spellStart"/>
+      <w:r>
+        <w:t>control.php</w:t>
+      </w:r>
+      <w:proofErr w:type="spellEnd"/>
+      <w:r>
+        <w:t xml:space="preserve"> (class-</w:t>
+      </w:r>
+      <w:proofErr w:type="spellStart"/>
+      <w:r>
+        <w:t>obn</w:t>
+      </w:r>
+      <w:proofErr w:type="spellEnd"/>
+      <w:r>
+        <w:t>-access-</w:t>
+      </w:r>
+      <w:proofErr w:type="spellStart"/>
+      <w:r>
+        <w:t>control.php</w:t>
+      </w:r>
+      <w:proofErr w:type="spellEnd"/>
+      <w:r>
+        <w:t>), includes/</w:t>
+      </w:r>
+      <w:proofErr w:type="spellStart"/>
+      <w:r>
+        <w:t>helpers.php</w:t>
+      </w:r>
+      <w:proofErr w:type="spellEnd"/>
+      <w:r>
+        <w:t>, includes/class-</w:t>
+      </w:r>
+      <w:proofErr w:type="spellStart"/>
+      <w:r>
+        <w:t>orabooks</w:t>
+      </w:r>
+      <w:proofErr w:type="spellEnd"/>
+      <w:r>
+        <w:t>-</w:t>
+      </w:r>
+      <w:proofErr w:type="spellStart"/>
+      <w:r>
+        <w:t>auth.php</w:t>
+      </w:r>
+      <w:proofErr w:type="spellEnd"/>
+      <w:r>
+        <w:t>, includes/class-</w:t>
+      </w:r>
+      <w:proofErr w:type="spellStart"/>
+      <w:r>
+        <w:t>orabooks</w:t>
+      </w:r>
+      <w:proofErr w:type="spellEnd"/>
+      <w:r>
+        <w:t>-</w:t>
+      </w:r>
+      <w:proofErr w:type="spellStart"/>
+      <w:r>
+        <w:t>team.php</w:t>
+      </w:r>
+      <w:proofErr w:type="spellEnd"/>
+      <w:r>
+        <w:t>, includes/class-</w:t>
+      </w:r>
+      <w:proofErr w:type="spellStart"/>
+      <w:r>
+        <w:t>orabooks</w:t>
+      </w:r>
+      <w:proofErr w:type="spellEnd"/>
+      <w:r>
+        <w:t>-</w:t>
+      </w:r>
+      <w:proofErr w:type="spellStart"/>
+      <w:r>
+        <w:t>ajax.php</w:t>
+      </w:r>
+      <w:proofErr w:type="spellEnd"/>
+      <w:r>
+        <w:t xml:space="preserve">, </w:t>
+      </w:r>
+      <w:proofErr w:type="spellStart"/>
+      <w:r>
+        <w:t>orabooks-ui</w:t>
+      </w:r>
+      <w:proofErr w:type="spellEnd"/>
+      <w:r>
+        <w:t xml:space="preserve"> </w:t>
+      </w:r>
+      <w:proofErr w:type="spellStart"/>
+      <w:r>
+        <w:t>ClientShell.tsx</w:t>
+      </w:r>
+      <w:proofErr w:type="spellEnd"/>
+      <w:r>
+        <w:t xml:space="preserve"> and </w:t>
+      </w:r>
+      <w:proofErr w:type="spellStart"/>
+      <w:r>
+        <w:t>TeamPage.tsx</w:t>
+      </w:r>
+      <w:proofErr w:type="spellEnd"/>
+      <w:r>
+        <w:t>.</w:t>
       </w:r>
     </w:p>
     <w:p>
@@ -298,9 +558,11 @@
             <w:tcW w:w="1560" w:type="dxa"/>
           </w:tcPr>
           <w:p>
+            <w:proofErr w:type="spellStart"/>
             <w:r>
               <w:t>view_reports</w:t>
             </w:r>
+            <w:proofErr w:type="spellEnd"/>
           </w:p>
         </w:tc>
         <w:tc>
@@ -376,9 +638,11 @@
             <w:tcW w:w="1560" w:type="dxa"/>
           </w:tcPr>
           <w:p>
+            <w:proofErr w:type="spellStart"/>
             <w:r>
               <w:t>submit_transaction</w:t>
             </w:r>
+            <w:proofErr w:type="spellEnd"/>
           </w:p>
         </w:tc>
         <w:tc>
@@ -451,9 +715,11 @@
             <w:tcW w:w="1560" w:type="dxa"/>
           </w:tcPr>
           <w:p>
+            <w:proofErr w:type="spellStart"/>
             <w:r>
               <w:t>approve_journal</w:t>
             </w:r>
+            <w:proofErr w:type="spellEnd"/>
           </w:p>
         </w:tc>
         <w:tc>
@@ -523,9 +789,19 @@
             <w:tcW w:w="1560" w:type="dxa"/>
           </w:tcPr>
           <w:p>
-            <w:r>
-              <w:t>manage_employees / invite_user</w:t>
-            </w:r>
+            <w:proofErr w:type="spellStart"/>
+            <w:r>
+              <w:t>manage_employees</w:t>
+            </w:r>
+            <w:proofErr w:type="spellEnd"/>
+            <w:r>
+              <w:t xml:space="preserve"> / </w:t>
+            </w:r>
+            <w:proofErr w:type="spellStart"/>
+            <w:r>
+              <w:t>invite_user</w:t>
+            </w:r>
+            <w:proofErr w:type="spellEnd"/>
           </w:p>
         </w:tc>
         <w:tc>
@@ -595,9 +871,19 @@
             <w:tcW w:w="1560" w:type="dxa"/>
           </w:tcPr>
           <w:p>
-            <w:r>
-              <w:t>manage_roles / change_role</w:t>
-            </w:r>
+            <w:proofErr w:type="spellStart"/>
+            <w:r>
+              <w:t>manage_roles</w:t>
+            </w:r>
+            <w:proofErr w:type="spellEnd"/>
+            <w:r>
+              <w:t xml:space="preserve"> / </w:t>
+            </w:r>
+            <w:proofErr w:type="spellStart"/>
+            <w:r>
+              <w:t>change_role</w:t>
+            </w:r>
+            <w:proofErr w:type="spellEnd"/>
           </w:p>
         </w:tc>
         <w:tc>
@@ -661,9 +947,11 @@
             <w:tcW w:w="1560" w:type="dxa"/>
           </w:tcPr>
           <w:p>
+            <w:proofErr w:type="spellStart"/>
             <w:r>
               <w:t>remove_user</w:t>
             </w:r>
+            <w:proofErr w:type="spellEnd"/>
           </w:p>
         </w:tc>
         <w:tc>
@@ -730,9 +1018,11 @@
             <w:tcW w:w="1560" w:type="dxa"/>
           </w:tcPr>
           <w:p>
+            <w:proofErr w:type="spellStart"/>
             <w:r>
               <w:t>manage_settings</w:t>
             </w:r>
+            <w:proofErr w:type="spellEnd"/>
           </w:p>
         </w:tc>
         <w:tc>
@@ -799,9 +1089,11 @@
             <w:tcW w:w="1560" w:type="dxa"/>
           </w:tcPr>
           <w:p>
+            <w:proofErr w:type="spellStart"/>
             <w:r>
               <w:t>view_coa</w:t>
             </w:r>
+            <w:proofErr w:type="spellEnd"/>
           </w:p>
         </w:tc>
         <w:tc>
@@ -871,9 +1163,11 @@
             <w:tcW w:w="1560" w:type="dxa"/>
           </w:tcPr>
           <w:p>
+            <w:proofErr w:type="spellStart"/>
             <w:r>
               <w:t>export_reports</w:t>
             </w:r>
+            <w:proofErr w:type="spellEnd"/>
           </w:p>
         </w:tc>
         <w:tc>
@@ -943,9 +1237,11 @@
             <w:tcW w:w="1560" w:type="dxa"/>
           </w:tcPr>
           <w:p>
+            <w:proofErr w:type="spellStart"/>
             <w:r>
               <w:t>view_audit_logs</w:t>
             </w:r>
+            <w:proofErr w:type="spellEnd"/>
           </w:p>
         </w:tc>
         <w:tc>
@@ -1015,9 +1311,11 @@
             <w:tcW w:w="1560" w:type="dxa"/>
           </w:tcPr>
           <w:p>
+            <w:proofErr w:type="spellStart"/>
             <w:r>
               <w:t>manage_inventory</w:t>
             </w:r>
+            <w:proofErr w:type="spellEnd"/>
           </w:p>
         </w:tc>
         <w:tc>
@@ -1087,9 +1385,11 @@
             <w:tcW w:w="1560" w:type="dxa"/>
           </w:tcPr>
           <w:p>
+            <w:proofErr w:type="spellStart"/>
             <w:r>
               <w:t>create_invoice</w:t>
             </w:r>
+            <w:proofErr w:type="spellEnd"/>
           </w:p>
         </w:tc>
         <w:tc>
@@ -1162,9 +1462,11 @@
             <w:tcW w:w="1560" w:type="dxa"/>
           </w:tcPr>
           <w:p>
+            <w:proofErr w:type="spellStart"/>
             <w:r>
               <w:t>partner_commission_access</w:t>
             </w:r>
+            <w:proofErr w:type="spellEnd"/>
           </w:p>
         </w:tc>
         <w:tc>
@@ -1237,9 +1539,11 @@
             <w:tcW w:w="1560" w:type="dxa"/>
           </w:tcPr>
           <w:p>
+            <w:proofErr w:type="spellStart"/>
             <w:r>
               <w:t>view_ai_review_queue</w:t>
             </w:r>
+            <w:proofErr w:type="spellEnd"/>
           </w:p>
         </w:tc>
         <w:tc>
@@ -1305,7 +1609,23 @@
     </w:tbl>
     <w:p>
       <w:r>
-        <w:t>* Staff/Viewer may receive partner_commission_access when org flag partner_commission_for_staff_viewer is enabled.</w:t>
+        <w:t xml:space="preserve">* Staff/Viewer may receive </w:t>
+      </w:r>
+      <w:proofErr w:type="spellStart"/>
+      <w:r>
+        <w:t>partner_commission_access</w:t>
+      </w:r>
+      <w:proofErr w:type="spellEnd"/>
+      <w:r>
+        <w:t xml:space="preserve"> when org flag </w:t>
+      </w:r>
+      <w:proofErr w:type="spellStart"/>
+      <w:r>
+        <w:t>partner_commission_for_staff_viewer</w:t>
+      </w:r>
+      <w:proofErr w:type="spellEnd"/>
+      <w:r>
+        <w:t xml:space="preserve"> is enabled.</w:t>
       </w:r>
     </w:p>
     <w:p>
@@ -1317,24 +1637,71 @@
       </w:r>
     </w:p>
     <w:p>
-      <w:r>
-        <w:t>manage_employees maps to invite_user (Owner, Admin).</w:t>
-      </w:r>
-    </w:p>
-    <w:p>
-      <w:r>
-        <w:t>manage_settings maps to manage_org_settings (Owner, Admin).</w:t>
-      </w:r>
-    </w:p>
-    <w:p>
+      <w:proofErr w:type="spellStart"/>
+      <w:r>
+        <w:t>manage_employees</w:t>
+      </w:r>
+      <w:proofErr w:type="spellEnd"/>
+      <w:r>
+        <w:t xml:space="preserve"> maps to </w:t>
+      </w:r>
+      <w:proofErr w:type="spellStart"/>
+      <w:r>
+        <w:t>invite_user</w:t>
+      </w:r>
+      <w:proofErr w:type="spellEnd"/>
+      <w:r>
+        <w:t xml:space="preserve"> (Owner, Admin).</w:t>
+      </w:r>
+    </w:p>
+    <w:p>
+      <w:proofErr w:type="spellStart"/>
+      <w:r>
+        <w:t>manage_settings</w:t>
+      </w:r>
+      <w:proofErr w:type="spellEnd"/>
+      <w:r>
+        <w:t xml:space="preserve"> maps to </w:t>
+      </w:r>
+      <w:proofErr w:type="spellStart"/>
+      <w:r>
+        <w:t>manage_org_settings</w:t>
+      </w:r>
+      <w:proofErr w:type="spellEnd"/>
+      <w:r>
+        <w:t xml:space="preserve"> (Owner, Admin).</w:t>
+      </w:r>
+    </w:p>
+    <w:p>
+      <w:proofErr w:type="spellStart"/>
       <w:r>
         <w:lastRenderedPageBreak/>
-        <w:t>manage_roles maps to change_role (Owner only).</w:t>
-      </w:r>
-    </w:p>
-    <w:p>
-      <w:r>
-        <w:t>Aliases are normalized on every permission check and exposed in frontend permission_matrix for sidebar and Team page.</w:t>
+        <w:t>manage_roles</w:t>
+      </w:r>
+      <w:proofErr w:type="spellEnd"/>
+      <w:r>
+        <w:t xml:space="preserve"> maps to </w:t>
+      </w:r>
+      <w:proofErr w:type="spellStart"/>
+      <w:r>
+        <w:t>change_role</w:t>
+      </w:r>
+      <w:proofErr w:type="spellEnd"/>
+      <w:r>
+        <w:t xml:space="preserve"> (Owner only).</w:t>
+      </w:r>
+    </w:p>
+    <w:p>
+      <w:r>
+        <w:t xml:space="preserve">Aliases are normalized on every permission check and exposed in frontend </w:t>
+      </w:r>
+      <w:proofErr w:type="spellStart"/>
+      <w:r>
+        <w:t>permission_matrix</w:t>
+      </w:r>
+      <w:proofErr w:type="spellEnd"/>
+      <w:r>
+        <w:t xml:space="preserve"> for sidebar and Team page.</w:t>
       </w:r>
     </w:p>
     <w:p>
@@ -1347,12 +1714,89 @@
     </w:p>
     <w:p>
       <w:r>
-        <w:t>JWT claims: user_id, email, org_id, role, subdomain, is_partner, exp/iat.</w:t>
-      </w:r>
-    </w:p>
-    <w:p>
-      <w:r>
-        <w:t>Role is read from user_org (with organizations.owner_id fallback) at login and refresh. orabooks_assert_tenant_access blocks JWT org_id mismatch. Refresh token rotation re-reads role from database. Role change revokes all refresh tokens for user in org forcing re-authentication.</w:t>
+        <w:t xml:space="preserve">JWT claims: </w:t>
+      </w:r>
+      <w:proofErr w:type="spellStart"/>
+      <w:r>
+        <w:t>user_id</w:t>
+      </w:r>
+      <w:proofErr w:type="spellEnd"/>
+      <w:r>
+        <w:t xml:space="preserve">, email, </w:t>
+      </w:r>
+      <w:proofErr w:type="spellStart"/>
+      <w:r>
+        <w:t>org_id</w:t>
+      </w:r>
+      <w:proofErr w:type="spellEnd"/>
+      <w:r>
+        <w:t xml:space="preserve">, role, subdomain, </w:t>
+      </w:r>
+      <w:proofErr w:type="spellStart"/>
+      <w:r>
+        <w:t>is_partner</w:t>
+      </w:r>
+      <w:proofErr w:type="spellEnd"/>
+      <w:r>
+        <w:t>, exp/</w:t>
+      </w:r>
+      <w:proofErr w:type="spellStart"/>
+      <w:r>
+        <w:t>iat</w:t>
+      </w:r>
+      <w:proofErr w:type="spellEnd"/>
+      <w:r>
+        <w:t>.</w:t>
+      </w:r>
+    </w:p>
+    <w:p>
+      <w:r>
+        <w:t xml:space="preserve">Role is read from </w:t>
+      </w:r>
+      <w:proofErr w:type="spellStart"/>
+      <w:r>
+        <w:t>user_org</w:t>
+      </w:r>
+      <w:proofErr w:type="spellEnd"/>
+      <w:r>
+        <w:t xml:space="preserve"> (with </w:t>
+      </w:r>
+      <w:proofErr w:type="spellStart"/>
+      <w:proofErr w:type="gramStart"/>
+      <w:r>
+        <w:t>organizations.owner</w:t>
+      </w:r>
+      <w:proofErr w:type="gramEnd"/>
+      <w:r>
+        <w:t>_id</w:t>
+      </w:r>
+      <w:proofErr w:type="spellEnd"/>
+      <w:r>
+        <w:t xml:space="preserve"> fallback) at login and refresh. </w:t>
+      </w:r>
+      <w:proofErr w:type="spellStart"/>
+      <w:r>
+        <w:t>orabooks_assert_tenant_access</w:t>
+      </w:r>
+      <w:proofErr w:type="spellEnd"/>
+      <w:r>
+        <w:t xml:space="preserve"> blocks JWT </w:t>
+      </w:r>
+      <w:proofErr w:type="spellStart"/>
+      <w:r>
+        <w:t>org_id</w:t>
+      </w:r>
+      <w:proofErr w:type="spellEnd"/>
+      <w:r>
+        <w:t xml:space="preserve"> mismatch. Refresh token rotation re-</w:t>
+      </w:r>
+      <w:proofErr w:type="gramStart"/>
+      <w:r>
+        <w:t>reads</w:t>
+      </w:r>
+      <w:proofErr w:type="gramEnd"/>
+      <w:r>
+        <w:t xml:space="preserve"> role from database. Role change revokes all refresh tokens for user in org forcing re-authentication.</w:t>
       </w:r>
     </w:p>
     <w:p>
@@ -1365,12 +1809,132 @@
     </w:p>
     <w:p>
       <w:r>
-        <w:t>Table: wp_orabooks_permission_audit_log with org_id, user_id, event_type permission_denied, permission, role, reason, ip_address, user_agent, metadata JSON, created_at.</w:t>
-      </w:r>
-    </w:p>
-    <w:p>
-      <w:r>
-        <w:t>Reason codes: missing_context, cross_tenant, missing_org, inactive_org, missing_role, partner_accounting_blocked, permission_denied.</w:t>
+        <w:t xml:space="preserve">Table: </w:t>
+      </w:r>
+      <w:proofErr w:type="spellStart"/>
+      <w:r>
+        <w:t>wp_orabooks_permission_audit_log</w:t>
+      </w:r>
+      <w:proofErr w:type="spellEnd"/>
+      <w:r>
+        <w:t xml:space="preserve"> with </w:t>
+      </w:r>
+      <w:proofErr w:type="spellStart"/>
+      <w:r>
+        <w:t>org_id</w:t>
+      </w:r>
+      <w:proofErr w:type="spellEnd"/>
+      <w:r>
+        <w:t xml:space="preserve">, </w:t>
+      </w:r>
+      <w:proofErr w:type="spellStart"/>
+      <w:r>
+        <w:t>user_id</w:t>
+      </w:r>
+      <w:proofErr w:type="spellEnd"/>
+      <w:r>
+        <w:t xml:space="preserve">, </w:t>
+      </w:r>
+      <w:proofErr w:type="spellStart"/>
+      <w:r>
+        <w:t>event_type</w:t>
+      </w:r>
+      <w:proofErr w:type="spellEnd"/>
+      <w:r>
+        <w:t xml:space="preserve"> </w:t>
+      </w:r>
+      <w:proofErr w:type="spellStart"/>
+      <w:r>
+        <w:t>permission_denied</w:t>
+      </w:r>
+      <w:proofErr w:type="spellEnd"/>
+      <w:r>
+        <w:t xml:space="preserve">, permission, role, reason, </w:t>
+      </w:r>
+      <w:proofErr w:type="spellStart"/>
+      <w:r>
+        <w:t>ip_address</w:t>
+      </w:r>
+      <w:proofErr w:type="spellEnd"/>
+      <w:r>
+        <w:t xml:space="preserve">, </w:t>
+      </w:r>
+      <w:proofErr w:type="spellStart"/>
+      <w:r>
+        <w:t>user_agent</w:t>
+      </w:r>
+      <w:proofErr w:type="spellEnd"/>
+      <w:r>
+        <w:t xml:space="preserve">, metadata JSON, </w:t>
+      </w:r>
+      <w:proofErr w:type="spellStart"/>
+      <w:r>
+        <w:t>created_at</w:t>
+      </w:r>
+      <w:proofErr w:type="spellEnd"/>
+      <w:r>
+        <w:t>.</w:t>
+      </w:r>
+    </w:p>
+    <w:p>
+      <w:r>
+        <w:t xml:space="preserve">Reason codes: </w:t>
+      </w:r>
+      <w:proofErr w:type="spellStart"/>
+      <w:r>
+        <w:t>missing_context</w:t>
+      </w:r>
+      <w:proofErr w:type="spellEnd"/>
+      <w:r>
+        <w:t xml:space="preserve">, </w:t>
+      </w:r>
+      <w:proofErr w:type="spellStart"/>
+      <w:r>
+        <w:t>cross_tenant</w:t>
+      </w:r>
+      <w:proofErr w:type="spellEnd"/>
+      <w:r>
+        <w:t xml:space="preserve">, </w:t>
+      </w:r>
+      <w:proofErr w:type="spellStart"/>
+      <w:r>
+        <w:t>missing_org</w:t>
+      </w:r>
+      <w:proofErr w:type="spellEnd"/>
+      <w:r>
+        <w:t xml:space="preserve">, </w:t>
+      </w:r>
+      <w:proofErr w:type="spellStart"/>
+      <w:r>
+        <w:t>inactive_org</w:t>
+      </w:r>
+      <w:proofErr w:type="spellEnd"/>
+      <w:r>
+        <w:t xml:space="preserve">, </w:t>
+      </w:r>
+      <w:proofErr w:type="spellStart"/>
+      <w:r>
+        <w:t>missing_role</w:t>
+      </w:r>
+      <w:proofErr w:type="spellEnd"/>
+      <w:r>
+        <w:t xml:space="preserve">, </w:t>
+      </w:r>
+      <w:proofErr w:type="spellStart"/>
+      <w:r>
+        <w:t>partner_accounting_blocked</w:t>
+      </w:r>
+      <w:proofErr w:type="spellEnd"/>
+      <w:r>
+        <w:t xml:space="preserve">, </w:t>
+      </w:r>
+      <w:proofErr w:type="spellStart"/>
+      <w:r>
+        <w:t>permission_denied</w:t>
+      </w:r>
+      <w:proofErr w:type="spellEnd"/>
+      <w:r>
+        <w:t>.</w:t>
       </w:r>
     </w:p>
     <w:p>
@@ -1387,8 +1951,108 @@
       </w:r>
     </w:p>
     <w:p>
-      <w:r>
-        <w:t>OraBooks_Team::update_role() and remove_user() call OraBooks_Auth::revoke_user_tokens(). OBN_Access_Control::log_role_change() records SL-003 audit trail. User must log in again to receive JWT with updated role.</w:t>
+      <w:proofErr w:type="spellStart"/>
+      <w:r>
+        <w:t>OraBooks_</w:t>
+      </w:r>
+      <w:proofErr w:type="gramStart"/>
+      <w:r>
+        <w:t>Team</w:t>
+      </w:r>
+      <w:proofErr w:type="spellEnd"/>
+      <w:r>
+        <w:t>::</w:t>
+      </w:r>
+      <w:proofErr w:type="spellStart"/>
+      <w:proofErr w:type="gramEnd"/>
+      <w:r>
+        <w:t>update_</w:t>
+      </w:r>
+      <w:proofErr w:type="gramStart"/>
+      <w:r>
+        <w:t>role</w:t>
+      </w:r>
+      <w:proofErr w:type="spellEnd"/>
+      <w:r>
+        <w:t>(</w:t>
+      </w:r>
+      <w:proofErr w:type="gramEnd"/>
+      <w:r>
+        <w:t xml:space="preserve">) and </w:t>
+      </w:r>
+      <w:proofErr w:type="spellStart"/>
+      <w:r>
+        <w:t>remove_</w:t>
+      </w:r>
+      <w:proofErr w:type="gramStart"/>
+      <w:r>
+        <w:t>user</w:t>
+      </w:r>
+      <w:proofErr w:type="spellEnd"/>
+      <w:r>
+        <w:t>(</w:t>
+      </w:r>
+      <w:proofErr w:type="gramEnd"/>
+      <w:r>
+        <w:t xml:space="preserve">) call </w:t>
+      </w:r>
+      <w:proofErr w:type="spellStart"/>
+      <w:r>
+        <w:t>OraBooks_</w:t>
+      </w:r>
+      <w:proofErr w:type="gramStart"/>
+      <w:r>
+        <w:t>Auth</w:t>
+      </w:r>
+      <w:proofErr w:type="spellEnd"/>
+      <w:r>
+        <w:t>::</w:t>
+      </w:r>
+      <w:proofErr w:type="spellStart"/>
+      <w:proofErr w:type="gramEnd"/>
+      <w:r>
+        <w:t>revoke_user_</w:t>
+      </w:r>
+      <w:proofErr w:type="gramStart"/>
+      <w:r>
+        <w:t>tokens</w:t>
+      </w:r>
+      <w:proofErr w:type="spellEnd"/>
+      <w:r>
+        <w:t>(</w:t>
+      </w:r>
+      <w:proofErr w:type="gramEnd"/>
+      <w:r>
+        <w:t xml:space="preserve">). </w:t>
+      </w:r>
+      <w:proofErr w:type="spellStart"/>
+      <w:r>
+        <w:t>OBN_Access_</w:t>
+      </w:r>
+      <w:proofErr w:type="gramStart"/>
+      <w:r>
+        <w:t>Control</w:t>
+      </w:r>
+      <w:proofErr w:type="spellEnd"/>
+      <w:r>
+        <w:t>::</w:t>
+      </w:r>
+      <w:proofErr w:type="spellStart"/>
+      <w:proofErr w:type="gramEnd"/>
+      <w:r>
+        <w:t>log_role_</w:t>
+      </w:r>
+      <w:proofErr w:type="gramStart"/>
+      <w:r>
+        <w:t>change</w:t>
+      </w:r>
+      <w:proofErr w:type="spellEnd"/>
+      <w:r>
+        <w:t>(</w:t>
+      </w:r>
+      <w:proofErr w:type="gramEnd"/>
+      <w:r>
+        <w:t>) records SL-003 audit trail. User must log in again to receive JWT with updated role.</w:t>
       </w:r>
     </w:p>
     <w:p>
@@ -1401,16 +2065,79 @@
     </w:p>
     <w:p>
       <w:r>
-        <w:t>Partner orgs (organization_type = partner) cannot access accounting permissions even for owner role. OBN_Access_Control blocks view_reports, submit_transaction, approve_journal, COA, invoices, expenses, inventory, exports, and related permissions.</w:t>
-      </w:r>
-    </w:p>
-    <w:p>
-      <w:r>
-        <w:t xml:space="preserve">partner_commission_access: default Owner and Admin. Staff/Viewer allowed when organizations.partner_commission_for_staff_viewer = 1 or global option </w:t>
-      </w:r>
+        <w:t>Partner orgs (</w:t>
+      </w:r>
+      <w:proofErr w:type="spellStart"/>
+      <w:r>
+        <w:t>organization_type</w:t>
+      </w:r>
+      <w:proofErr w:type="spellEnd"/>
+      <w:r>
+        <w:t xml:space="preserve"> = partner) cannot access accounting permissions even for owner role. </w:t>
+      </w:r>
+      <w:proofErr w:type="spellStart"/>
+      <w:r>
+        <w:t>OBN_Access_Control</w:t>
+      </w:r>
+      <w:proofErr w:type="spellEnd"/>
+      <w:r>
+        <w:t xml:space="preserve"> blocks </w:t>
+      </w:r>
+      <w:proofErr w:type="spellStart"/>
+      <w:r>
+        <w:t>view_reports</w:t>
+      </w:r>
+      <w:proofErr w:type="spellEnd"/>
+      <w:r>
+        <w:t xml:space="preserve">, </w:t>
+      </w:r>
+      <w:proofErr w:type="spellStart"/>
+      <w:r>
+        <w:t>submit_transaction</w:t>
+      </w:r>
+      <w:proofErr w:type="spellEnd"/>
+      <w:r>
+        <w:t xml:space="preserve">, </w:t>
+      </w:r>
+      <w:proofErr w:type="spellStart"/>
+      <w:r>
+        <w:t>approve_journal</w:t>
+      </w:r>
+      <w:proofErr w:type="spellEnd"/>
+      <w:r>
+        <w:t>, COA, invoices, expenses, inventory, exports, and related permissions.</w:t>
+      </w:r>
+    </w:p>
+    <w:p>
+      <w:proofErr w:type="spellStart"/>
+      <w:r>
+        <w:t>partner_commission_access</w:t>
+      </w:r>
+      <w:proofErr w:type="spellEnd"/>
+      <w:r>
+        <w:t xml:space="preserve">: default Owner and Admin. Staff/Viewer allowed when </w:t>
+      </w:r>
+      <w:proofErr w:type="spellStart"/>
+      <w:proofErr w:type="gramStart"/>
+      <w:r>
+        <w:t>organizations.partner</w:t>
+      </w:r>
+      <w:proofErr w:type="gramEnd"/>
+      <w:r>
+        <w:t>_commission_for_staff_viewer</w:t>
+      </w:r>
+      <w:proofErr w:type="spellEnd"/>
+      <w:r>
+        <w:t xml:space="preserve"> = 1 or global option </w:t>
+      </w:r>
+      <w:proofErr w:type="spellStart"/>
       <w:r>
         <w:lastRenderedPageBreak/>
-        <w:t>orabooks_partner_commission_for_staff_viewer is enabled (ABAC). Partner nav shows Commissions/Onboarding only.</w:t>
+        <w:t>orabooks_partner_commission_for_staff_viewer</w:t>
+      </w:r>
+      <w:proofErr w:type="spellEnd"/>
+      <w:r>
+        <w:t xml:space="preserve"> is enabled (ABAC). Partner nav shows Commissions/Onboarding only.</w:t>
       </w:r>
     </w:p>
     <w:p>
@@ -1423,12 +2150,60 @@
     </w:p>
     <w:p>
       <w:r>
-        <w:t>Role badge: ClientShell sidebar shows Role: Owner/Staff/etc from frontendContext API.</w:t>
-      </w:r>
-    </w:p>
-    <w:p>
-      <w:r>
-        <w:t>Sidebar filtering: customerNav and partnerNav items tagged with permission; filterNavByPermissions hides unauthorized menu items.</w:t>
+        <w:t xml:space="preserve">Role badge: </w:t>
+      </w:r>
+      <w:proofErr w:type="spellStart"/>
+      <w:r>
+        <w:t>ClientShell</w:t>
+      </w:r>
+      <w:proofErr w:type="spellEnd"/>
+      <w:r>
+        <w:t xml:space="preserve"> sidebar shows Role: Owner/Staff/</w:t>
+      </w:r>
+      <w:proofErr w:type="spellStart"/>
+      <w:r>
+        <w:t>etc</w:t>
+      </w:r>
+      <w:proofErr w:type="spellEnd"/>
+      <w:r>
+        <w:t xml:space="preserve"> from </w:t>
+      </w:r>
+      <w:proofErr w:type="spellStart"/>
+      <w:r>
+        <w:t>frontendContext</w:t>
+      </w:r>
+      <w:proofErr w:type="spellEnd"/>
+      <w:r>
+        <w:t xml:space="preserve"> API.</w:t>
+      </w:r>
+    </w:p>
+    <w:p>
+      <w:r>
+        <w:t xml:space="preserve">Sidebar filtering: </w:t>
+      </w:r>
+      <w:proofErr w:type="spellStart"/>
+      <w:r>
+        <w:t>customerNav</w:t>
+      </w:r>
+      <w:proofErr w:type="spellEnd"/>
+      <w:r>
+        <w:t xml:space="preserve"> and </w:t>
+      </w:r>
+      <w:proofErr w:type="spellStart"/>
+      <w:r>
+        <w:t>partnerNav</w:t>
+      </w:r>
+      <w:proofErr w:type="spellEnd"/>
+      <w:r>
+        <w:t xml:space="preserve"> items tagged with permission; </w:t>
+      </w:r>
+      <w:proofErr w:type="spellStart"/>
+      <w:r>
+        <w:t>filterNavByPermissions</w:t>
+      </w:r>
+      <w:proofErr w:type="spellEnd"/>
+      <w:r>
+        <w:t xml:space="preserve"> hides unauthorized menu items.</w:t>
       </w:r>
     </w:p>
     <w:p>
@@ -1456,7 +2231,39 @@
     </w:p>
     <w:p>
       <w:r>
-        <w:t>Solution: Pending invite detected by email. Tier selection skipped. Login/2FA/OIDC auto-accepts invite via accept_pending_invite_for_user(). user_org row with invited role; users.org_id and JWT set to employer org; redirect to /team/ on employer subdomain. Tier selection API returns 403 while invite pending. Register page shows team invitation banner.</w:t>
+        <w:t xml:space="preserve">Solution: Pending invite detected by email. Tier selection skipped. Login/2FA/OIDC auto-accepts invite via </w:t>
+      </w:r>
+      <w:proofErr w:type="spellStart"/>
+      <w:r>
+        <w:t>accept_pending_invite_for_</w:t>
+      </w:r>
+      <w:proofErr w:type="gramStart"/>
+      <w:r>
+        <w:t>user</w:t>
+      </w:r>
+      <w:proofErr w:type="spellEnd"/>
+      <w:r>
+        <w:t>(</w:t>
+      </w:r>
+      <w:proofErr w:type="gramEnd"/>
+      <w:r>
+        <w:t xml:space="preserve">). </w:t>
+      </w:r>
+      <w:proofErr w:type="spellStart"/>
+      <w:r>
+        <w:t>user_org</w:t>
+      </w:r>
+      <w:proofErr w:type="spellEnd"/>
+      <w:r>
+        <w:t xml:space="preserve"> row with invited role; </w:t>
+      </w:r>
+      <w:proofErr w:type="spellStart"/>
+      <w:r>
+        <w:t>users.org_id</w:t>
+      </w:r>
+      <w:proofErr w:type="spellEnd"/>
+      <w:r>
+        <w:t xml:space="preserve"> and JWT set to employer org; redirect to /team/ on employer subdomain. Tier selection API returns 403 while invite pending. Register page shows team invitation banner.</w:t>
       </w:r>
     </w:p>
     <w:p>
@@ -1474,17 +2281,209 @@
     </w:p>
     <w:p>
       <w:r>
-        <w:t>Backend: class-orabooks-rbac.php, class-obn-access-control.php, class-orabooks-team.php, class-orabooks-auth.php, class-orabooks-ajax.php, class-orabooks-two-factor.php, helpers.php, class-orabooks-database.php (permission_audit_log schema).</w:t>
-      </w:r>
-    </w:p>
-    <w:p>
-      <w:r>
-        <w:t>Frontend: orabooks-ui/src/pages/frontend/components/ClientShell.tsx, pages/TeamPage.tsx, RegisterPage.tsx, TierSelectionPage.tsx, lib/auth-routing.ts.</w:t>
-      </w:r>
-    </w:p>
-    <w:p>
-      <w:r>
-        <w:t>Tests: tests/OraBooks_RBAC_Test.php (9 tests, 28 assertions).</w:t>
+        <w:t>Backend: class-</w:t>
+      </w:r>
+      <w:proofErr w:type="spellStart"/>
+      <w:r>
+        <w:t>orabooks</w:t>
+      </w:r>
+      <w:proofErr w:type="spellEnd"/>
+      <w:r>
+        <w:t>-</w:t>
+      </w:r>
+      <w:proofErr w:type="spellStart"/>
+      <w:r>
+        <w:t>rbac.php</w:t>
+      </w:r>
+      <w:proofErr w:type="spellEnd"/>
+      <w:r>
+        <w:t>, class-</w:t>
+      </w:r>
+      <w:proofErr w:type="spellStart"/>
+      <w:r>
+        <w:t>obn</w:t>
+      </w:r>
+      <w:proofErr w:type="spellEnd"/>
+      <w:r>
+        <w:t>-access-</w:t>
+      </w:r>
+      <w:proofErr w:type="spellStart"/>
+      <w:r>
+        <w:t>control.php</w:t>
+      </w:r>
+      <w:proofErr w:type="spellEnd"/>
+      <w:r>
+        <w:t>, class-</w:t>
+      </w:r>
+      <w:proofErr w:type="spellStart"/>
+      <w:r>
+        <w:t>orabooks</w:t>
+      </w:r>
+      <w:proofErr w:type="spellEnd"/>
+      <w:r>
+        <w:t>-</w:t>
+      </w:r>
+      <w:proofErr w:type="spellStart"/>
+      <w:r>
+        <w:t>team.php</w:t>
+      </w:r>
+      <w:proofErr w:type="spellEnd"/>
+      <w:r>
+        <w:t>, class-</w:t>
+      </w:r>
+      <w:proofErr w:type="spellStart"/>
+      <w:r>
+        <w:t>orabooks</w:t>
+      </w:r>
+      <w:proofErr w:type="spellEnd"/>
+      <w:r>
+        <w:t>-</w:t>
+      </w:r>
+      <w:proofErr w:type="spellStart"/>
+      <w:r>
+        <w:t>auth.php</w:t>
+      </w:r>
+      <w:proofErr w:type="spellEnd"/>
+      <w:r>
+        <w:t>, class-</w:t>
+      </w:r>
+      <w:proofErr w:type="spellStart"/>
+      <w:r>
+        <w:t>orabooks</w:t>
+      </w:r>
+      <w:proofErr w:type="spellEnd"/>
+      <w:r>
+        <w:t>-</w:t>
+      </w:r>
+      <w:proofErr w:type="spellStart"/>
+      <w:r>
+        <w:t>ajax.php</w:t>
+      </w:r>
+      <w:proofErr w:type="spellEnd"/>
+      <w:r>
+        <w:t>, class-</w:t>
+      </w:r>
+      <w:proofErr w:type="spellStart"/>
+      <w:r>
+        <w:t>orabooks</w:t>
+      </w:r>
+      <w:proofErr w:type="spellEnd"/>
+      <w:r>
+        <w:t>-two-</w:t>
+      </w:r>
+      <w:proofErr w:type="spellStart"/>
+      <w:r>
+        <w:t>factor.php</w:t>
+      </w:r>
+      <w:proofErr w:type="spellEnd"/>
+      <w:r>
+        <w:t xml:space="preserve">, </w:t>
+      </w:r>
+      <w:proofErr w:type="spellStart"/>
+      <w:r>
+        <w:t>helpers.php</w:t>
+      </w:r>
+      <w:proofErr w:type="spellEnd"/>
+      <w:r>
+        <w:t>, class-</w:t>
+      </w:r>
+      <w:proofErr w:type="spellStart"/>
+      <w:r>
+        <w:t>orabooks</w:t>
+      </w:r>
+      <w:proofErr w:type="spellEnd"/>
+      <w:r>
+        <w:t>-</w:t>
+      </w:r>
+      <w:proofErr w:type="spellStart"/>
+      <w:r>
+        <w:t>database.php</w:t>
+      </w:r>
+      <w:proofErr w:type="spellEnd"/>
+      <w:r>
+        <w:t xml:space="preserve"> (</w:t>
+      </w:r>
+      <w:proofErr w:type="spellStart"/>
+      <w:r>
+        <w:t>permission_audit_log</w:t>
+      </w:r>
+      <w:proofErr w:type="spellEnd"/>
+      <w:r>
+        <w:t xml:space="preserve"> schema).</w:t>
+      </w:r>
+    </w:p>
+    <w:p>
+      <w:r>
+        <w:t xml:space="preserve">Frontend: </w:t>
+      </w:r>
+      <w:proofErr w:type="spellStart"/>
+      <w:r>
+        <w:t>orabooks-ui</w:t>
+      </w:r>
+      <w:proofErr w:type="spellEnd"/>
+      <w:r>
+        <w:t>/</w:t>
+      </w:r>
+      <w:proofErr w:type="spellStart"/>
+      <w:r>
+        <w:t>src</w:t>
+      </w:r>
+      <w:proofErr w:type="spellEnd"/>
+      <w:r>
+        <w:t>/pages/frontend/components/</w:t>
+      </w:r>
+      <w:proofErr w:type="spellStart"/>
+      <w:r>
+        <w:t>ClientShell.tsx</w:t>
+      </w:r>
+      <w:proofErr w:type="spellEnd"/>
+      <w:r>
+        <w:t>, pages/</w:t>
+      </w:r>
+      <w:proofErr w:type="spellStart"/>
+      <w:r>
+        <w:t>TeamPage.tsx</w:t>
+      </w:r>
+      <w:proofErr w:type="spellEnd"/>
+      <w:r>
+        <w:t xml:space="preserve">, </w:t>
+      </w:r>
+      <w:proofErr w:type="spellStart"/>
+      <w:r>
+        <w:t>RegisterPage.tsx</w:t>
+      </w:r>
+      <w:proofErr w:type="spellEnd"/>
+      <w:r>
+        <w:t xml:space="preserve">, </w:t>
+      </w:r>
+      <w:proofErr w:type="spellStart"/>
+      <w:r>
+        <w:t>TierSelectionPage.tsx</w:t>
+      </w:r>
+      <w:proofErr w:type="spellEnd"/>
+      <w:r>
+        <w:t>, lib/auth-</w:t>
+      </w:r>
+      <w:proofErr w:type="spellStart"/>
+      <w:r>
+        <w:t>routing.ts</w:t>
+      </w:r>
+      <w:proofErr w:type="spellEnd"/>
+      <w:r>
+        <w:t>.</w:t>
+      </w:r>
+    </w:p>
+    <w:p>
+      <w:r>
+        <w:t>Tests: tests/</w:t>
+      </w:r>
+      <w:proofErr w:type="spellStart"/>
+      <w:r>
+        <w:t>OraBooks_RBAC_Test.php</w:t>
+      </w:r>
+      <w:proofErr w:type="spellEnd"/>
+      <w:r>
+        <w:t xml:space="preserve"> (9 tests, 28 assertions).</w:t>
       </w:r>
     </w:p>
     <w:p>
@@ -1493,17 +2492,54 @@
       </w:pPr>
       <w:r>
         <w:lastRenderedPageBreak/>
-        <w:t>12. PHPUnit Verification</w:t>
-      </w:r>
-    </w:p>
-    <w:p>
-      <w:r>
-        <w:t>Command: cd "OraBooks Lean MVP/tests" &amp;&amp; vendor/bin/phpunit --configuration phpunit.xml OraBooks_RBAC_Test.php</w:t>
-      </w:r>
-    </w:p>
-    <w:p>
-      <w:r>
-        <w:t>Covers: five roles, deny-by-default, permission aliases, partner commission ABAC, partner accounting block, permission_audit_log row, refresh token revoke on role change, effective permissions, invite AJAX JSON, invite-first role assignment.</w:t>
+        <w:t xml:space="preserve">12. </w:t>
+      </w:r>
+      <w:proofErr w:type="spellStart"/>
+      <w:r>
+        <w:t>PHPUnit</w:t>
+      </w:r>
+      <w:proofErr w:type="spellEnd"/>
+      <w:r>
+        <w:t xml:space="preserve"> Verification</w:t>
+      </w:r>
+    </w:p>
+    <w:p>
+      <w:r>
+        <w:t>Command: cd "</w:t>
+      </w:r>
+      <w:proofErr w:type="spellStart"/>
+      <w:r>
+        <w:t>OraBooks</w:t>
+      </w:r>
+      <w:proofErr w:type="spellEnd"/>
+      <w:r>
+        <w:t xml:space="preserve"> Lean MVP/tests" &amp;&amp; vendor/bin/</w:t>
+      </w:r>
+      <w:proofErr w:type="spellStart"/>
+      <w:r>
+        <w:t>phpunit</w:t>
+      </w:r>
+      <w:proofErr w:type="spellEnd"/>
+      <w:r>
+        <w:t xml:space="preserve"> --configuration phpunit.xml </w:t>
+      </w:r>
+      <w:proofErr w:type="spellStart"/>
+      <w:r>
+        <w:t>OraBooks_RBAC_Test.php</w:t>
+      </w:r>
+      <w:proofErr w:type="spellEnd"/>
+    </w:p>
+    <w:p>
+      <w:r>
+        <w:t xml:space="preserve">Covers: five roles, deny-by-default, permission aliases, partner commission ABAC, partner accounting block, </w:t>
+      </w:r>
+      <w:proofErr w:type="spellStart"/>
+      <w:r>
+        <w:t>permission_audit_log</w:t>
+      </w:r>
+      <w:proofErr w:type="spellEnd"/>
+      <w:r>
+        <w:t xml:space="preserve"> row, refresh token revoke on role change, effective permissions, invite AJAX JSON, invite-first role assignment.</w:t>
       </w:r>
     </w:p>
     <w:p>
@@ -1516,7 +2552,15 @@
     </w:p>
     <w:p>
       <w:r>
-        <w:t>A. Owner login: badge Role Owner; full sidebar; Team invite works; Roles matrix visible.</w:t>
+        <w:t xml:space="preserve">A. Owner login: badge Role Owner; full sidebar; Team invite works; </w:t>
+      </w:r>
+      <w:proofErr w:type="gramStart"/>
+      <w:r>
+        <w:t>Roles</w:t>
+      </w:r>
+      <w:proofErr w:type="gramEnd"/>
+      <w:r>
+        <w:t xml:space="preserve"> matrix visible.</w:t>
       </w:r>
     </w:p>
     <w:p>
@@ -1541,7 +2585,15 @@
     </w:p>
     <w:p>
       <w:r>
-        <w:t>F. Permission denied: staff hits owner-only API; 403 and permission_denied audit row created.</w:t>
+        <w:t xml:space="preserve">F. Permission denied: staff hits owner-only API; 403 and </w:t>
+      </w:r>
+      <w:proofErr w:type="spellStart"/>
+      <w:r>
+        <w:t>permission_denied</w:t>
+      </w:r>
+      <w:proofErr w:type="spellEnd"/>
+      <w:r>
+        <w:t xml:space="preserve"> audit row created.</w:t>
       </w:r>
     </w:p>
     <w:p>
@@ -1554,22 +2606,62 @@
     </w:p>
     <w:p>
       <w:r>
-        <w:t>[Done] user_org role ENUM NOT NULL with five roles.</w:t>
-      </w:r>
-    </w:p>
-    <w:p>
-      <w:r>
-        <w:t>[Done] JWT role and org_id claims at login/refresh.</w:t>
-      </w:r>
-    </w:p>
-    <w:p>
-      <w:r>
-        <w:t>[Done] requirePermission middleware via OBN_Access_Control; deny-by-default.</w:t>
-      </w:r>
-    </w:p>
-    <w:p>
-      <w:r>
-        <w:t>[Done] API endpoints guarded with require_permission.</w:t>
+        <w:t xml:space="preserve">[Done] </w:t>
+      </w:r>
+      <w:proofErr w:type="spellStart"/>
+      <w:r>
+        <w:t>user_org</w:t>
+      </w:r>
+      <w:proofErr w:type="spellEnd"/>
+      <w:r>
+        <w:t xml:space="preserve"> role ENUM NOT NULL with five roles.</w:t>
+      </w:r>
+    </w:p>
+    <w:p>
+      <w:r>
+        <w:t xml:space="preserve">[Done] JWT role and </w:t>
+      </w:r>
+      <w:proofErr w:type="spellStart"/>
+      <w:r>
+        <w:t>org_id</w:t>
+      </w:r>
+      <w:proofErr w:type="spellEnd"/>
+      <w:r>
+        <w:t xml:space="preserve"> claims at login/refresh.</w:t>
+      </w:r>
+    </w:p>
+    <w:p>
+      <w:r>
+        <w:t xml:space="preserve">[Done] </w:t>
+      </w:r>
+      <w:proofErr w:type="spellStart"/>
+      <w:r>
+        <w:t>requirePermission</w:t>
+      </w:r>
+      <w:proofErr w:type="spellEnd"/>
+      <w:r>
+        <w:t xml:space="preserve"> middleware via </w:t>
+      </w:r>
+      <w:proofErr w:type="spellStart"/>
+      <w:r>
+        <w:t>OBN_Access_Control</w:t>
+      </w:r>
+      <w:proofErr w:type="spellEnd"/>
+      <w:r>
+        <w:t>; deny-by-default.</w:t>
+      </w:r>
+    </w:p>
+    <w:p>
+      <w:r>
+        <w:t xml:space="preserve">[Done] API endpoints guarded with </w:t>
+      </w:r>
+      <w:proofErr w:type="spellStart"/>
+      <w:r>
+        <w:t>require_permission</w:t>
+      </w:r>
+      <w:proofErr w:type="spellEnd"/>
+      <w:r>
+        <w:t>.</w:t>
       </w:r>
     </w:p>
     <w:p>
@@ -1579,7 +2671,15 @@
     </w:p>
     <w:p>
       <w:r>
-        <w:t>[Done] permission_denied audit in dedicated table.</w:t>
+        <w:t xml:space="preserve">[Done] </w:t>
+      </w:r>
+      <w:proofErr w:type="spellStart"/>
+      <w:r>
+        <w:t>permission_denied</w:t>
+      </w:r>
+      <w:proofErr w:type="spellEnd"/>
+      <w:r>
+        <w:t xml:space="preserve"> audit in dedicated table.</w:t>
       </w:r>
     </w:p>
     <w:p>
@@ -1589,7 +2689,15 @@
     </w:p>
     <w:p>
       <w:r>
-        <w:t>[Done] partner_commission_for_staff_viewer org config ABAC.</w:t>
+        <w:t xml:space="preserve">[Done] </w:t>
+      </w:r>
+      <w:proofErr w:type="spellStart"/>
+      <w:r>
+        <w:t>partner_commission_for_staff_viewer</w:t>
+      </w:r>
+      <w:proofErr w:type="spellEnd"/>
+      <w:r>
+        <w:t xml:space="preserve"> org config ABAC.</w:t>
       </w:r>
     </w:p>
     <w:p>
@@ -1599,13 +2707,29 @@
     </w:p>
     <w:p>
       <w:r>
-        <w:t>[Done] PHPUnit role/permission tests.</w:t>
+        <w:t xml:space="preserve">[Done] </w:t>
+      </w:r>
+      <w:proofErr w:type="spellStart"/>
+      <w:r>
+        <w:t>PHPUnit</w:t>
+      </w:r>
+      <w:proofErr w:type="spellEnd"/>
+      <w:r>
+        <w:t xml:space="preserve"> role/permission tests.</w:t>
       </w:r>
     </w:p>
     <w:p>
       <w:r>
         <w:lastRenderedPageBreak/>
-        <w:t>[Partial] Roles matrix UI is read-only (no custom role editing).</w:t>
+        <w:t xml:space="preserve">[Partial] </w:t>
+      </w:r>
+      <w:proofErr w:type="gramStart"/>
+      <w:r>
+        <w:t>Roles</w:t>
+      </w:r>
+      <w:proofErr w:type="gramEnd"/>
+      <w:r>
+        <w:t xml:space="preserve"> matrix UI is read-only (no custom role editing).</w:t>
       </w:r>
     </w:p>
     <w:p>

</xml_diff>